<commit_message>
report: assign visual detector to group collaboration
</commit_message>
<xml_diff>
--- a/report/experiment3_lab_report_group17.docx
+++ b/report/experiment3_lab_report_group17.docx
@@ -9333,9 +9333,6 @@
             <w:shd w:fill="F7FAFC"/>
           </w:tcPr>
           <w:p>
-            <w:pPr>
-              <w:jc w:val="left"/>
-            </w:pPr>
             <w:r>
               <w:rPr>
                 <w:rFonts w:ascii="Times New Roman" w:hAnsi="Times New Roman" w:eastAsia="Times New Roman"/>
@@ -9372,7 +9369,7 @@
                 <w:color w:val="232323"/>
                 <w:sz w:val="17"/>
               </w:rPr>
-              <w:t>Gazebo 场景、六格与分类垫调整；YOLOv8n 三类数据采集、训练和外接摄像头验证；手动示教；抓取、附着、垂直释放和证据复核</w:t>
+              <w:t>Gazebo 场景、六格网格和分类垫调整；手动示教；抓取、附着、垂直释放和证据复核；使用共享检测结果进行执行侧接口测试</w:t>
             </w:r>
           </w:p>
         </w:tc>
@@ -9401,7 +9398,7 @@
                 <w:color w:val="232323"/>
                 <w:sz w:val="17"/>
               </w:rPr>
-              <w:t>sorting_desktop.world；manual_animation.json；models/best_yolov8n_eraser_lock_stapler.pt；检测截图；GUI 与 CSV 验证</w:t>
+              <w:t>sorting_desktop.world；manual_animation.json；GUI 和 CSV 复核</w:t>
             </w:r>
           </w:p>
         </w:tc>
@@ -9699,6 +9696,95 @@
                 <w:sz w:val="17"/>
               </w:rPr>
               <w:t>sorting_gazebo.launch.py、执行节点、真机验收表</w:t>
+            </w:r>
+          </w:p>
+        </w:tc>
+      </w:tr>
+      <w:tr>
+        <w:trPr>
+          <w:cantSplit/>
+        </w:trPr>
+        <w:tc>
+          <w:tcPr>
+            <w:tcW w:type="dxa" w:w="3156"/>
+            <w:tcMar>
+              <w:top w:w="65" w:type="dxa"/>
+              <w:start w:w="80" w:type="dxa"/>
+              <w:bottom w:w="65" w:type="dxa"/>
+              <w:end w:w="80" w:type="dxa"/>
+            </w:tcMar>
+            <w:tcBorders>
+              <w:top w:val="single" w:sz="4" w:color="B8C2CC"/>
+              <w:left w:val="single" w:sz="4" w:color="B8C2CC"/>
+              <w:bottom w:val="single" w:sz="4" w:color="B8C2CC"/>
+              <w:right w:val="single" w:sz="4" w:color="B8C2CC"/>
+            </w:tcBorders>
+          </w:tcPr>
+          <w:p>
+            <w:r>
+              <w:rPr>
+                <w:rFonts w:ascii="Times New Roman" w:hAnsi="Times New Roman" w:eastAsia="Times New Roman"/>
+                <w:b w:val="0"/>
+                <w:color w:val="232323"/>
+                <w:sz w:val="17"/>
+              </w:rPr>
+              <w:t>小组协作</w:t>
+            </w:r>
+          </w:p>
+        </w:tc>
+        <w:tc>
+          <w:tcPr>
+            <w:tcW w:type="dxa" w:w="3156"/>
+            <w:tcMar>
+              <w:top w:w="65" w:type="dxa"/>
+              <w:start w:w="80" w:type="dxa"/>
+              <w:bottom w:w="65" w:type="dxa"/>
+              <w:end w:w="80" w:type="dxa"/>
+            </w:tcMar>
+            <w:tcBorders>
+              <w:top w:val="single" w:sz="4" w:color="B8C2CC"/>
+              <w:left w:val="single" w:sz="4" w:color="B8C2CC"/>
+              <w:bottom w:val="single" w:sz="4" w:color="B8C2CC"/>
+              <w:right w:val="single" w:sz="4" w:color="B8C2CC"/>
+            </w:tcBorders>
+          </w:tcPr>
+          <w:p>
+            <w:r>
+              <w:rPr>
+                <w:rFonts w:ascii="Times New Roman" w:hAnsi="Times New Roman" w:eastAsia="Times New Roman"/>
+                <w:b w:val="0"/>
+                <w:color w:val="232323"/>
+                <w:sz w:val="17"/>
+              </w:rPr>
+              <w:t>三类视觉检测数据采集、标注、YOLOv8n 训练、评估和外接摄像头验证</w:t>
+            </w:r>
+          </w:p>
+        </w:tc>
+        <w:tc>
+          <w:tcPr>
+            <w:tcW w:type="dxa" w:w="3156"/>
+            <w:tcMar>
+              <w:top w:w="65" w:type="dxa"/>
+              <w:start w:w="80" w:type="dxa"/>
+              <w:bottom w:w="65" w:type="dxa"/>
+              <w:end w:w="80" w:type="dxa"/>
+            </w:tcMar>
+            <w:tcBorders>
+              <w:top w:val="single" w:sz="4" w:color="B8C2CC"/>
+              <w:left w:val="single" w:sz="4" w:color="B8C2CC"/>
+              <w:bottom w:val="single" w:sz="4" w:color="B8C2CC"/>
+              <w:right w:val="single" w:sz="4" w:color="B8C2CC"/>
+            </w:tcBorders>
+          </w:tcPr>
+          <w:p>
+            <w:r>
+              <w:rPr>
+                <w:rFonts w:ascii="Times New Roman" w:hAnsi="Times New Roman" w:eastAsia="Times New Roman"/>
+                <w:b w:val="0"/>
+                <w:color w:val="232323"/>
+                <w:sz w:val="17"/>
+              </w:rPr>
+              <w:t>models/best_yolov8n_eraser_lock_stapler.pt；models/README.md；检测截图</w:t>
             </w:r>
           </w:p>
         </w:tc>

</xml_diff>

<commit_message>
report: place visual model in system pipeline
</commit_message>
<xml_diff>
--- a/report/experiment3_lab_report_group17.docx
+++ b/report/experiment3_lab_report_group17.docx
@@ -1587,13 +1587,7 @@
         <w:spacing w:line="276" w:lineRule="auto" w:after="100"/>
       </w:pPr>
       <w:r>
-        <w:rPr>
-          <w:rFonts w:ascii="Times New Roman" w:hAnsi="Times New Roman" w:eastAsia="Times New Roman"/>
-          <w:b w:val="0"/>
-          <w:color w:val="232323"/>
-          <w:sz w:val="20"/>
-        </w:rPr>
-        <w:t>系统由感知层、任务决策层和机械臂执行层组成。感知层产生图像与检测数组；决策层完成置信度筛选、网格定位、类别映射、队列排序和异常分支；执行层控制机械臂和夹爪完成接近、闭合、抬升、搬运、释放与结果反馈。验收层读取 GUI、阶段状态、事件日志、最终位姿和对象级 CSV，形成可追溯证据。</w:t>
+        <w:t>系统由感知层、任务决策层和机械臂执行层组成。感知层先采集图像，由视觉检测模型输出类别、检测框和置信度，再统一封装为 Detection2DArray；决策层完成置信度筛选、网格定位、类别映射、队列排序和异常分支；执行层控制机械臂和夹爪完成接近、闭合、抬升、搬运、释放与结果反馈。验收层读取 GUI、阶段状态、事件日志、最终位姿和对象级 CSV，形成可追溯证据。</w:t>
       </w:r>
     </w:p>
     <w:p>
@@ -1647,12 +1641,6 @@
         <w:pStyle w:val="CaptionCustom"/>
       </w:pPr>
       <w:r>
-        <w:rPr>
-          <w:rFonts w:ascii="Times New Roman" w:hAnsi="Times New Roman" w:eastAsia="Times New Roman"/>
-          <w:b w:val="0"/>
-          <w:color w:val="5A5A5A"/>
-          <w:sz w:val="18"/>
-        </w:rPr>
         <w:t>图 1  三层系统架构与对象级结果闭环</w:t>
       </w:r>
     </w:p>
@@ -1673,15 +1661,129 @@
     <w:p>
       <w:pPr>
         <w:pStyle w:val="Heading2"/>
+        <w:spacing w:line="276" w:lineRule="auto" w:after="100"/>
+      </w:pPr>
+      <w:r>
+        <w:t>2.2 视觉检测模型训练与部署</w:t>
+      </w:r>
+    </w:p>
+    <w:p>
+      <w:pPr>
+        <w:spacing w:line="276" w:lineRule="auto" w:after="100"/>
       </w:pPr>
       <w:r>
         <w:rPr>
           <w:rFonts w:ascii="Times New Roman" w:hAnsi="Times New Roman" w:eastAsia="Times New Roman"/>
-          <w:b/>
-          <w:color w:val="1F4E79"/>
-          <w:sz w:val="23"/>
+          <w:b w:val="0"/>
+          <w:color w:val="232323"/>
+          <w:sz w:val="20"/>
         </w:rPr>
-        <w:t>2.2 关键消息与接口</w:t>
+        <w:t>感知模块采用 YOLOv8n 训练三类目标检测模型，识别对象为橡皮、锁和订书机，输出类别、检测框和置信度。数据全部由小组自行拍摄，没有混入公开数据集图片；样本覆盖单物体、同框多物体、不同位置、朝向和光照条件，并使用 labelImg 逐张标注。</w:t>
+      </w:r>
+    </w:p>
+    <w:p>
+      <w:pPr>
+        <w:spacing w:line="276" w:lineRule="auto" w:after="100"/>
+      </w:pPr>
+      <w:r>
+        <w:rPr>
+          <w:rFonts w:ascii="Times New Roman" w:hAnsi="Times New Roman" w:eastAsia="Times New Roman"/>
+          <w:b w:val="0"/>
+          <w:color w:val="232323"/>
+          <w:sz w:val="20"/>
+        </w:rPr>
+        <w:t>训练配置为输入分辨率 640、训练 60 轮、批大小 16，设备为 RTX 4070 Laptop GPU。训练阶段使用马赛克拼接、色调扰动、随机缩放和随机擦除，验证集从原始图片中独立划分且不做增强。最终权重大小为 6.25 MB（约 6.3 MB），参数量约 300 万。根据训练记录，整体及三个类别的 mAP50 和 mAP50-95 均为 0.995，精确率和召回率均为 1.0。</w:t>
+      </w:r>
+    </w:p>
+    <w:p>
+      <w:pPr>
+        <w:spacing w:line="276" w:lineRule="auto" w:after="100"/>
+      </w:pPr>
+      <w:r>
+        <w:rPr>
+          <w:rFonts w:ascii="Times New Roman" w:hAnsi="Times New Roman" w:eastAsia="Times New Roman"/>
+          <w:b w:val="0"/>
+          <w:color w:val="232323"/>
+          <w:sz w:val="20"/>
+        </w:rPr>
+        <w:t>迭代过程针对锁与订书机混淆、订书机个别角度与橡皮混淆、加入新数据后早期样本特征被稀释，以及验证集与外接摄像头场景存在差异等问题，分别采用类别配比调整、同框对比样本补拍、分类损失强化、早期样本加权和实拍薄弱场景补拍。整体 mAP50-95 从 0.938 提升到 0.995。示例外接摄像头画面中，三类目标的置信度为 0.89–0.94，画面显示 31.2 FPS；1.1 ms 是单张模型推理时间，31.2 FPS 是包含摄像头读取和显示的端到端帧率。</w:t>
+      </w:r>
+    </w:p>
+    <w:p>
+      <w:pPr>
+        <w:spacing w:line="276" w:lineRule="auto" w:after="100"/>
+      </w:pPr>
+      <w:r>
+        <w:rPr>
+          <w:rFonts w:ascii="Times New Roman" w:hAnsi="Times New Roman" w:eastAsia="Times New Roman"/>
+          <w:b w:val="0"/>
+          <w:color w:val="232323"/>
+          <w:sz w:val="20"/>
+        </w:rPr>
+        <w:t>仿真阶段仍由监视节点根据 Gazebo 模型状态生成确定性的 Detection2DArray 消息，以保证任务和执行接口的重复性；训练权重单独归档在 models/ 中，用于后续外接摄像头和真机验证。</w:t>
+      </w:r>
+    </w:p>
+    <w:p>
+      <w:pPr>
+        <w:spacing w:line="276" w:lineRule="auto" w:after="100"/>
+        <w:jc w:val="center"/>
+      </w:pPr>
+      <w:r>
+        <w:rPr>
+          <w:rFonts w:ascii="Times New Roman" w:hAnsi="Times New Roman" w:eastAsia="Times New Roman"/>
+          <w:b w:val="0"/>
+          <w:color w:val="232323"/>
+          <w:sz w:val="20"/>
+        </w:rPr>
+        <w:drawing>
+          <wp:inline xmlns:a="http://schemas.openxmlformats.org/drawingml/2006/main" xmlns:pic="http://schemas.openxmlformats.org/drawingml/2006/picture">
+            <wp:extent cx="5257800" cy="3541083"/>
+            <wp:docPr id="10" name="Picture 10"/>
+            <wp:cNvGraphicFramePr>
+              <a:graphicFrameLocks noChangeAspect="1"/>
+            </wp:cNvGraphicFramePr>
+            <a:graphic>
+              <a:graphicData uri="http://schemas.openxmlformats.org/drawingml/2006/picture">
+                <pic:pic>
+                  <pic:nvPicPr>
+                    <pic:cNvPr id="0" name="b028d3f11213205b74b2a37d8148411b.jpg"/>
+                    <pic:cNvPicPr/>
+                  </pic:nvPicPr>
+                  <pic:blipFill>
+                    <a:blip r:embed="rId20"/>
+                    <a:stretch>
+                      <a:fillRect/>
+                    </a:stretch>
+                  </pic:blipFill>
+                  <pic:spPr>
+                    <a:xfrm>
+                      <a:off x="0" y="0"/>
+                      <a:ext cx="5257800" cy="3541083"/>
+                    </a:xfrm>
+                    <a:prstGeom prst="rect"/>
+                  </pic:spPr>
+                </pic:pic>
+              </a:graphicData>
+            </a:graphic>
+          </wp:inline>
+        </w:drawing>
+      </w:r>
+    </w:p>
+    <w:p>
+      <w:pPr>
+        <w:pStyle w:val="CaptionCustom"/>
+        <w:jc w:val="center"/>
+      </w:pPr>
+      <w:r>
+        <w:t>图 2  外接摄像头同时识别橡皮、锁和订书机的实测画面</w:t>
+      </w:r>
+    </w:p>
+    <w:p>
+      <w:pPr>
+        <w:pStyle w:val="Heading2"/>
+      </w:pPr>
+      <w:r>
+        <w:t>2.3 关键消息与接口</w:t>
       </w:r>
     </w:p>
     <w:tbl>
@@ -2509,13 +2611,7 @@
         <w:pStyle w:val="Heading2"/>
       </w:pPr>
       <w:r>
-        <w:rPr>
-          <w:rFonts w:ascii="Times New Roman" w:hAnsi="Times New Roman" w:eastAsia="Times New Roman"/>
-          <w:b/>
-          <w:color w:val="1F4E79"/>
-          <w:sz w:val="23"/>
-        </w:rPr>
-        <w:t>2.3 异常处理原理</w:t>
+        <w:t>2.4 异常处理原理</w:t>
       </w:r>
     </w:p>
     <w:p>
@@ -4114,13 +4210,7 @@
         <w:pStyle w:val="CaptionCustom"/>
       </w:pPr>
       <w:r>
-        <w:rPr>
-          <w:rFonts w:ascii="Times New Roman" w:hAnsi="Times New Roman" w:eastAsia="Times New Roman"/>
-          <w:b w:val="0"/>
-          <w:color w:val="5A5A5A"/>
-          <w:sz w:val="18"/>
-        </w:rPr>
-        <w:t>图 2  Gazebo 三分类场景：六个取物格与同排分类垫</w:t>
+        <w:t>图 3  Gazebo 三分类场景：六个取物格与同排分类垫</w:t>
       </w:r>
     </w:p>
     <w:p>
@@ -4850,13 +4940,7 @@
         <w:pStyle w:val="CaptionCustom"/>
       </w:pPr>
       <w:r>
-        <w:rPr>
-          <w:rFonts w:ascii="Times New Roman" w:hAnsi="Times New Roman" w:eastAsia="Times New Roman"/>
-          <w:b w:val="0"/>
-          <w:color w:val="5A5A5A"/>
-          <w:sz w:val="18"/>
-        </w:rPr>
-        <w:t>图 3  手动控制台、六关节调节与语义航点编辑</w:t>
+        <w:t>图 4  手动控制台、六关节调节与语义航点编辑</w:t>
       </w:r>
     </w:p>
     <w:p>
@@ -4938,13 +5022,7 @@
         <w:pStyle w:val="CaptionCustom"/>
       </w:pPr>
       <w:r>
-        <w:rPr>
-          <w:rFonts w:ascii="Times New Roman" w:hAnsi="Times New Roman" w:eastAsia="Times New Roman"/>
-          <w:b w:val="0"/>
-          <w:color w:val="5A5A5A"/>
-          <w:sz w:val="18"/>
-        </w:rPr>
-        <w:t>图 4  六个目标子序列与 34 步自动播放节拍</w:t>
+        <w:t>图 5  六个目标子序列与 34 步自动播放节拍</w:t>
       </w:r>
     </w:p>
     <w:p>
@@ -5026,13 +5104,7 @@
         <w:pStyle w:val="CaptionCustom"/>
       </w:pPr>
       <w:r>
-        <w:rPr>
-          <w:rFonts w:ascii="Times New Roman" w:hAnsi="Times New Roman" w:eastAsia="Times New Roman"/>
-          <w:b w:val="0"/>
-          <w:color w:val="5A5A5A"/>
-          <w:sz w:val="18"/>
-        </w:rPr>
-        <w:t>图 5  夹爪接近、闭合、距离校验、附着与抬升</w:t>
+        <w:t>图 6  夹爪接近、闭合、距离校验、附着与抬升</w:t>
       </w:r>
     </w:p>
     <w:p>
@@ -5086,13 +5158,7 @@
         <w:pStyle w:val="CaptionCustom"/>
       </w:pPr>
       <w:r>
-        <w:rPr>
-          <w:rFonts w:ascii="Times New Roman" w:hAnsi="Times New Roman" w:eastAsia="Times New Roman"/>
-          <w:b w:val="0"/>
-          <w:color w:val="5A5A5A"/>
-          <w:sz w:val="18"/>
-        </w:rPr>
-        <w:t>图 6  分类垫上方对齐、垂直释放与落点验收</w:t>
+        <w:t>图 7  分类垫上方对齐、垂直释放与落点验收</w:t>
       </w:r>
     </w:p>
     <w:p>
@@ -9028,145 +9094,7 @@
         <w:pStyle w:val="CaptionCustom"/>
       </w:pPr>
       <w:r>
-        <w:rPr>
-          <w:rFonts w:ascii="Times New Roman" w:hAnsi="Times New Roman" w:eastAsia="Times New Roman"/>
-          <w:b w:val="0"/>
-          <w:color w:val="5A5A5A"/>
-          <w:sz w:val="18"/>
-        </w:rPr>
-        <w:t>图 7  GUI、状态、事件、位姿和对象级 CSV 形成验收证据链</w:t>
-      </w:r>
-    </w:p>
-    <w:p>
-      <w:pPr>
-        <w:pStyle w:val="Heading2"/>
-        <w:spacing w:line="276" w:lineRule="auto" w:after="100"/>
-      </w:pPr>
-      <w:r>
-        <w:rPr>
-          <w:rFonts w:ascii="Times New Roman" w:hAnsi="Times New Roman" w:eastAsia="Times New Roman"/>
-          <w:b/>
-          <w:color w:val="1F4E79"/>
-          <w:sz w:val="23"/>
-        </w:rPr>
-        <w:t>6.4 视觉检测模型训练与部署</w:t>
-      </w:r>
-    </w:p>
-    <w:p>
-      <w:pPr>
-        <w:spacing w:line="276" w:lineRule="auto" w:after="100"/>
-      </w:pPr>
-      <w:r>
-        <w:rPr>
-          <w:rFonts w:ascii="Times New Roman" w:hAnsi="Times New Roman" w:eastAsia="Times New Roman"/>
-          <w:b w:val="0"/>
-          <w:color w:val="232323"/>
-          <w:sz w:val="20"/>
-        </w:rPr>
-        <w:t>感知模块采用 YOLOv8n 训练三类目标检测模型，识别对象为橡皮、锁和订书机，输出类别、检测框和置信度。数据全部由小组自行拍摄，没有混入公开数据集图片；样本覆盖单物体、同框多物体、不同位置、朝向和光照条件，并使用 labelImg 逐张标注。</w:t>
-      </w:r>
-    </w:p>
-    <w:p>
-      <w:pPr>
-        <w:spacing w:line="276" w:lineRule="auto" w:after="100"/>
-      </w:pPr>
-      <w:r>
-        <w:rPr>
-          <w:rFonts w:ascii="Times New Roman" w:hAnsi="Times New Roman" w:eastAsia="Times New Roman"/>
-          <w:b w:val="0"/>
-          <w:color w:val="232323"/>
-          <w:sz w:val="20"/>
-        </w:rPr>
-        <w:t>训练配置为输入分辨率 640、训练 60 轮、批大小 16，设备为 RTX 4070 Laptop GPU。训练阶段使用马赛克拼接、色调扰动、随机缩放和随机擦除，验证集从原始图片中独立划分且不做增强。最终权重大小为 6.25 MB（约 6.3 MB），参数量约 300 万。根据训练记录，整体及三个类别的 mAP50 和 mAP50-95 均为 0.995，精确率和召回率均为 1.0。</w:t>
-      </w:r>
-    </w:p>
-    <w:p>
-      <w:pPr>
-        <w:spacing w:line="276" w:lineRule="auto" w:after="100"/>
-      </w:pPr>
-      <w:r>
-        <w:rPr>
-          <w:rFonts w:ascii="Times New Roman" w:hAnsi="Times New Roman" w:eastAsia="Times New Roman"/>
-          <w:b w:val="0"/>
-          <w:color w:val="232323"/>
-          <w:sz w:val="20"/>
-        </w:rPr>
-        <w:t>迭代过程针对锁与订书机混淆、订书机个别角度与橡皮混淆、加入新数据后早期样本特征被稀释，以及验证集与外接摄像头场景存在差异等问题，分别采用类别配比调整、同框对比样本补拍、分类损失强化、早期样本加权和实拍薄弱场景补拍。整体 mAP50-95 从 0.938 提升到 0.995。示例外接摄像头画面中，三类目标的置信度为 0.89–0.94，画面显示 31.2 FPS；1.1 ms 是单张模型推理时间，31.2 FPS 是包含摄像头读取和显示的端到端帧率。</w:t>
-      </w:r>
-    </w:p>
-    <w:p>
-      <w:pPr>
-        <w:spacing w:line="276" w:lineRule="auto" w:after="100"/>
-      </w:pPr>
-      <w:r>
-        <w:rPr>
-          <w:rFonts w:ascii="Times New Roman" w:hAnsi="Times New Roman" w:eastAsia="Times New Roman"/>
-          <w:b w:val="0"/>
-          <w:color w:val="232323"/>
-          <w:sz w:val="20"/>
-        </w:rPr>
-        <w:t>仿真阶段仍由监视节点根据 Gazebo 模型状态生成确定性的 Detection2DArray 消息，以保证任务和执行接口的重复性；训练权重单独归档在 models/ 中，用于后续外接摄像头和真机验证。</w:t>
-      </w:r>
-    </w:p>
-    <w:p>
-      <w:pPr>
-        <w:spacing w:line="276" w:lineRule="auto" w:after="100"/>
-        <w:jc w:val="center"/>
-      </w:pPr>
-      <w:r>
-        <w:rPr>
-          <w:rFonts w:ascii="Times New Roman" w:hAnsi="Times New Roman" w:eastAsia="Times New Roman"/>
-          <w:b w:val="0"/>
-          <w:color w:val="232323"/>
-          <w:sz w:val="20"/>
-        </w:rPr>
-        <w:drawing>
-          <wp:inline xmlns:a="http://schemas.openxmlformats.org/drawingml/2006/main" xmlns:pic="http://schemas.openxmlformats.org/drawingml/2006/picture">
-            <wp:extent cx="5257800" cy="3541083"/>
-            <wp:docPr id="10" name="Picture 10"/>
-            <wp:cNvGraphicFramePr>
-              <a:graphicFrameLocks noChangeAspect="1"/>
-            </wp:cNvGraphicFramePr>
-            <a:graphic>
-              <a:graphicData uri="http://schemas.openxmlformats.org/drawingml/2006/picture">
-                <pic:pic>
-                  <pic:nvPicPr>
-                    <pic:cNvPr id="0" name="b028d3f11213205b74b2a37d8148411b.jpg"/>
-                    <pic:cNvPicPr/>
-                  </pic:nvPicPr>
-                  <pic:blipFill>
-                    <a:blip r:embed="rId20"/>
-                    <a:stretch>
-                      <a:fillRect/>
-                    </a:stretch>
-                  </pic:blipFill>
-                  <pic:spPr>
-                    <a:xfrm>
-                      <a:off x="0" y="0"/>
-                      <a:ext cx="5257800" cy="3541083"/>
-                    </a:xfrm>
-                    <a:prstGeom prst="rect"/>
-                  </pic:spPr>
-                </pic:pic>
-              </a:graphicData>
-            </a:graphic>
-          </wp:inline>
-        </w:drawing>
-      </w:r>
-    </w:p>
-    <w:p>
-      <w:pPr>
-        <w:pStyle w:val="CaptionCustom"/>
-        <w:jc w:val="center"/>
-      </w:pPr>
-      <w:r>
-        <w:rPr>
-          <w:rFonts w:ascii="Times New Roman" w:hAnsi="Times New Roman" w:eastAsia="Times New Roman"/>
-          <w:b w:val="0"/>
-          <w:color w:val="5A5A5A"/>
-          <w:sz w:val="18"/>
-        </w:rPr>
-        <w:t>图 8  外接摄像头同时识别橡皮、锁和订书机的实测画面</w:t>
+        <w:t>图 8  GUI、状态、事件、位姿和对象级 CSV 形成验收证据链</w:t>
       </w:r>
     </w:p>
     <w:p>

</xml_diff>

<commit_message>
report: align visual model with experiment workflow
</commit_message>
<xml_diff>
--- a/report/experiment3_lab_report_group17.docx
+++ b/report/experiment3_lab_report_group17.docx
@@ -1646,25 +1646,10 @@
     </w:p>
     <w:p>
       <w:pPr>
-        <w:spacing w:line="276" w:lineRule="auto" w:after="100"/>
+        <w:pStyle w:val="Heading2"/>
       </w:pPr>
       <w:r>
-        <w:rPr>
-          <w:rFonts w:ascii="Times New Roman" w:hAnsi="Times New Roman" w:eastAsia="Times New Roman"/>
-          <w:b w:val="0"/>
-          <w:color w:val="232323"/>
-          <w:sz w:val="20"/>
-        </w:rPr>
-        <w:t>仿真监视节点按照标准 Detection2DArray 契约生成确定性检测结果，任务节点使用与真实视觉节点相同的消息字段。这样能够在仿真中验证网格与任务控制逻辑，再将真实相机和检测模型接入同一接口。</w:t>
-      </w:r>
-    </w:p>
-    <w:p>
-      <w:pPr>
-        <w:pStyle w:val="Heading2"/>
-        <w:spacing w:line="276" w:lineRule="auto" w:after="100"/>
-      </w:pPr>
-      <w:r>
-        <w:t>2.2 视觉检测模型训练与部署</w:t>
+        <w:t>2.2 视觉检测与消息接口</w:t>
       </w:r>
     </w:p>
     <w:p>
@@ -1672,110 +1657,7 @@
         <w:spacing w:line="276" w:lineRule="auto" w:after="100"/>
       </w:pPr>
       <w:r>
-        <w:rPr>
-          <w:rFonts w:ascii="Times New Roman" w:hAnsi="Times New Roman" w:eastAsia="Times New Roman"/>
-          <w:b w:val="0"/>
-          <w:color w:val="232323"/>
-          <w:sz w:val="20"/>
-        </w:rPr>
-        <w:t>感知模块采用 YOLOv8n 训练三类目标检测模型，识别对象为橡皮、锁和订书机，输出类别、检测框和置信度。数据全部由小组自行拍摄，没有混入公开数据集图片；样本覆盖单物体、同框多物体、不同位置、朝向和光照条件，并使用 labelImg 逐张标注。</w:t>
-      </w:r>
-    </w:p>
-    <w:p>
-      <w:pPr>
-        <w:spacing w:line="276" w:lineRule="auto" w:after="100"/>
-      </w:pPr>
-      <w:r>
-        <w:rPr>
-          <w:rFonts w:ascii="Times New Roman" w:hAnsi="Times New Roman" w:eastAsia="Times New Roman"/>
-          <w:b w:val="0"/>
-          <w:color w:val="232323"/>
-          <w:sz w:val="20"/>
-        </w:rPr>
-        <w:t>训练配置为输入分辨率 640、训练 60 轮、批大小 16，设备为 RTX 4070 Laptop GPU。训练阶段使用马赛克拼接、色调扰动、随机缩放和随机擦除，验证集从原始图片中独立划分且不做增强。最终权重大小为 6.25 MB（约 6.3 MB），参数量约 300 万。根据训练记录，整体及三个类别的 mAP50 和 mAP50-95 均为 0.995，精确率和召回率均为 1.0。</w:t>
-      </w:r>
-    </w:p>
-    <w:p>
-      <w:pPr>
-        <w:spacing w:line="276" w:lineRule="auto" w:after="100"/>
-      </w:pPr>
-      <w:r>
-        <w:rPr>
-          <w:rFonts w:ascii="Times New Roman" w:hAnsi="Times New Roman" w:eastAsia="Times New Roman"/>
-          <w:b w:val="0"/>
-          <w:color w:val="232323"/>
-          <w:sz w:val="20"/>
-        </w:rPr>
-        <w:t>迭代过程针对锁与订书机混淆、订书机个别角度与橡皮混淆、加入新数据后早期样本特征被稀释，以及验证集与外接摄像头场景存在差异等问题，分别采用类别配比调整、同框对比样本补拍、分类损失强化、早期样本加权和实拍薄弱场景补拍。整体 mAP50-95 从 0.938 提升到 0.995。示例外接摄像头画面中，三类目标的置信度为 0.89–0.94，画面显示 31.2 FPS；1.1 ms 是单张模型推理时间，31.2 FPS 是包含摄像头读取和显示的端到端帧率。</w:t>
-      </w:r>
-    </w:p>
-    <w:p>
-      <w:pPr>
-        <w:spacing w:line="276" w:lineRule="auto" w:after="100"/>
-      </w:pPr>
-      <w:r>
-        <w:rPr>
-          <w:rFonts w:ascii="Times New Roman" w:hAnsi="Times New Roman" w:eastAsia="Times New Roman"/>
-          <w:b w:val="0"/>
-          <w:color w:val="232323"/>
-          <w:sz w:val="20"/>
-        </w:rPr>
-        <w:t>仿真阶段仍由监视节点根据 Gazebo 模型状态生成确定性的 Detection2DArray 消息，以保证任务和执行接口的重复性；训练权重单独归档在 models/ 中，用于后续外接摄像头和真机验证。</w:t>
-      </w:r>
-    </w:p>
-    <w:p>
-      <w:pPr>
-        <w:spacing w:line="276" w:lineRule="auto" w:after="100"/>
-        <w:jc w:val="center"/>
-      </w:pPr>
-      <w:r>
-        <w:rPr>
-          <w:rFonts w:ascii="Times New Roman" w:hAnsi="Times New Roman" w:eastAsia="Times New Roman"/>
-          <w:b w:val="0"/>
-          <w:color w:val="232323"/>
-          <w:sz w:val="20"/>
-        </w:rPr>
-        <w:drawing>
-          <wp:inline xmlns:a="http://schemas.openxmlformats.org/drawingml/2006/main" xmlns:pic="http://schemas.openxmlformats.org/drawingml/2006/picture">
-            <wp:extent cx="5257800" cy="3541083"/>
-            <wp:docPr id="10" name="Picture 10"/>
-            <wp:cNvGraphicFramePr>
-              <a:graphicFrameLocks noChangeAspect="1"/>
-            </wp:cNvGraphicFramePr>
-            <a:graphic>
-              <a:graphicData uri="http://schemas.openxmlformats.org/drawingml/2006/picture">
-                <pic:pic>
-                  <pic:nvPicPr>
-                    <pic:cNvPr id="0" name="b028d3f11213205b74b2a37d8148411b.jpg"/>
-                    <pic:cNvPicPr/>
-                  </pic:nvPicPr>
-                  <pic:blipFill>
-                    <a:blip r:embed="rId20"/>
-                    <a:stretch>
-                      <a:fillRect/>
-                    </a:stretch>
-                  </pic:blipFill>
-                  <pic:spPr>
-                    <a:xfrm>
-                      <a:off x="0" y="0"/>
-                      <a:ext cx="5257800" cy="3541083"/>
-                    </a:xfrm>
-                    <a:prstGeom prst="rect"/>
-                  </pic:spPr>
-                </pic:pic>
-              </a:graphicData>
-            </a:graphic>
-          </wp:inline>
-        </w:drawing>
-      </w:r>
-    </w:p>
-    <w:p>
-      <w:pPr>
-        <w:pStyle w:val="CaptionCustom"/>
-        <w:jc w:val="center"/>
-      </w:pPr>
-      <w:r>
-        <w:t>图 2  外接摄像头同时识别橡皮、锁和订书机的实测画面</w:t>
+        <w:t>视觉检测模型输出类别、检测框中心和置信度，并通过 Detection2DArray 进入任务节点。仿真监视节点按照相同契约生成确定性检测结果，因此可以先在 Gazebo 中验证网格和任务控制逻辑，再把真实相机和训练模型接入同一接口。</w:t>
       </w:r>
     </w:p>
     <w:p>
@@ -4210,7 +4092,7 @@
         <w:pStyle w:val="CaptionCustom"/>
       </w:pPr>
       <w:r>
-        <w:t>图 3  Gazebo 三分类场景：六个取物格与同排分类垫</w:t>
+        <w:t>图 2  Gazebo 三分类场景：六个取物格与同排分类垫</w:t>
       </w:r>
     </w:p>
     <w:p>
@@ -4835,16 +4717,130 @@
     </w:p>
     <w:p>
       <w:pPr>
-        <w:pStyle w:val="Heading3"/>
+        <w:pStyle w:val="Heading2"/>
+        <w:spacing w:line="276" w:lineRule="auto" w:after="100"/>
+      </w:pPr>
+      <w:r>
+        <w:t>4.1.1 视觉检测模型训练与外接摄像头验证</w:t>
+      </w:r>
+    </w:p>
+    <w:p>
+      <w:pPr>
+        <w:spacing w:line="276" w:lineRule="auto" w:after="100"/>
       </w:pPr>
       <w:r>
         <w:rPr>
           <w:rFonts w:ascii="Times New Roman" w:hAnsi="Times New Roman" w:eastAsia="Times New Roman"/>
-          <w:b/>
-          <w:color w:val="1F4E79"/>
-          <w:sz w:val="21"/>
+          <w:b w:val="0"/>
+          <w:color w:val="232323"/>
+          <w:sz w:val="20"/>
         </w:rPr>
-        <w:t>4.1.1 场景搭建与参数同步</w:t>
+        <w:t>感知模块采用 YOLOv8n 训练三类目标检测模型，识别对象为橡皮、锁和订书机，输出类别、检测框和置信度。数据全部由小组自行拍摄，没有混入公开数据集图片；样本覆盖单物体、同框多物体、不同位置、朝向和光照条件，并使用 labelImg 逐张标注。</w:t>
+      </w:r>
+    </w:p>
+    <w:p>
+      <w:pPr>
+        <w:spacing w:line="276" w:lineRule="auto" w:after="100"/>
+      </w:pPr>
+      <w:r>
+        <w:rPr>
+          <w:rFonts w:ascii="Times New Roman" w:hAnsi="Times New Roman" w:eastAsia="Times New Roman"/>
+          <w:b w:val="0"/>
+          <w:color w:val="232323"/>
+          <w:sz w:val="20"/>
+        </w:rPr>
+        <w:t>训练配置为输入分辨率 640、训练 60 轮、批大小 16，设备为 RTX 4070 Laptop GPU。训练阶段使用马赛克拼接、色调扰动、随机缩放和随机擦除，验证集从原始图片中独立划分且不做增强。最终权重大小为 6.25 MB（约 6.3 MB），参数量约 300 万。根据训练记录，整体及三个类别的 mAP50 和 mAP50-95 均为 0.995，精确率和召回率均为 1.0。</w:t>
+      </w:r>
+    </w:p>
+    <w:p>
+      <w:pPr>
+        <w:spacing w:line="276" w:lineRule="auto" w:after="100"/>
+      </w:pPr>
+      <w:r>
+        <w:rPr>
+          <w:rFonts w:ascii="Times New Roman" w:hAnsi="Times New Roman" w:eastAsia="Times New Roman"/>
+          <w:b w:val="0"/>
+          <w:color w:val="232323"/>
+          <w:sz w:val="20"/>
+        </w:rPr>
+        <w:t>迭代过程针对锁与订书机混淆、订书机个别角度与橡皮混淆、加入新数据后早期样本特征被稀释，以及验证集与外接摄像头场景存在差异等问题，分别采用类别配比调整、同框对比样本补拍、分类损失强化、早期样本加权和实拍薄弱场景补拍。整体 mAP50-95 从 0.938 提升到 0.995。示例外接摄像头画面中，三类目标的置信度为 0.89–0.94，画面显示 31.2 FPS；1.1 ms 是单张模型推理时间，31.2 FPS 是包含摄像头读取和显示的端到端帧率。</w:t>
+      </w:r>
+    </w:p>
+    <w:p>
+      <w:pPr>
+        <w:spacing w:line="276" w:lineRule="auto" w:after="100"/>
+      </w:pPr>
+      <w:r>
+        <w:rPr>
+          <w:rFonts w:ascii="Times New Roman" w:hAnsi="Times New Roman" w:eastAsia="Times New Roman"/>
+          <w:b w:val="0"/>
+          <w:color w:val="232323"/>
+          <w:sz w:val="20"/>
+        </w:rPr>
+        <w:t>仿真阶段仍由监视节点根据 Gazebo 模型状态生成确定性的 Detection2DArray 消息，以保证任务和执行接口的重复性；训练权重单独归档在 models/ 中，用于后续外接摄像头和真机验证。</w:t>
+      </w:r>
+    </w:p>
+    <w:p>
+      <w:pPr>
+        <w:spacing w:line="276" w:lineRule="auto" w:after="100"/>
+        <w:jc w:val="center"/>
+      </w:pPr>
+      <w:r>
+        <w:rPr>
+          <w:rFonts w:ascii="Times New Roman" w:hAnsi="Times New Roman" w:eastAsia="Times New Roman"/>
+          <w:b w:val="0"/>
+          <w:color w:val="232323"/>
+          <w:sz w:val="20"/>
+        </w:rPr>
+        <w:drawing>
+          <wp:inline xmlns:a="http://schemas.openxmlformats.org/drawingml/2006/main" xmlns:pic="http://schemas.openxmlformats.org/drawingml/2006/picture">
+            <wp:extent cx="5257800" cy="3541083"/>
+            <wp:docPr id="10" name="Picture 10"/>
+            <wp:cNvGraphicFramePr>
+              <a:graphicFrameLocks noChangeAspect="1"/>
+            </wp:cNvGraphicFramePr>
+            <a:graphic>
+              <a:graphicData uri="http://schemas.openxmlformats.org/drawingml/2006/picture">
+                <pic:pic>
+                  <pic:nvPicPr>
+                    <pic:cNvPr id="0" name="b028d3f11213205b74b2a37d8148411b.jpg"/>
+                    <pic:cNvPicPr/>
+                  </pic:nvPicPr>
+                  <pic:blipFill>
+                    <a:blip r:embed="rId20"/>
+                    <a:stretch>
+                      <a:fillRect/>
+                    </a:stretch>
+                  </pic:blipFill>
+                  <pic:spPr>
+                    <a:xfrm>
+                      <a:off x="0" y="0"/>
+                      <a:ext cx="5257800" cy="3541083"/>
+                    </a:xfrm>
+                    <a:prstGeom prst="rect"/>
+                  </pic:spPr>
+                </pic:pic>
+              </a:graphicData>
+            </a:graphic>
+          </wp:inline>
+        </w:drawing>
+      </w:r>
+    </w:p>
+    <w:p>
+      <w:pPr>
+        <w:pStyle w:val="CaptionCustom"/>
+        <w:jc w:val="center"/>
+      </w:pPr>
+      <w:r>
+        <w:t>图 3  外接摄像头同时识别橡皮、锁和订书机的实测画面</w:t>
+      </w:r>
+    </w:p>
+    <w:p>
+      <w:pPr>
+        <w:pStyle w:val="Heading3"/>
+      </w:pPr>
+      <w:r>
+        <w:t>4.1.2 场景搭建与参数同步</w:t>
       </w:r>
     </w:p>
     <w:p>
@@ -4866,13 +4862,7 @@
         <w:pStyle w:val="Heading3"/>
       </w:pPr>
       <w:r>
-        <w:rPr>
-          <w:rFonts w:ascii="Times New Roman" w:hAnsi="Times New Roman" w:eastAsia="Times New Roman"/>
-          <w:b/>
-          <w:color w:val="1F4E79"/>
-          <w:sz w:val="21"/>
-        </w:rPr>
-        <w:t>4.1.2 手动示教与单目标调试</w:t>
+        <w:t>4.1.3 手动示教与单目标调试</w:t>
       </w:r>
     </w:p>
     <w:p>
@@ -4948,13 +4938,7 @@
         <w:pStyle w:val="Heading3"/>
       </w:pPr>
       <w:r>
-        <w:rPr>
-          <w:rFonts w:ascii="Times New Roman" w:hAnsi="Times New Roman" w:eastAsia="Times New Roman"/>
-          <w:b/>
-          <w:color w:val="1F4E79"/>
-          <w:sz w:val="21"/>
-        </w:rPr>
-        <w:t>4.1.3 自动播放与一键启动</w:t>
+        <w:t>4.1.4 自动播放与一键启动</w:t>
       </w:r>
     </w:p>
     <w:p>
@@ -5030,13 +5014,7 @@
         <w:pStyle w:val="Heading3"/>
       </w:pPr>
       <w:r>
-        <w:rPr>
-          <w:rFonts w:ascii="Times New Roman" w:hAnsi="Times New Roman" w:eastAsia="Times New Roman"/>
-          <w:b/>
-          <w:color w:val="1F4E79"/>
-          <w:sz w:val="21"/>
-        </w:rPr>
-        <w:t>4.1.4 抓取、搬运与释放</w:t>
+        <w:t>4.1.5 抓取、搬运与释放</w:t>
       </w:r>
     </w:p>
     <w:p>
@@ -5166,13 +5144,7 @@
         <w:pStyle w:val="Heading3"/>
       </w:pPr>
       <w:r>
-        <w:rPr>
-          <w:rFonts w:ascii="Times New Roman" w:hAnsi="Times New Roman" w:eastAsia="Times New Roman"/>
-          <w:b/>
-          <w:color w:val="1F4E79"/>
-          <w:sz w:val="21"/>
-        </w:rPr>
-        <w:t>4.1.5 仿真验收记录</w:t>
+        <w:t>4.1.6 仿真验收记录</w:t>
       </w:r>
     </w:p>
     <w:p>
@@ -7359,13 +7331,21 @@
         <w:pStyle w:val="Heading2"/>
       </w:pPr>
       <w:r>
-        <w:rPr>
-          <w:rFonts w:ascii="Times New Roman" w:hAnsi="Times New Roman" w:eastAsia="Times New Roman"/>
-          <w:b/>
-          <w:color w:val="1F4E79"/>
-          <w:sz w:val="23"/>
-        </w:rPr>
-        <w:t>6.1 红蓝两类六物体定量基线</w:t>
+        <w:t>6.1 视觉检测与接口验证</w:t>
+      </w:r>
+    </w:p>
+    <w:p>
+      <w:pPr/>
+      <w:r>
+        <w:t>独立原图验证集上的整体结果和三个类别均达到 mAP50=0.995、mAP50-95=0.995，精确率和召回率均为 1.0。图 3 的外接摄像头画面同时显示三类目标，置信度为 0.89–0.94，画面显示 31.2 FPS。该结果说明检测输出能够进入 Detection2DArray 接口；视觉检测结果与 Gazebo 的确定性监视结果分开记录，不将其等同于真机抓取成功率。</w:t>
+      </w:r>
+    </w:p>
+    <w:p>
+      <w:pPr>
+        <w:pStyle w:val="Heading2"/>
+      </w:pPr>
+      <w:r>
+        <w:t>6.2 红蓝两类六物体定量基线</w:t>
       </w:r>
     </w:p>
     <w:p>
@@ -8992,13 +8972,7 @@
         <w:pStyle w:val="Heading2"/>
       </w:pPr>
       <w:r>
-        <w:rPr>
-          <w:rFonts w:ascii="Times New Roman" w:hAnsi="Times New Roman" w:eastAsia="Times New Roman"/>
-          <w:b/>
-          <w:color w:val="1F4E79"/>
-          <w:sz w:val="23"/>
-        </w:rPr>
-        <w:t>6.2 三分类扩展</w:t>
+        <w:t>6.3 三分类扩展</w:t>
       </w:r>
     </w:p>
     <w:p>
@@ -9020,13 +8994,7 @@
         <w:pStyle w:val="Heading2"/>
       </w:pPr>
       <w:r>
-        <w:rPr>
-          <w:rFonts w:ascii="Times New Roman" w:hAnsi="Times New Roman" w:eastAsia="Times New Roman"/>
-          <w:b/>
-          <w:color w:val="1F4E79"/>
-          <w:sz w:val="23"/>
-        </w:rPr>
-        <w:t>6.3 多层证据链</w:t>
+        <w:t>6.4 多层证据链</w:t>
       </w:r>
     </w:p>
     <w:p>

</xml_diff>

<commit_message>
report: separate Gazebo sorting and camera detector evidence
</commit_message>
<xml_diff>
--- a/report/experiment3_lab_report_group17.docx
+++ b/report/experiment3_lab_report_group17.docx
@@ -476,12 +476,10 @@
       </w:pPr>
       <w:r>
         <w:rPr>
-          <w:rFonts w:ascii="Times New Roman" w:hAnsi="Times New Roman" w:eastAsia="Times New Roman"/>
-          <w:b w:val="0"/>
-          <w:color w:val="232323"/>
+          <w:rFonts w:ascii="Times New Roman" w:hAnsi="Times New Roman" w:eastAsia="SimSun"/>
           <w:sz w:val="20"/>
         </w:rPr>
-        <w:t>本实验面向桌面物体自动分类整理任务，使用 ROS 2、Gazebo 和 mechArm 270 建立“感知—定位—决策—执行—验收”闭环。俯视相机发布桌面图像，识别节点输出类别、置信度和检测框，任务节点将检测框中心映射到固定取物网格并生成带有分类垫信息的执行队列，机械臂按照状态机完成抓取、搬运、释放和结果记录。</w:t>
+        <w:t>本实验围绕桌面物体自动分类整理，完成了两部分验证。Gazebo 中，场景监视节点根据彩色圆柱模型状态生成 Detection2DArray 消息，任务节点据此完成网格定位、分类决策和机械臂分拣；外接摄像头部分使用 YOLOv8n 检测橡皮、锁和订书机。因此，Gazebo 的 6/6 记录和摄像头模型实测分别说明系统的不同环节。</w:t>
       </w:r>
     </w:p>
     <w:p>
@@ -490,12 +488,10 @@
       </w:pPr>
       <w:r>
         <w:rPr>
-          <w:rFonts w:ascii="Times New Roman" w:hAnsi="Times New Roman" w:eastAsia="Times New Roman"/>
-          <w:b w:val="0"/>
-          <w:color w:val="232323"/>
+          <w:rFonts w:ascii="Times New Roman" w:hAnsi="Times New Roman" w:eastAsia="SimSun"/>
           <w:sz w:val="20"/>
         </w:rPr>
-        <w:t>系统先使用红、蓝两类共 6 个圆柱完成仿真定量验收，已归档的对象级记录为 6/6；随后将场景扩展为红、蓝、绿三类，用于验证新增类别、分类区域、航点序列和自动播放接口。报告依照“仿真开发—真机验证”的阶段组织内容，并将定量结果、过程证据和后续真机验收字段分别列出。</w:t>
+        <w:t>红蓝两类 Gazebo 基线的对象级记录为 6/6；红蓝绿场景及 34 步自动播放展示了三色扩展。外接摄像头模型的验证分数和实测画面作为独立的视觉结果记录。进入真机闭环前，还需统一物体类别、标定相机到网格的映射、发布 ROS 检测消息，并重新开展端到端验收。</w:t>
       </w:r>
     </w:p>
     <w:p>
@@ -504,21 +500,10 @@
       </w:pPr>
       <w:r>
         <w:rPr>
-          <w:rFonts w:ascii="Times New Roman" w:hAnsi="Times New Roman" w:eastAsia="Times New Roman"/>
-          <w:b w:val="0"/>
-          <w:color w:val="232323"/>
+          <w:rFonts w:ascii="Times New Roman" w:hAnsi="Times New Roman" w:eastAsia="SimSun"/>
           <w:sz w:val="20"/>
         </w:rPr>
-        <w:t>实验结论：</w:t>
-      </w:r>
-      <w:r>
-        <w:rPr>
-          <w:rFonts w:ascii="Times New Roman" w:hAnsi="Times New Roman" w:eastAsia="Times New Roman"/>
-          <w:b w:val="0"/>
-          <w:color w:val="232323"/>
-          <w:sz w:val="20"/>
-        </w:rPr>
-        <w:t>仿真阶段完成了标准图像接口、固定网格定位、类别到分类垫映射、抓取释放状态机、异常分支和对象级日志；红蓝基线达到 6/6，三分类扩展完成场景和自动序列集成，真机阶段形成了可直接落地的部署与验收方案。</w:t>
+        <w:t>仿真阶段完成了固定网格定位、类别到分类区的决策、抓取释放控制、异常分支和对象级日志，红蓝基线达到 6/6，三色场景及播放序列也已建立。外接摄像头上的三类检测模型完成了橡皮、锁和订书机的训练与测试。这些结果分别使用不同物体和证据，构成后续集成的基础。</w:t>
       </w:r>
     </w:p>
     <w:p>
@@ -1557,6 +1542,7 @@
     <w:p>
       <w:pPr>
         <w:pStyle w:val="Heading1"/>
+        <w:pageBreakBefore/>
       </w:pPr>
       <w:r>
         <w:rPr>
@@ -1587,7 +1573,11 @@
         <w:spacing w:line="276" w:lineRule="auto" w:after="100"/>
       </w:pPr>
       <w:r>
-        <w:t>系统由感知层、任务决策层和机械臂执行层组成。感知层先采集图像，由视觉检测模型输出类别、检测框和置信度，再统一封装为 Detection2DArray；决策层完成置信度筛选、网格定位、类别映射、队列排序和异常分支；执行层控制机械臂和夹爪完成接近、闭合、抬升、搬运、释放与结果反馈。验收层读取 GUI、阶段状态、事件日志、最终位姿和对象级 CSV，形成可追溯证据。</w:t>
+        <w:rPr>
+          <w:rFonts w:ascii="Times New Roman" w:hAnsi="Times New Roman" w:eastAsia="SimSun"/>
+          <w:sz w:val="20"/>
+        </w:rPr>
+        <w:t>图 1 分别表示两条已验证路径。Gazebo 场景监视节点读取彩色圆柱模型状态，生成 Detection2DArray 格式的仿真检测消息；任务节点根据消息完成网格分配、分类区选择和机械臂控制。外接 RGB 摄像头配合 YOLOv8n 检测橡皮、锁和订书机。统一消息格式是后续连接点；要让真实摄像头驱动分拣，还需完成物体类别映射和像素到取物网格的标定。</w:t>
       </w:r>
     </w:p>
     <w:p>
@@ -1641,7 +1631,7 @@
         <w:pStyle w:val="CaptionCustom"/>
       </w:pPr>
       <w:r>
-        <w:t>图 1  三层系统架构与对象级结果闭环</w:t>
+        <w:t>图 1  Gazebo 分拣与外接摄像头检测的两条验证路径</w:t>
       </w:r>
     </w:p>
     <w:p>
@@ -1657,7 +1647,11 @@
         <w:spacing w:line="276" w:lineRule="auto" w:after="100"/>
       </w:pPr>
       <w:r>
-        <w:t>视觉检测模型输出类别、检测框中心和置信度，并通过 Detection2DArray 进入任务节点。仿真监视节点按照相同契约生成确定性检测结果，因此可以先在 Gazebo 中验证网格和任务控制逻辑，再把真实相机和训练模型接入同一接口。</w:t>
+        <w:rPr>
+          <w:rFonts w:ascii="Times New Roman" w:hAnsi="Times New Roman" w:eastAsia="SimSun"/>
+          <w:sz w:val="20"/>
+        </w:rPr>
+        <w:t>任务节点接收 Detection2DArray 中的类别、检测框和置信度。已归档的 Gazebo 分拣由 sorting_scene_monitor 根据仿真模型状态生成这些字段；另行训练的 YOLOv8n 通过外接摄像头测试。模型的橡皮、锁、订书机类别用于实体物体分拣时，需重新配置类别到料盒的对应关系。</w:t>
       </w:r>
     </w:p>
     <w:p>
@@ -4597,17 +4591,12 @@
             </w:tcBorders>
           </w:tcPr>
           <w:p>
-            <w:pPr>
-              <w:jc w:val="left"/>
-            </w:pPr>
             <w:r>
               <w:rPr>
-                <w:rFonts w:ascii="Times New Roman" w:hAnsi="Times New Roman" w:eastAsia="Times New Roman"/>
-                <w:b w:val="0"/>
-                <w:color w:val="232323"/>
-                <w:sz w:val="17"/>
+                <w:rFonts w:ascii="Times New Roman" w:hAnsi="Times New Roman" w:eastAsia="SimSun"/>
+                <w:sz w:val="18"/>
               </w:rPr>
-              <w:t>接入前序 YOLOv8 类别模型，输出类别、置信度和检测框</w:t>
+              <w:t>完成标定与类别配置后，将橡皮、锁、订书机的检测结果发布到 ROS</w:t>
             </w:r>
           </w:p>
         </w:tc>
@@ -4666,17 +4655,12 @@
             <w:shd w:fill="F7FAFC"/>
           </w:tcPr>
           <w:p>
-            <w:pPr>
-              <w:jc w:val="left"/>
-            </w:pPr>
             <w:r>
               <w:rPr>
-                <w:rFonts w:ascii="Times New Roman" w:hAnsi="Times New Roman" w:eastAsia="Times New Roman"/>
-                <w:b w:val="0"/>
-                <w:color w:val="232323"/>
-                <w:sz w:val="17"/>
+                <w:rFonts w:ascii="Times New Roman" w:hAnsi="Times New Roman" w:eastAsia="SimSun"/>
+                <w:sz w:val="18"/>
               </w:rPr>
-              <w:t>参考记录 Precision 0.658、Recall 0.748、mAP@0.5 0.766、约 15 FPS；上机运行时重新记录</w:t>
+              <w:t>待摄像头驱动的真机实验测量</w:t>
             </w:r>
           </w:p>
         </w:tc>
@@ -4717,11 +4701,10 @@
     </w:p>
     <w:p>
       <w:pPr>
-        <w:pStyle w:val="Heading2"/>
-        <w:spacing w:line="276" w:lineRule="auto" w:after="100"/>
+        <w:pStyle w:val="Heading3"/>
       </w:pPr>
       <w:r>
-        <w:t>4.1.1 视觉检测模型训练与外接摄像头验证</w:t>
+        <w:t>4.1.1 场景搭建与参数同步</w:t>
       </w:r>
     </w:p>
     <w:p>
@@ -4735,104 +4718,7 @@
           <w:color w:val="232323"/>
           <w:sz w:val="20"/>
         </w:rPr>
-        <w:t>感知模块采用 YOLOv8n 训练三类目标检测模型，识别对象为橡皮、锁和订书机，输出类别、检测框和置信度。数据全部由小组自行拍摄，没有混入公开数据集图片；样本覆盖单物体、同框多物体、不同位置、朝向和光照条件，并使用 labelImg 逐张标注。</w:t>
-      </w:r>
-    </w:p>
-    <w:p>
-      <w:pPr>
-        <w:spacing w:line="276" w:lineRule="auto" w:after="100"/>
-      </w:pPr>
-      <w:r>
-        <w:rPr>
-          <w:rFonts w:ascii="Times New Roman" w:hAnsi="Times New Roman" w:eastAsia="Times New Roman"/>
-          <w:b w:val="0"/>
-          <w:color w:val="232323"/>
-          <w:sz w:val="20"/>
-        </w:rPr>
-        <w:t>训练配置为输入分辨率 640、训练 60 轮、批大小 16，设备为 RTX 4070 Laptop GPU。训练阶段使用马赛克拼接、色调扰动、随机缩放和随机擦除，验证集从原始图片中独立划分且不做增强。最终权重大小为 6.25 MB（约 6.3 MB），参数量约 300 万。根据训练记录，整体及三个类别的 mAP50 和 mAP50-95 均为 0.995，精确率和召回率均为 1.0。</w:t>
-      </w:r>
-    </w:p>
-    <w:p>
-      <w:pPr>
-        <w:spacing w:line="276" w:lineRule="auto" w:after="100"/>
-      </w:pPr>
-      <w:r>
-        <w:rPr>
-          <w:rFonts w:ascii="Times New Roman" w:hAnsi="Times New Roman" w:eastAsia="Times New Roman"/>
-          <w:b w:val="0"/>
-          <w:color w:val="232323"/>
-          <w:sz w:val="20"/>
-        </w:rPr>
-        <w:t>迭代过程针对锁与订书机混淆、订书机个别角度与橡皮混淆、加入新数据后早期样本特征被稀释，以及验证集与外接摄像头场景存在差异等问题，分别采用类别配比调整、同框对比样本补拍、分类损失强化、早期样本加权和实拍薄弱场景补拍。整体 mAP50-95 从 0.938 提升到 0.995。示例外接摄像头画面中，三类目标的置信度为 0.89–0.94，画面显示 31.2 FPS；1.1 ms 是单张模型推理时间，31.2 FPS 是包含摄像头读取和显示的端到端帧率。</w:t>
-      </w:r>
-    </w:p>
-    <w:p>
-      <w:pPr>
-        <w:spacing w:line="276" w:lineRule="auto" w:after="100"/>
-      </w:pPr>
-      <w:r>
-        <w:rPr>
-          <w:rFonts w:ascii="Times New Roman" w:hAnsi="Times New Roman" w:eastAsia="Times New Roman"/>
-          <w:b w:val="0"/>
-          <w:color w:val="232323"/>
-          <w:sz w:val="20"/>
-        </w:rPr>
-        <w:t>仿真阶段仍由监视节点根据 Gazebo 模型状态生成确定性的 Detection2DArray 消息，以保证任务和执行接口的重复性；训练权重单独归档在 models/ 中，用于后续外接摄像头和真机验证。</w:t>
-      </w:r>
-    </w:p>
-    <w:p>
-      <w:pPr>
-        <w:spacing w:line="276" w:lineRule="auto" w:after="100"/>
-        <w:jc w:val="center"/>
-      </w:pPr>
-      <w:r>
-        <w:rPr>
-          <w:rFonts w:ascii="Times New Roman" w:hAnsi="Times New Roman" w:eastAsia="Times New Roman"/>
-          <w:b w:val="0"/>
-          <w:color w:val="232323"/>
-          <w:sz w:val="20"/>
-        </w:rPr>
-        <w:drawing>
-          <wp:inline xmlns:a="http://schemas.openxmlformats.org/drawingml/2006/main" xmlns:pic="http://schemas.openxmlformats.org/drawingml/2006/picture">
-            <wp:extent cx="5257800" cy="3541083"/>
-            <wp:docPr id="10" name="Picture 10"/>
-            <wp:cNvGraphicFramePr>
-              <a:graphicFrameLocks noChangeAspect="1"/>
-            </wp:cNvGraphicFramePr>
-            <a:graphic>
-              <a:graphicData uri="http://schemas.openxmlformats.org/drawingml/2006/picture">
-                <pic:pic>
-                  <pic:nvPicPr>
-                    <pic:cNvPr id="0" name="b028d3f11213205b74b2a37d8148411b.jpg"/>
-                    <pic:cNvPicPr/>
-                  </pic:nvPicPr>
-                  <pic:blipFill>
-                    <a:blip r:embed="rId20"/>
-                    <a:stretch>
-                      <a:fillRect/>
-                    </a:stretch>
-                  </pic:blipFill>
-                  <pic:spPr>
-                    <a:xfrm>
-                      <a:off x="0" y="0"/>
-                      <a:ext cx="5257800" cy="3541083"/>
-                    </a:xfrm>
-                    <a:prstGeom prst="rect"/>
-                  </pic:spPr>
-                </pic:pic>
-              </a:graphicData>
-            </a:graphic>
-          </wp:inline>
-        </w:drawing>
-      </w:r>
-    </w:p>
-    <w:p>
-      <w:pPr>
-        <w:pStyle w:val="CaptionCustom"/>
-        <w:jc w:val="center"/>
-      </w:pPr>
-      <w:r>
-        <w:t>图 3  外接摄像头同时识别橡皮、锁和订书机的实测画面</w:t>
+        <w:t>本阶段由场景监视节点为彩色圆柱生成仿真检测消息。在 Gazebo 中加载机械臂、夹爪、桌面、三行两列取物网格、红蓝绿分类垫和俯视相机。世界坐标、投影像素、网格数组和航点姿态成组校准，取物格中心对应像素列 [212, 266, 320]、行 [186, 240, 294]。投影关系可写为：u=320+(y_w-0.18)×900，v=240-(x_w-0.30)×900。</w:t>
       </w:r>
     </w:p>
     <w:p>
@@ -4840,29 +4726,7 @@
         <w:pStyle w:val="Heading3"/>
       </w:pPr>
       <w:r>
-        <w:t>4.1.2 场景搭建与参数同步</w:t>
-      </w:r>
-    </w:p>
-    <w:p>
-      <w:pPr>
-        <w:spacing w:line="276" w:lineRule="auto" w:after="100"/>
-      </w:pPr>
-      <w:r>
-        <w:rPr>
-          <w:rFonts w:ascii="Times New Roman" w:hAnsi="Times New Roman" w:eastAsia="Times New Roman"/>
-          <w:b w:val="0"/>
-          <w:color w:val="232323"/>
-          <w:sz w:val="20"/>
-        </w:rPr>
-        <w:t>在 Gazebo 中加载机械臂、夹爪、桌面、三行两列取物网格、红蓝绿分类垫和俯视相机。世界坐标、投影像素、网格数组和航点姿态成组校准，取物格中心对应像素列 [212, 266, 320]、行 [186, 240, 294]。投影关系可写为：u=320+(y_w-0.18)×900，v=240-(x_w-0.30)×900。</w:t>
-      </w:r>
-    </w:p>
-    <w:p>
-      <w:pPr>
-        <w:pStyle w:val="Heading3"/>
-      </w:pPr>
-      <w:r>
-        <w:t>4.1.3 手动示教与单目标调试</w:t>
+        <w:t>4.1.2 手动示教与单目标调试</w:t>
       </w:r>
     </w:p>
     <w:p>
@@ -4930,7 +4794,7 @@
         <w:pStyle w:val="CaptionCustom"/>
       </w:pPr>
       <w:r>
-        <w:t>图 4  手动控制台、六关节调节与语义航点编辑</w:t>
+        <w:t>图 3  手动控制台、六关节调节与语义航点编辑</w:t>
       </w:r>
     </w:p>
     <w:p>
@@ -4938,7 +4802,7 @@
         <w:pStyle w:val="Heading3"/>
       </w:pPr>
       <w:r>
-        <w:t>4.1.4 自动播放与一键启动</w:t>
+        <w:t>4.1.3 自动播放与一键启动</w:t>
       </w:r>
     </w:p>
     <w:p>
@@ -5006,7 +4870,7 @@
         <w:pStyle w:val="CaptionCustom"/>
       </w:pPr>
       <w:r>
-        <w:t>图 5  六个目标子序列与 34 步自动播放节拍</w:t>
+        <w:t>图 4  六个目标子序列与 34 步自动播放节拍</w:t>
       </w:r>
     </w:p>
     <w:p>
@@ -5014,7 +4878,7 @@
         <w:pStyle w:val="Heading3"/>
       </w:pPr>
       <w:r>
-        <w:t>4.1.5 抓取、搬运与释放</w:t>
+        <w:t>4.1.4 抓取、搬运与释放</w:t>
       </w:r>
     </w:p>
     <w:p>
@@ -5082,7 +4946,7 @@
         <w:pStyle w:val="CaptionCustom"/>
       </w:pPr>
       <w:r>
-        <w:t>图 6  夹爪接近、闭合、距离校验、附着与抬升</w:t>
+        <w:t>图 5  夹爪接近、闭合、距离校验、附着与抬升</w:t>
       </w:r>
     </w:p>
     <w:p>
@@ -5136,7 +5000,7 @@
         <w:pStyle w:val="CaptionCustom"/>
       </w:pPr>
       <w:r>
-        <w:t>图 7  分类垫上方对齐、垂直释放与落点验收</w:t>
+        <w:t>图 6  分类垫上方对齐、垂直释放与落点验收</w:t>
       </w:r>
     </w:p>
     <w:p>
@@ -5144,7 +5008,7 @@
         <w:pStyle w:val="Heading3"/>
       </w:pPr>
       <w:r>
-        <w:t>4.1.6 仿真验收记录</w:t>
+        <w:t>4.1.5 仿真验收记录</w:t>
       </w:r>
     </w:p>
     <w:p>
@@ -5164,15 +5028,127 @@
     <w:p>
       <w:pPr>
         <w:pStyle w:val="Heading2"/>
+        <w:spacing w:line="276" w:lineRule="auto" w:after="100"/>
+      </w:pPr>
+      <w:r>
+        <w:t>4.2 三类检测模型与外接摄像头测试</w:t>
+      </w:r>
+    </w:p>
+    <w:p>
+      <w:pPr>
+        <w:spacing w:line="276" w:lineRule="auto" w:after="100"/>
       </w:pPr>
       <w:r>
         <w:rPr>
           <w:rFonts w:ascii="Times New Roman" w:hAnsi="Times New Roman" w:eastAsia="Times New Roman"/>
-          <w:b/>
-          <w:color w:val="1F4E79"/>
-          <w:sz w:val="23"/>
+          <w:b w:val="0"/>
+          <w:color w:val="232323"/>
+          <w:sz w:val="20"/>
         </w:rPr>
-        <w:t>4.2 阶段二 真机验证</w:t>
+        <w:t>感知模块采用 YOLOv8n 训练三类目标检测模型，识别对象为橡皮、锁和订书机，输出类别、检测框和置信度。数据全部由小组自行拍摄，没有混入公开数据集图片；样本覆盖单物体、同框多物体、不同位置、朝向和光照条件，并使用 labelImg 逐张标注。</w:t>
+      </w:r>
+    </w:p>
+    <w:p>
+      <w:pPr>
+        <w:spacing w:line="276" w:lineRule="auto" w:after="100"/>
+      </w:pPr>
+      <w:r>
+        <w:rPr>
+          <w:rFonts w:ascii="Times New Roman" w:hAnsi="Times New Roman" w:eastAsia="Times New Roman"/>
+          <w:b w:val="0"/>
+          <w:color w:val="232323"/>
+          <w:sz w:val="20"/>
+        </w:rPr>
+        <w:t>训练配置为输入分辨率 640、训练 60 轮、批大小 16，设备为 RTX 4070 Laptop GPU。训练阶段使用马赛克拼接、色调扰动、随机缩放和随机擦除，验证集从原始图片中独立划分且不做增强。最终权重大小为 6.25 MB（约 6.3 MB），参数量约 300 万。根据训练记录，整体及三个类别的 mAP50 和 mAP50-95 均为 0.995，精确率和召回率均为 1.0。</w:t>
+      </w:r>
+    </w:p>
+    <w:p>
+      <w:pPr>
+        <w:spacing w:line="276" w:lineRule="auto" w:after="100"/>
+      </w:pPr>
+      <w:r>
+        <w:rPr>
+          <w:rFonts w:ascii="Times New Roman" w:hAnsi="Times New Roman" w:eastAsia="Times New Roman"/>
+          <w:b w:val="0"/>
+          <w:color w:val="232323"/>
+          <w:sz w:val="20"/>
+        </w:rPr>
+        <w:t>迭代过程针对锁与订书机混淆、订书机个别角度与橡皮混淆、加入新数据后早期样本特征被稀释，以及验证集与外接摄像头场景存在差异等问题，分别采用类别配比调整、同框对比样本补拍、分类损失强化、早期样本加权和实拍薄弱场景补拍。整体 mAP50-95 从 0.938 提升到 0.995。示例外接摄像头画面中，三类目标的置信度为 0.89–0.94，画面显示 31.2 FPS；1.1 ms 是单张模型推理时间，31.2 FPS 是包含摄像头读取和显示的端到端帧率。</w:t>
+      </w:r>
+    </w:p>
+    <w:p>
+      <w:pPr>
+        <w:spacing w:line="276" w:lineRule="auto" w:after="100"/>
+      </w:pPr>
+      <w:r>
+        <w:rPr>
+          <w:rFonts w:ascii="Times New Roman" w:hAnsi="Times New Roman" w:eastAsia="SimSun"/>
+          <w:sz w:val="20"/>
+        </w:rPr>
+        <w:t>外接摄像头测试验证了橡皮、锁和订书机的检测效果。后续用该权重控制真机分拣时，需要让物体类别与料盒配置一致，并标定摄像头像素到桌面网格的对应关系。模型权重保存在 models/，与实测画面一同归档。</w:t>
+      </w:r>
+    </w:p>
+    <w:p>
+      <w:pPr>
+        <w:spacing w:line="276" w:lineRule="auto" w:after="100"/>
+        <w:jc w:val="center"/>
+      </w:pPr>
+      <w:r>
+        <w:rPr>
+          <w:rFonts w:ascii="Times New Roman" w:hAnsi="Times New Roman" w:eastAsia="Times New Roman"/>
+          <w:b w:val="0"/>
+          <w:color w:val="232323"/>
+          <w:sz w:val="20"/>
+        </w:rPr>
+        <w:drawing>
+          <wp:inline xmlns:a="http://schemas.openxmlformats.org/drawingml/2006/main" xmlns:pic="http://schemas.openxmlformats.org/drawingml/2006/picture">
+            <wp:extent cx="5257800" cy="3541083"/>
+            <wp:docPr id="10" name="Picture 10"/>
+            <wp:cNvGraphicFramePr>
+              <a:graphicFrameLocks noChangeAspect="1"/>
+            </wp:cNvGraphicFramePr>
+            <a:graphic>
+              <a:graphicData uri="http://schemas.openxmlformats.org/drawingml/2006/picture">
+                <pic:pic>
+                  <pic:nvPicPr>
+                    <pic:cNvPr id="0" name="b028d3f11213205b74b2a37d8148411b.jpg"/>
+                    <pic:cNvPicPr/>
+                  </pic:nvPicPr>
+                  <pic:blipFill>
+                    <a:blip r:embed="rId20"/>
+                    <a:stretch>
+                      <a:fillRect/>
+                    </a:stretch>
+                  </pic:blipFill>
+                  <pic:spPr>
+                    <a:xfrm>
+                      <a:off x="0" y="0"/>
+                      <a:ext cx="5257800" cy="3541083"/>
+                    </a:xfrm>
+                    <a:prstGeom prst="rect"/>
+                  </pic:spPr>
+                </pic:pic>
+              </a:graphicData>
+            </a:graphic>
+          </wp:inline>
+        </w:drawing>
+      </w:r>
+    </w:p>
+    <w:p>
+      <w:pPr>
+        <w:pStyle w:val="CaptionCustom"/>
+        <w:jc w:val="center"/>
+      </w:pPr>
+      <w:r>
+        <w:t>图 7  外接摄像头同时识别橡皮、锁和订书机的实测画面</w:t>
+      </w:r>
+    </w:p>
+    <w:p>
+      <w:pPr>
+        <w:pStyle w:val="Heading2"/>
+      </w:pPr>
+      <w:r>
+        <w:t>4.3 真机集成计划</w:t>
       </w:r>
     </w:p>
     <w:p>
@@ -5180,13 +5156,7 @@
         <w:pStyle w:val="Heading3"/>
       </w:pPr>
       <w:r>
-        <w:rPr>
-          <w:rFonts w:ascii="Times New Roman" w:hAnsi="Times New Roman" w:eastAsia="Times New Roman"/>
-          <w:b/>
-          <w:color w:val="1F4E79"/>
-          <w:sz w:val="21"/>
-        </w:rPr>
-        <w:t>4.2.1 硬件部署与标定</w:t>
+        <w:t>4.3.1 硬件部署与标定</w:t>
       </w:r>
     </w:p>
     <w:p>
@@ -5208,13 +5178,7 @@
         <w:pStyle w:val="Heading3"/>
       </w:pPr>
       <w:r>
-        <w:rPr>
-          <w:rFonts w:ascii="Times New Roman" w:hAnsi="Times New Roman" w:eastAsia="Times New Roman"/>
-          <w:b/>
-          <w:color w:val="1F4E79"/>
-          <w:sz w:val="21"/>
-        </w:rPr>
-        <w:t>4.2.2 识别节点与任务接口</w:t>
+        <w:t>4.3.2 识别节点与任务接口</w:t>
       </w:r>
     </w:p>
     <w:p>
@@ -5223,12 +5187,10 @@
       </w:pPr>
       <w:r>
         <w:rPr>
-          <w:rFonts w:ascii="Times New Roman" w:hAnsi="Times New Roman" w:eastAsia="Times New Roman"/>
-          <w:b w:val="0"/>
-          <w:color w:val="232323"/>
+          <w:rFonts w:ascii="Times New Roman" w:hAnsi="Times New Roman" w:eastAsia="SimSun"/>
           <w:sz w:val="20"/>
         </w:rPr>
-        <w:t>YOLOv8 节点输出类别、置信度和检测框，消息字段与仿真 Detection2DArray 保持一致。任务节点继续完成置信度筛选、网格映射、类别选择和异常分支，执行器将仿真控制调用替换为 mechArm 真机控制调用。</w:t>
+        <w:t>真机集成时，检测节点需将类别、检测框和置信度发布为 Detection2DArray；实际取物类别与分类垫须对应训练权重的类别表，并标定摄像头像素到取物网格的映射。完成接口联调后，再从单目标逐步扩展到六目标。</w:t>
       </w:r>
     </w:p>
     <w:p>
@@ -5236,13 +5198,7 @@
         <w:pStyle w:val="Heading3"/>
       </w:pPr>
       <w:r>
-        <w:rPr>
-          <w:rFonts w:ascii="Times New Roman" w:hAnsi="Times New Roman" w:eastAsia="Times New Roman"/>
-          <w:b/>
-          <w:color w:val="1F4E79"/>
-          <w:sz w:val="21"/>
-        </w:rPr>
-        <w:t>4.2.3 单目标到六目标的验证顺序</w:t>
+        <w:t>4.3.3 单目标到六目标的验证顺序</w:t>
       </w:r>
     </w:p>
     <w:p>
@@ -5264,13 +5220,7 @@
         <w:pStyle w:val="Heading3"/>
       </w:pPr>
       <w:r>
-        <w:rPr>
-          <w:rFonts w:ascii="Times New Roman" w:hAnsi="Times New Roman" w:eastAsia="Times New Roman"/>
-          <w:b/>
-          <w:color w:val="1F4E79"/>
-          <w:sz w:val="21"/>
-        </w:rPr>
-        <w:t>4.2.4 真机验收检查表</w:t>
+        <w:t>4.3.4 真机验收检查表</w:t>
       </w:r>
     </w:p>
     <w:tbl>
@@ -7331,21 +7281,7 @@
         <w:pStyle w:val="Heading2"/>
       </w:pPr>
       <w:r>
-        <w:t>6.1 视觉检测与接口验证</w:t>
-      </w:r>
-    </w:p>
-    <w:p>
-      <w:pPr/>
-      <w:r>
-        <w:t>独立原图验证集上的整体结果和三个类别均达到 mAP50=0.995、mAP50-95=0.995，精确率和召回率均为 1.0。图 3 的外接摄像头画面同时显示三类目标，置信度为 0.89–0.94，画面显示 31.2 FPS。该结果说明检测输出能够进入 Detection2DArray 接口；视觉检测结果与 Gazebo 的确定性监视结果分开记录，不将其等同于真机抓取成功率。</w:t>
-      </w:r>
-    </w:p>
-    <w:p>
-      <w:pPr>
-        <w:pStyle w:val="Heading2"/>
-      </w:pPr>
-      <w:r>
-        <w:t>6.2 红蓝两类六物体定量基线</w:t>
+        <w:t>6.1 红蓝两类六物体定量基线</w:t>
       </w:r>
     </w:p>
     <w:p>
@@ -8972,7 +8908,7 @@
         <w:pStyle w:val="Heading2"/>
       </w:pPr>
       <w:r>
-        <w:t>6.3 三分类扩展</w:t>
+        <w:t>6.2 三分类扩展</w:t>
       </w:r>
     </w:p>
     <w:p>
@@ -8987,6 +8923,24 @@
           <w:sz w:val="20"/>
         </w:rPr>
         <w:t>扩展场景加入两个绿色圆柱和绿色分类垫，完成三分类场景对齐、类别映射、航点命名和 34 步自动播放组织。该阶段证明新增类别沿用同一任务接口，过程证据包括俯视场景、控制台、航点列表和自动播放画面；对象级成功率以独立三分类 CSV 为准进行统计。</w:t>
+      </w:r>
+    </w:p>
+    <w:p>
+      <w:pPr>
+        <w:pStyle w:val="Heading2"/>
+      </w:pPr>
+      <w:r>
+        <w:t>6.3 三类检测模型评估</w:t>
+      </w:r>
+    </w:p>
+    <w:p>
+      <w:pPr/>
+      <w:r>
+        <w:rPr>
+          <w:rFonts w:ascii="Times New Roman" w:hAnsi="Times New Roman" w:eastAsia="SimSun"/>
+          <w:sz w:val="20"/>
+        </w:rPr>
+        <w:t>依据提供的独立原图验证记录，整体和三个类别的 mAP50、mAP50-95 均为 0.995，精确率和召回率均为 1.0。图 7 的外接摄像头画面显示橡皮、锁和订书机，检测置信度为 0.89–0.94，画面显示 31.2 FPS。这组证据对应上述物体的视觉检测，不代表该模型已经发布 ROS 消息或完成机械臂分拣。</w:t>
       </w:r>
     </w:p>
     <w:p>
@@ -9085,12 +9039,10 @@
       </w:pPr>
       <w:r>
         <w:rPr>
-          <w:rFonts w:ascii="Times New Roman" w:hAnsi="Times New Roman" w:eastAsia="Times New Roman"/>
-          <w:b w:val="0"/>
-          <w:color w:val="232323"/>
+          <w:rFonts w:ascii="Times New Roman" w:hAnsi="Times New Roman" w:eastAsia="SimSun"/>
           <w:sz w:val="20"/>
         </w:rPr>
-        <w:t>小组采用“感知接口、任务决策、机械臂执行、系统联调”分工，所有成员在统一 Launch、统一消息字段和统一对象级结果表下完成联调。</w:t>
+        <w:t>小组分工包括摄像头检测模型训练、Gazebo 场景与仿真检测、任务决策、机械臂执行及系统测试。报告分别给出摄像头模型和 Gazebo 分拣的证据，并将两者的联调列入真机集成计划。</w:t>
       </w:r>
     </w:p>
     <w:tbl>
@@ -9624,7 +9576,7 @@
                 <w:color w:val="232323"/>
                 <w:sz w:val="17"/>
               </w:rPr>
-              <w:t>小组协作</w:t>
+              <w:t>视觉模块</w:t>
             </w:r>
           </w:p>
         </w:tc>
@@ -9725,12 +9677,10 @@
       </w:pPr>
       <w:r>
         <w:rPr>
-          <w:rFonts w:ascii="Times New Roman" w:hAnsi="Times New Roman" w:eastAsia="Times New Roman"/>
-          <w:b w:val="0"/>
-          <w:color w:val="232323"/>
+          <w:rFonts w:ascii="Times New Roman" w:hAnsi="Times New Roman" w:eastAsia="SimSun"/>
           <w:sz w:val="20"/>
         </w:rPr>
-        <w:t>实验三将实验二的定点搬运扩展为可识别、可定位、可分类、可执行、可记录的桌面整理任务。系统完成了 ROS 2 图像与检测接口、固定网格定位、类别到分类垫映射、抓取执行状态机、异常分支和对象级日志的集成；红蓝两类六物体仿真基线达到 6/6，红蓝绿三分类场景和 34 步自动演示完成。</w:t>
+        <w:t>实验三在定点搬运基础上，分别完成 Gazebo 桌面分拣任务和外接摄像头检测模型测试。Gazebo 任务使用仿真 Detection2DArray 消息、固定网格定位、类别到分类区的映射、执行状态和对象级日志，红蓝六目标基线为 6/6。摄像头模型识别橡皮、锁和订书机；摄像头驱动的机械臂分拣仍需集成后测量。</w:t>
       </w:r>
     </w:p>
     <w:p>

</xml_diff>

<commit_message>
report: redesign covers and compact GitHub evidence pages
</commit_message>
<xml_diff>
--- a/report/experiment3_lab_report_group17.docx
+++ b/report/experiment3_lab_report_group17.docx
@@ -4,86 +4,193 @@
   <w:body>
     <w:p>
       <w:pPr>
-        <w:spacing w:after="100" w:line="276" w:lineRule="auto"/>
-        <w:pBdr>
-          <w:bottom w:val="single" w:sz="18" w:space="1" w:color="0B7A75"/>
-        </w:pBdr>
+        <w:spacing w:before="160" w:after="340" w:line="252" w:lineRule="auto"/>
+        <w:jc w:val="left"/>
       </w:pPr>
+      <w:r>
+        <w:rPr>
+          <w:rFonts w:ascii="Times New Roman" w:hAnsi="Times New Roman" w:eastAsia="Microsoft YaHei"/>
+          <w:b/>
+          <w:color w:val="107B7E"/>
+          <w:sz w:val="19"/>
+        </w:rPr>
+        <w:t>机器人学集成小组项目Ⅰ  /  第 17 组</w:t>
+      </w:r>
+    </w:p>
+    <w:p>
+      <w:pPr>
+        <w:spacing w:before="0" w:after="160" w:line="252" w:lineRule="auto"/>
+        <w:jc w:val="left"/>
+      </w:pPr>
+      <w:r>
+        <w:rPr>
+          <w:rFonts w:ascii="Times New Roman" w:hAnsi="Times New Roman" w:eastAsia="Microsoft YaHei"/>
+          <w:b/>
+          <w:color w:val="107B7E"/>
+          <w:sz w:val="22"/>
+        </w:rPr>
+        <w:t>实验三</w:t>
+      </w:r>
+    </w:p>
+    <w:p>
+      <w:pPr>
+        <w:pStyle w:val="Title"/>
+        <w:spacing w:before="0" w:after="180" w:line="252" w:lineRule="auto"/>
+        <w:jc w:val="left"/>
+      </w:pPr>
+      <w:r>
+        <w:rPr>
+          <w:rFonts w:ascii="Microsoft YaHei" w:hAnsi="Microsoft YaHei" w:eastAsia="Microsoft YaHei"/>
+          <w:b/>
+          <w:color w:val="1B3E5B"/>
+          <w:sz w:val="56"/>
+        </w:rPr>
+        <w:t>桌面物体自动分类整理</w:t>
+      </w:r>
+    </w:p>
+    <w:p>
+      <w:pPr>
+        <w:spacing w:before="0" w:after="380" w:line="252" w:lineRule="auto"/>
+        <w:jc w:val="left"/>
+      </w:pPr>
+      <w:r>
+        <w:rPr>
+          <w:rFonts w:ascii="Times New Roman" w:hAnsi="Times New Roman" w:eastAsia="Microsoft YaHei"/>
+          <w:b/>
+          <w:color w:val="4B5560"/>
+          <w:sz w:val="22"/>
+        </w:rPr>
+        <w:t>小组实验报告</w:t>
+      </w:r>
     </w:p>
     <w:tbl>
       <w:tblPr>
         <w:tblW w:type="auto" w:w="0"/>
-        <w:jc w:val="center"/>
         <w:tblLayout w:type="fixed"/>
         <w:tblLook w:firstColumn="1" w:firstRow="1" w:lastColumn="0" w:lastRow="0" w:noHBand="0" w:noVBand="1" w:val="04A0"/>
+        <w:tblBorders>
+          <w:top w:val="nil"/>
+          <w:left w:val="nil"/>
+          <w:bottom w:val="nil"/>
+          <w:right w:val="nil"/>
+          <w:insideH w:val="nil"/>
+          <w:insideV w:val="nil"/>
+        </w:tblBorders>
       </w:tblPr>
       <w:tblGrid>
-        <w:gridCol w:w="4734"/>
-        <w:gridCol w:w="4734"/>
+        <w:gridCol w:w="3156"/>
+        <w:gridCol w:w="3156"/>
+        <w:gridCol w:w="3156"/>
       </w:tblGrid>
       <w:tr>
-        <w:trPr>
-          <w:tblHeader w:val="true"/>
-        </w:trPr>
         <w:tc>
           <w:tcPr>
-            <w:tcW w:type="dxa" w:w="4649"/>
-            <w:tcMar>
-              <w:top w:w="30" w:type="dxa"/>
-              <w:start w:w="0" w:type="dxa"/>
-              <w:bottom w:w="30" w:type="dxa"/>
-              <w:end w:w="0" w:type="dxa"/>
-            </w:tcMar>
-            <w:tcBorders>
-              <w:top w:val="nil"/>
-              <w:left w:val="nil"/>
-              <w:bottom w:val="nil"/>
-              <w:right w:val="nil"/>
-            </w:tcBorders>
+            <w:tcW w:type="dxa" w:w="2995"/>
+            <w:vAlign w:val="center"/>
+            <w:shd w:fill="EDF5F8"/>
           </w:tcPr>
           <w:p>
             <w:pPr>
-              <w:jc w:val="left"/>
+              <w:spacing w:before="100" w:after="20"/>
+              <w:jc w:val="center"/>
             </w:pPr>
             <w:r>
               <w:rPr>
-                <w:rFonts w:ascii="Times New Roman" w:hAnsi="Times New Roman" w:eastAsia="Times New Roman"/>
+                <w:rFonts w:ascii="Times New Roman" w:hAnsi="Times New Roman" w:eastAsia="Microsoft YaHei"/>
+                <w:b/>
+                <w:color w:val="1B3E5B"/>
+                <w:sz w:val="18"/>
+              </w:rPr>
+              <w:t>Gazebo 分拣</w:t>
+            </w:r>
+          </w:p>
+          <w:p>
+            <w:pPr>
+              <w:spacing w:after="100"/>
+              <w:jc w:val="center"/>
+            </w:pPr>
+            <w:r>
+              <w:rPr>
+                <w:rFonts w:ascii="Times New Roman" w:hAnsi="Times New Roman" w:eastAsia="Microsoft YaHei"/>
                 <w:b w:val="0"/>
-                <w:color w:val="232323"/>
-                <w:sz w:val="17"/>
+                <w:color w:val="4B5560"/>
+                <w:sz w:val="16"/>
               </w:rPr>
-              <w:t>ROBOTICS INTEGRATION GROUP PROJECT</w:t>
+              <w:t>红蓝六目标  6/6</w:t>
             </w:r>
           </w:p>
         </w:tc>
         <w:tc>
           <w:tcPr>
-            <w:tcW w:type="dxa" w:w="4649"/>
-            <w:tcMar>
-              <w:top w:w="30" w:type="dxa"/>
-              <w:start w:w="0" w:type="dxa"/>
-              <w:bottom w:w="30" w:type="dxa"/>
-              <w:end w:w="0" w:type="dxa"/>
-            </w:tcMar>
-            <w:tcBorders>
-              <w:top w:val="nil"/>
-              <w:left w:val="nil"/>
-              <w:bottom w:val="nil"/>
-              <w:right w:val="nil"/>
-            </w:tcBorders>
+            <w:tcW w:type="dxa" w:w="2995"/>
+            <w:vAlign w:val="center"/>
+            <w:shd w:fill="EDF5F8"/>
           </w:tcPr>
           <w:p>
             <w:pPr>
-              <w:jc w:val="right"/>
+              <w:spacing w:before="100" w:after="20"/>
+              <w:jc w:val="center"/>
             </w:pPr>
             <w:r>
               <w:rPr>
-                <w:rFonts w:ascii="Times New Roman" w:hAnsi="Times New Roman" w:eastAsia="Times New Roman"/>
+                <w:rFonts w:ascii="Times New Roman" w:hAnsi="Times New Roman" w:eastAsia="Microsoft YaHei"/>
+                <w:b/>
+                <w:color w:val="1B3E5B"/>
+                <w:sz w:val="18"/>
+              </w:rPr>
+              <w:t>摄像头检测</w:t>
+            </w:r>
+          </w:p>
+          <w:p>
+            <w:pPr>
+              <w:spacing w:after="100"/>
+              <w:jc w:val="center"/>
+            </w:pPr>
+            <w:r>
+              <w:rPr>
+                <w:rFonts w:ascii="Times New Roman" w:hAnsi="Times New Roman" w:eastAsia="Microsoft YaHei"/>
                 <w:b w:val="0"/>
-                <w:color w:val="232323"/>
-                <w:sz w:val="17"/>
+                <w:color w:val="4B5560"/>
+                <w:sz w:val="16"/>
               </w:rPr>
-              <w:t>GROUP 17</w:t>
+              <w:t>橡皮  ·  锁  ·  订书机</w:t>
+            </w:r>
+          </w:p>
+        </w:tc>
+        <w:tc>
+          <w:tcPr>
+            <w:tcW w:type="dxa" w:w="2995"/>
+            <w:vAlign w:val="center"/>
+            <w:shd w:fill="EDF5F8"/>
+          </w:tcPr>
+          <w:p>
+            <w:pPr>
+              <w:spacing w:before="100" w:after="20"/>
+              <w:jc w:val="center"/>
+            </w:pPr>
+            <w:r>
+              <w:rPr>
+                <w:rFonts w:ascii="Times New Roman" w:hAnsi="Times New Roman" w:eastAsia="Microsoft YaHei"/>
+                <w:b/>
+                <w:color w:val="1B3E5B"/>
+                <w:sz w:val="18"/>
+              </w:rPr>
+              <w:t>下一阶段</w:t>
+            </w:r>
+          </w:p>
+          <w:p>
+            <w:pPr>
+              <w:spacing w:after="100"/>
+              <w:jc w:val="center"/>
+            </w:pPr>
+            <w:r>
+              <w:rPr>
+                <w:rFonts w:ascii="Times New Roman" w:hAnsi="Times New Roman" w:eastAsia="Microsoft YaHei"/>
+                <w:b w:val="0"/>
+                <w:color w:val="4B5560"/>
+                <w:sz w:val="16"/>
+              </w:rPr>
+              <w:t>真机集成验证</w:t>
             </w:r>
           </w:p>
         </w:tc>
@@ -91,81 +198,14 @@
     </w:tbl>
     <w:p>
       <w:pPr>
-        <w:spacing w:before="680" w:after="100" w:line="276" w:lineRule="auto"/>
+        <w:spacing w:before="360" w:after="40"/>
         <w:jc w:val="center"/>
       </w:pPr>
       <w:r>
-        <w:rPr>
-          <w:rFonts w:ascii="Times New Roman" w:hAnsi="Times New Roman" w:eastAsia="Times New Roman"/>
-          <w:b w:val="0"/>
-          <w:color w:val="232323"/>
-          <w:sz w:val="20"/>
-        </w:rPr>
-        <w:t>EXPERIMENT 3</w:t>
-      </w:r>
-    </w:p>
-    <w:p>
-      <w:pPr>
-        <w:pStyle w:val="Title"/>
-        <w:spacing w:before="40" w:after="60"/>
-        <w:jc w:val="center"/>
-      </w:pPr>
-      <w:r>
-        <w:rPr>
-          <w:rFonts w:ascii="Times New Roman" w:hAnsi="Times New Roman" w:eastAsia="Times New Roman"/>
-          <w:b w:val="0"/>
-          <w:color w:val="232323"/>
-          <w:sz w:val="20"/>
-        </w:rPr>
-        <w:t>桌面物体自动分类整理</w:t>
-      </w:r>
-    </w:p>
-    <w:p>
-      <w:pPr>
-        <w:spacing w:after="100" w:line="276" w:lineRule="auto"/>
-        <w:jc w:val="center"/>
-      </w:pPr>
-      <w:r>
-        <w:rPr>
-          <w:rFonts w:ascii="Times New Roman" w:hAnsi="Times New Roman" w:eastAsia="Times New Roman"/>
-          <w:b w:val="0"/>
-          <w:color w:val="232323"/>
-          <w:sz w:val="20"/>
-        </w:rPr>
-        <w:t>Experiment 3  ·  laboratory report</w:t>
-      </w:r>
-    </w:p>
-    <w:p>
-      <w:pPr>
-        <w:spacing w:after="100" w:line="276" w:lineRule="auto"/>
-        <w:jc w:val="center"/>
-      </w:pPr>
-      <w:r>
-        <w:rPr>
-          <w:rFonts w:ascii="Times New Roman" w:hAnsi="Times New Roman" w:eastAsia="Times New Roman"/>
-          <w:b w:val="0"/>
-          <w:color w:val="232323"/>
-          <w:sz w:val="20"/>
-        </w:rPr>
-        <w:t>Laboratory report</w:t>
-      </w:r>
-    </w:p>
-    <w:p>
-      <w:pPr>
-        <w:spacing w:after="100" w:line="276" w:lineRule="auto"/>
-        <w:jc w:val="center"/>
-      </w:pPr>
-      <w:r>
-        <w:rPr>
-          <w:rFonts w:ascii="Times New Roman" w:hAnsi="Times New Roman" w:eastAsia="Times New Roman"/>
-          <w:b w:val="0"/>
-          <w:color w:val="232323"/>
-          <w:sz w:val="20"/>
-        </w:rPr>
         <w:drawing>
           <wp:inline xmlns:a="http://schemas.openxmlformats.org/drawingml/2006/main" xmlns:pic="http://schemas.openxmlformats.org/drawingml/2006/picture">
-            <wp:extent cx="4968000" cy="2794500"/>
-            <wp:docPr id="1" name="Picture 1" descr="实验三_小组实验报告_17组_完整重写版 插图 1" title="实验三_小组实验报告_17组_完整重写版 插图 1"/>
+            <wp:extent cx="5166360" cy="2906078"/>
+            <wp:docPr id="11" name="Picture 11"/>
             <wp:cNvGraphicFramePr>
               <a:graphicFrameLocks noChangeAspect="1"/>
             </wp:cNvGraphicFramePr>
@@ -173,7 +213,7 @@
               <a:graphicData uri="http://schemas.openxmlformats.org/drawingml/2006/picture">
                 <pic:pic>
                   <pic:nvPicPr>
-                    <pic:cNvPr id="0" name="image6.png"/>
+                    <pic:cNvPr id="0" name="image.png"/>
                     <pic:cNvPicPr/>
                   </pic:nvPicPr>
                   <pic:blipFill>
@@ -185,7 +225,7 @@
                   <pic:spPr>
                     <a:xfrm>
                       <a:off x="0" y="0"/>
-                      <a:ext cx="4968000" cy="2794500"/>
+                      <a:ext cx="5166360" cy="2906078"/>
                     </a:xfrm>
                     <a:prstGeom prst="rect"/>
                   </pic:spPr>
@@ -196,48 +236,54 @@
         </w:drawing>
       </w:r>
     </w:p>
+    <w:p>
+      <w:pPr>
+        <w:spacing w:before="0" w:after="340" w:line="252" w:lineRule="auto"/>
+        <w:jc w:val="center"/>
+      </w:pPr>
+      <w:r>
+        <w:rPr>
+          <w:rFonts w:ascii="Times New Roman" w:hAnsi="Times New Roman" w:eastAsia="Microsoft YaHei"/>
+          <w:b w:val="0"/>
+          <w:color w:val="4B5560"/>
+          <w:sz w:val="16"/>
+        </w:rPr>
+        <w:t>机械臂、六个取物格与三个分类区域的 Gazebo 场景</w:t>
+      </w:r>
+    </w:p>
     <w:tbl>
       <w:tblPr>
         <w:tblW w:type="auto" w:w="0"/>
-        <w:jc w:val="center"/>
         <w:tblLayout w:type="fixed"/>
         <w:tblLook w:firstColumn="1" w:firstRow="1" w:lastColumn="0" w:lastRow="0" w:noHBand="0" w:noVBand="1" w:val="04A0"/>
+        <w:tblBorders>
+          <w:top w:val="nil"/>
+          <w:left w:val="nil"/>
+          <w:bottom w:val="nil"/>
+          <w:right w:val="nil"/>
+          <w:insideH w:val="nil"/>
+          <w:insideV w:val="nil"/>
+        </w:tblBorders>
       </w:tblPr>
       <w:tblGrid>
         <w:gridCol w:w="4734"/>
         <w:gridCol w:w="4734"/>
       </w:tblGrid>
       <w:tr>
-        <w:trPr>
-          <w:tblHeader w:val="true"/>
-        </w:trPr>
         <w:tc>
           <w:tcPr>
-            <w:tcW w:type="dxa" w:w="1701"/>
-            <w:tcMar>
-              <w:top w:w="90" w:type="dxa"/>
-              <w:start w:w="150" w:type="dxa"/>
-              <w:bottom w:w="90" w:type="dxa"/>
-              <w:end w:w="150" w:type="dxa"/>
-            </w:tcMar>
-            <w:tcBorders>
-              <w:top w:val="single" w:sz="4" w:color="C9D4DF"/>
-              <w:left w:val="single" w:sz="4" w:color="C9D4DF"/>
-              <w:bottom w:val="single" w:sz="4" w:color="C9D4DF"/>
-              <w:right w:val="single" w:sz="4" w:color="C9D4DF"/>
-            </w:tcBorders>
+            <w:tcW w:type="dxa" w:w="1440"/>
             <w:vAlign w:val="center"/>
-            <w:shd w:fill="EAF2F8"/>
           </w:tcPr>
           <w:p>
             <w:pPr>
-              <w:jc w:val="left"/>
+              <w:spacing w:before="80" w:after="80"/>
             </w:pPr>
             <w:r>
               <w:rPr>
-                <w:rFonts w:ascii="Times New Roman" w:hAnsi="Times New Roman" w:eastAsia="Times New Roman"/>
-                <w:b w:val="0"/>
-                <w:color w:val="1F4E79"/>
+                <w:rFonts w:ascii="Times New Roman" w:hAnsi="Times New Roman" w:eastAsia="Microsoft YaHei"/>
+                <w:b/>
+                <w:color w:val="107B7E"/>
                 <w:sz w:val="18"/>
               </w:rPr>
               <w:t>课程</w:t>
@@ -246,30 +292,18 @@
         </w:tc>
         <w:tc>
           <w:tcPr>
-            <w:tcW w:type="dxa" w:w="6350"/>
-            <w:tcMar>
-              <w:top w:w="90" w:type="dxa"/>
-              <w:start w:w="150" w:type="dxa"/>
-              <w:bottom w:w="90" w:type="dxa"/>
-              <w:end w:w="150" w:type="dxa"/>
-            </w:tcMar>
-            <w:tcBorders>
-              <w:top w:val="single" w:sz="4" w:color="C9D4DF"/>
-              <w:left w:val="single" w:sz="4" w:color="C9D4DF"/>
-              <w:bottom w:val="single" w:sz="4" w:color="C9D4DF"/>
-              <w:right w:val="single" w:sz="4" w:color="C9D4DF"/>
-            </w:tcBorders>
+            <w:tcW w:type="dxa" w:w="7560"/>
             <w:vAlign w:val="center"/>
           </w:tcPr>
           <w:p>
             <w:pPr>
-              <w:jc w:val="left"/>
+              <w:spacing w:before="80" w:after="80"/>
             </w:pPr>
             <w:r>
               <w:rPr>
-                <w:rFonts w:ascii="Times New Roman" w:hAnsi="Times New Roman" w:eastAsia="Times New Roman"/>
-                <w:b/>
-                <w:color w:val="232323"/>
+                <w:rFonts w:ascii="Times New Roman" w:hAnsi="Times New Roman" w:eastAsia="Microsoft YaHei"/>
+                <w:b w:val="0"/>
+                <w:color w:val="1B3E5B"/>
                 <w:sz w:val="18"/>
               </w:rPr>
               <w:t>机器人学集成小组项目Ⅰ</w:t>
@@ -280,31 +314,18 @@
       <w:tr>
         <w:tc>
           <w:tcPr>
-            <w:tcW w:type="dxa" w:w="1701"/>
-            <w:tcMar>
-              <w:top w:w="90" w:type="dxa"/>
-              <w:start w:w="150" w:type="dxa"/>
-              <w:bottom w:w="90" w:type="dxa"/>
-              <w:end w:w="150" w:type="dxa"/>
-            </w:tcMar>
-            <w:tcBorders>
-              <w:top w:val="single" w:sz="4" w:color="C9D4DF"/>
-              <w:left w:val="single" w:sz="4" w:color="C9D4DF"/>
-              <w:bottom w:val="single" w:sz="4" w:color="C9D4DF"/>
-              <w:right w:val="single" w:sz="4" w:color="C9D4DF"/>
-            </w:tcBorders>
+            <w:tcW w:type="dxa" w:w="1440"/>
             <w:vAlign w:val="center"/>
-            <w:shd w:fill="EAF2F8"/>
           </w:tcPr>
           <w:p>
             <w:pPr>
-              <w:jc w:val="left"/>
+              <w:spacing w:before="80" w:after="80"/>
             </w:pPr>
             <w:r>
               <w:rPr>
-                <w:rFonts w:ascii="Times New Roman" w:hAnsi="Times New Roman" w:eastAsia="Times New Roman"/>
-                <w:b w:val="0"/>
-                <w:color w:val="1F4E79"/>
+                <w:rFonts w:ascii="Times New Roman" w:hAnsi="Times New Roman" w:eastAsia="Microsoft YaHei"/>
+                <w:b/>
+                <w:color w:val="107B7E"/>
                 <w:sz w:val="18"/>
               </w:rPr>
               <w:t>小组</w:t>
@@ -313,100 +334,21 @@
         </w:tc>
         <w:tc>
           <w:tcPr>
-            <w:tcW w:type="dxa" w:w="6350"/>
-            <w:tcMar>
-              <w:top w:w="90" w:type="dxa"/>
-              <w:start w:w="150" w:type="dxa"/>
-              <w:bottom w:w="90" w:type="dxa"/>
-              <w:end w:w="150" w:type="dxa"/>
-            </w:tcMar>
-            <w:tcBorders>
-              <w:top w:val="single" w:sz="4" w:color="C9D4DF"/>
-              <w:left w:val="single" w:sz="4" w:color="C9D4DF"/>
-              <w:bottom w:val="single" w:sz="4" w:color="C9D4DF"/>
-              <w:right w:val="single" w:sz="4" w:color="C9D4DF"/>
-            </w:tcBorders>
+            <w:tcW w:type="dxa" w:w="7560"/>
             <w:vAlign w:val="center"/>
           </w:tcPr>
           <w:p>
             <w:pPr>
-              <w:jc w:val="left"/>
+              <w:spacing w:before="80" w:after="80"/>
             </w:pPr>
             <w:r>
               <w:rPr>
-                <w:rFonts w:ascii="Times New Roman" w:hAnsi="Times New Roman" w:eastAsia="Times New Roman"/>
+                <w:rFonts w:ascii="Times New Roman" w:hAnsi="Times New Roman" w:eastAsia="Microsoft YaHei"/>
                 <w:b w:val="0"/>
-                <w:color w:val="232323"/>
+                <w:color w:val="1B3E5B"/>
                 <w:sz w:val="18"/>
               </w:rPr>
-              <w:t>第 17 组：杨牧青、兰松宇、张凯睿、赵航</w:t>
-            </w:r>
-          </w:p>
-        </w:tc>
-      </w:tr>
-      <w:tr>
-        <w:tc>
-          <w:tcPr>
-            <w:tcW w:type="dxa" w:w="1701"/>
-            <w:tcMar>
-              <w:top w:w="90" w:type="dxa"/>
-              <w:start w:w="150" w:type="dxa"/>
-              <w:bottom w:w="90" w:type="dxa"/>
-              <w:end w:w="150" w:type="dxa"/>
-            </w:tcMar>
-            <w:tcBorders>
-              <w:top w:val="single" w:sz="4" w:color="C9D4DF"/>
-              <w:left w:val="single" w:sz="4" w:color="C9D4DF"/>
-              <w:bottom w:val="single" w:sz="4" w:color="C9D4DF"/>
-              <w:right w:val="single" w:sz="4" w:color="C9D4DF"/>
-            </w:tcBorders>
-            <w:vAlign w:val="center"/>
-            <w:shd w:fill="EAF2F8"/>
-          </w:tcPr>
-          <w:p>
-            <w:pPr>
-              <w:jc w:val="left"/>
-            </w:pPr>
-            <w:r>
-              <w:rPr>
-                <w:rFonts w:ascii="Times New Roman" w:hAnsi="Times New Roman" w:eastAsia="Times New Roman"/>
-                <w:b w:val="0"/>
-                <w:color w:val="1F4E79"/>
-                <w:sz w:val="18"/>
-              </w:rPr>
-              <w:t>报告主题</w:t>
-            </w:r>
-          </w:p>
-        </w:tc>
-        <w:tc>
-          <w:tcPr>
-            <w:tcW w:type="dxa" w:w="6350"/>
-            <w:tcMar>
-              <w:top w:w="90" w:type="dxa"/>
-              <w:start w:w="150" w:type="dxa"/>
-              <w:bottom w:w="90" w:type="dxa"/>
-              <w:end w:w="150" w:type="dxa"/>
-            </w:tcMar>
-            <w:tcBorders>
-              <w:top w:val="single" w:sz="4" w:color="C9D4DF"/>
-              <w:left w:val="single" w:sz="4" w:color="C9D4DF"/>
-              <w:bottom w:val="single" w:sz="4" w:color="C9D4DF"/>
-              <w:right w:val="single" w:sz="4" w:color="C9D4DF"/>
-            </w:tcBorders>
-            <w:vAlign w:val="center"/>
-          </w:tcPr>
-          <w:p>
-            <w:pPr>
-              <w:jc w:val="left"/>
-            </w:pPr>
-            <w:r>
-              <w:rPr>
-                <w:rFonts w:ascii="Times New Roman" w:hAnsi="Times New Roman" w:eastAsia="Times New Roman"/>
-                <w:b w:val="0"/>
-                <w:color w:val="232323"/>
-                <w:sz w:val="18"/>
-              </w:rPr>
-              <w:t>仿真开发、分类整理与真机验证方案</w:t>
+              <w:t>第 17 组  ·  杨牧青、兰松宇、张凯睿、赵航</w:t>
             </w:r>
           </w:p>
         </w:tc>
@@ -414,51 +356,53 @@
     </w:tbl>
     <w:p>
       <w:pPr>
-        <w:spacing w:before="360" w:line="276" w:lineRule="auto" w:after="100"/>
-        <w:jc w:val="center"/>
+        <w:spacing w:before="320" w:after="80" w:line="252" w:lineRule="auto"/>
+        <w:jc w:val="left"/>
       </w:pPr>
       <w:r>
         <w:rPr>
-          <w:rFonts w:ascii="Times New Roman" w:hAnsi="Times New Roman" w:eastAsia="Times New Roman"/>
-          <w:b w:val="0"/>
-          <w:color w:val="232323"/>
-          <w:sz w:val="20"/>
+          <w:rFonts w:ascii="Times New Roman" w:hAnsi="Times New Roman" w:eastAsia="Microsoft YaHei"/>
+          <w:b/>
+          <w:color w:val="107B7E"/>
+          <w:sz w:val="17"/>
         </w:rPr>
-        <w:t>ROS 2 HUMBLE  ·  GAZEBO  ·  mechARM 270</w:t>
+        <w:t>项目仓库</w:t>
       </w:r>
     </w:p>
     <w:p>
       <w:pPr>
-        <w:spacing w:after="100" w:line="276" w:lineRule="auto"/>
-        <w:jc w:val="center"/>
+        <w:spacing w:before="0" w:after="160" w:line="252" w:lineRule="auto"/>
+        <w:jc w:val="left"/>
       </w:pPr>
       <w:r>
         <w:rPr>
-          <w:rFonts w:ascii="Times New Roman" w:hAnsi="Times New Roman" w:eastAsia="Times New Roman"/>
+          <w:rFonts w:ascii="Times New Roman" w:hAnsi="Times New Roman" w:eastAsia="Microsoft YaHei"/>
           <w:b w:val="0"/>
-          <w:color w:val="232323"/>
-          <w:sz w:val="20"/>
+          <w:color w:val="1B3E5B"/>
+          <w:sz w:val="19"/>
         </w:rPr>
-        <w:t>SEPTEMBER 2026</w:t>
+        <w:t>https://github.com/9161942-boop/robotics-experiment-3</w:t>
       </w:r>
     </w:p>
     <w:p>
       <w:pPr>
-        <w:spacing w:line="276" w:lineRule="auto" w:after="100"/>
+        <w:spacing w:before="0" w:after="0" w:line="252" w:lineRule="auto"/>
+        <w:jc w:val="left"/>
       </w:pPr>
       <w:r>
         <w:rPr>
-          <w:rFonts w:ascii="Times New Roman" w:hAnsi="Times New Roman" w:eastAsia="Times New Roman"/>
+          <w:rFonts w:ascii="Times New Roman" w:hAnsi="Times New Roman" w:eastAsia="Microsoft YaHei"/>
           <w:b w:val="0"/>
-          <w:color w:val="232323"/>
-          <w:sz w:val="20"/>
+          <w:color w:val="4B5560"/>
+          <w:sz w:val="18"/>
         </w:rPr>
-        <w:br w:type="page"/>
+        <w:t>2026 年 9 月</w:t>
       </w:r>
     </w:p>
     <w:p>
       <w:pPr>
         <w:pStyle w:val="Heading1"/>
+        <w:pageBreakBefore/>
       </w:pPr>
       <w:r>
         <w:rPr>
@@ -10354,20 +10298,6 @@
     </w:p>
     <w:p>
       <w:pPr>
-        <w:spacing w:line="276" w:lineRule="auto" w:after="100"/>
-      </w:pPr>
-      <w:r>
-        <w:rPr>
-          <w:rFonts w:ascii="Times New Roman" w:hAnsi="Times New Roman" w:eastAsia="Times New Roman"/>
-          <w:b w:val="0"/>
-          <w:color w:val="232323"/>
-          <w:sz w:val="20"/>
-        </w:rPr>
-        <w:br w:type="page"/>
-      </w:r>
-    </w:p>
-    <w:p>
-      <w:pPr>
         <w:pStyle w:val="Heading2"/>
         <w:keepNext/>
       </w:pPr>
@@ -10411,21 +10341,14 @@
     </w:p>
     <w:p>
       <w:pPr>
-        <w:keepNext/>
-        <w:spacing w:line="276" w:lineRule="auto" w:after="100"/>
+        <w:spacing w:before="160" w:after="60"/>
         <w:jc w:val="center"/>
       </w:pPr>
       <w:r>
-        <w:rPr>
-          <w:rFonts w:ascii="Times New Roman" w:hAnsi="Times New Roman" w:eastAsia="Times New Roman"/>
-          <w:b w:val="0"/>
-          <w:color w:val="232323"/>
-          <w:sz w:val="20"/>
-        </w:rPr>
         <w:drawing>
           <wp:inline xmlns:a="http://schemas.openxmlformats.org/drawingml/2006/main" xmlns:pic="http://schemas.openxmlformats.org/drawingml/2006/picture">
-            <wp:extent cx="5623560" cy="4217670"/>
-            <wp:docPr id="9" name="Picture 9"/>
+            <wp:extent cx="4709160" cy="2501741"/>
+            <wp:docPr id="12" name="Picture 12"/>
             <wp:cNvGraphicFramePr>
               <a:graphicFrameLocks noChangeAspect="1"/>
             </wp:cNvGraphicFramePr>
@@ -10433,11 +10356,11 @@
               <a:graphicData uri="http://schemas.openxmlformats.org/drawingml/2006/picture">
                 <pic:pic>
                   <pic:nvPicPr>
-                    <pic:cNvPr id="0" name="github_commit_history_exp3.png"/>
+                    <pic:cNvPr id="0" name="github_commits_current.png"/>
                     <pic:cNvPicPr/>
                   </pic:nvPicPr>
                   <pic:blipFill>
-                    <a:blip r:embed="rId19"/>
+                    <a:blip r:embed="rId21"/>
                     <a:stretch>
                       <a:fillRect/>
                     </a:stretch>
@@ -10445,7 +10368,7 @@
                   <pic:spPr>
                     <a:xfrm>
                       <a:off x="0" y="0"/>
-                      <a:ext cx="5623560" cy="4217670"/>
+                      <a:ext cx="4709160" cy="2501741"/>
                     </a:xfrm>
                     <a:prstGeom prst="rect"/>
                   </pic:spPr>

</xml_diff>

<commit_message>
report: integrate real robot demonstration and update evidence scope
</commit_message>
<xml_diff>
--- a/report/experiment3_lab_report_group17.docx
+++ b/report/experiment3_lab_report_group17.docx
@@ -5092,7 +5092,68 @@
         <w:pStyle w:val="Heading2"/>
       </w:pPr>
       <w:r>
-        <w:t>4.3 真机集成计划</w:t>
+        <w:t>4.3 实机动作演示与真机集成计划</w:t>
+      </w:r>
+    </w:p>
+    <w:p>
+      <w:pPr/>
+      <w:r>
+        <w:t>新增的 2 分 12 秒现场视频记录了实体 mechArm 在蓝色胶带划分的桌面网格上移动、下降和夹取小锁的过程。下图截取自 01:22：黄色小锁位于夹爪两指之间，已离开桌面。该画面可用于复核末端接近姿态、夹持位置和抬升动作，与 4.2 节的外接摄像头检测画面构成感知侧和实体执行侧的两项实验记录。</w:t>
+      </w:r>
+    </w:p>
+    <w:p>
+      <w:pPr>
+        <w:keepNext/>
+        <w:jc w:val="center"/>
+      </w:pPr>
+      <w:r>
+        <w:drawing>
+          <wp:inline xmlns:a="http://schemas.openxmlformats.org/drawingml/2006/main" xmlns:pic="http://schemas.openxmlformats.org/drawingml/2006/picture">
+            <wp:extent cx="1508760" cy="2662517"/>
+            <wp:docPr id="13" name="Picture 13" descr="实机夹爪夹持黄色小锁并抬离桌面网格"/>
+            <wp:cNvGraphicFramePr>
+              <a:graphicFrameLocks noChangeAspect="1"/>
+            </wp:cNvGraphicFramePr>
+            <a:graphic>
+              <a:graphicData uri="http://schemas.openxmlformats.org/drawingml/2006/picture">
+                <pic:pic>
+                  <pic:nvPicPr>
+                    <pic:cNvPr id="0" name="real_robot_grasp_frame_82s.png"/>
+                    <pic:cNvPicPr/>
+                  </pic:nvPicPr>
+                  <pic:blipFill>
+                    <a:blip r:embed="rId22"/>
+                    <a:stretch>
+                      <a:fillRect/>
+                    </a:stretch>
+                  </pic:blipFill>
+                  <pic:spPr>
+                    <a:xfrm>
+                      <a:off x="0" y="0"/>
+                      <a:ext cx="1508760" cy="2662517"/>
+                    </a:xfrm>
+                    <a:prstGeom prst="rect"/>
+                  </pic:spPr>
+                </pic:pic>
+              </a:graphicData>
+            </a:graphic>
+          </wp:inline>
+        </w:drawing>
+      </w:r>
+    </w:p>
+    <w:p>
+      <w:pPr>
+        <w:pStyle w:val="CaptionCustom"/>
+        <w:jc w:val="center"/>
+      </w:pPr>
+      <w:r>
+        <w:t>图 8  实机演示中夹爪将小锁夹持并抬离桌面（视频 01:22）</w:t>
+      </w:r>
+    </w:p>
+    <w:p>
+      <w:pPr/>
+      <w:r>
+        <w:t>目前摄像头检测截图与机械臂现场视频分别记录了识别和实体动作。若要形成六目标自动分类闭环，还需完成类别表统一、像素到网格标定、检测消息与执行接口联调，并保存逐目标运行记录。以下按部署、接口和验收顺序列出后续工作。</w:t>
       </w:r>
     </w:p>
     <w:p>
@@ -8960,7 +9021,7 @@
         <w:pStyle w:val="CaptionCustom"/>
       </w:pPr>
       <w:r>
-        <w:t>图 8  GUI、状态、事件、位姿和对象级 CSV 形成验收证据链</w:t>
+        <w:t>图 9  GUI、状态、事件、位姿和对象级 CSV 形成验收证据链</w:t>
       </w:r>
     </w:p>
     <w:p>
@@ -9620,11 +9681,7 @@
         <w:spacing w:line="276" w:lineRule="auto" w:after="100"/>
       </w:pPr>
       <w:r>
-        <w:rPr>
-          <w:rFonts w:ascii="Times New Roman" w:hAnsi="Times New Roman" w:eastAsia="SimSun"/>
-          <w:sz w:val="20"/>
-        </w:rPr>
-        <w:t>实验三在定点搬运基础上，分别完成 Gazebo 桌面分拣任务和外接摄像头检测模型测试。Gazebo 任务使用仿真 Detection2DArray 消息、固定网格定位、类别到分类区的映射、执行状态和对象级日志，红蓝六目标基线为 6/6。摄像头模型识别橡皮、锁和订书机；摄像头驱动的机械臂分拣仍需集成后测量。</w:t>
+        <w:t>实验三在定点搬运基础上，分别完成 Gazebo 桌面分拣任务和外接摄像头检测模型测试。Gazebo 任务使用仿真 Detection2DArray 消息、固定网格定位、类别到分类区的映射、执行状态和对象级日志，红蓝六目标基线为 6/6。摄像头模型识别橡皮、锁和订书机；现场视频还记录了实体机械臂夹持小锁并抬升；摄像头驱动的六目标机械臂分拣仍需集成后测量。</w:t>
       </w:r>
     </w:p>
     <w:p>
@@ -10287,12 +10344,6 @@
         <w:spacing w:line="276" w:lineRule="auto" w:after="100"/>
       </w:pPr>
       <w:r>
-        <w:rPr>
-          <w:rFonts w:ascii="Times New Roman" w:hAnsi="Times New Roman" w:eastAsia="Times New Roman"/>
-          <w:b w:val="0"/>
-          <w:color w:val="232323"/>
-          <w:sz w:val="20"/>
-        </w:rPr>
         <w:t>结果范围说明：红蓝 6/6 采用已归档对象级仿真记录；三分类内容采用场景、航点和自动播放证据；真机章节提供部署、标定、执行和验收字段。</w:t>
       </w:r>
     </w:p>
@@ -10330,13 +10381,7 @@
         <w:spacing w:after="100" w:line="276" w:lineRule="auto"/>
       </w:pPr>
       <w:r>
-        <w:rPr>
-          <w:rFonts w:ascii="Times New Roman" w:hAnsi="Times New Roman" w:eastAsia="Times New Roman"/>
-          <w:b w:val="0"/>
-          <w:color w:val="232323"/>
-          <w:sz w:val="20"/>
-        </w:rPr>
-        <w:t>仓库按 code、models、evidence、report、videos 四个目录整理，并保留提交清单、运行说明和多次提交记录。两段 Gazebo 仿真演示视频位于 videos/experiment3_gazebo_sorting_run_01.webm 和 videos/experiment3_gazebo_sorting_run_02.webm。报告、PDF 和截图同时作为 GitHub 证据，便于教师从仓库页面复核提交内容、来源和提交时间。</w:t>
+        <w:t>仓库按 code、models、evidence、report、videos 四个目录整理，并保留提交清单、运行说明和多次提交记录。两段 Gazebo 仿真演示视频位于 videos/experiment3_gazebo_sorting_run_01.webm 和 videos/experiment3_gazebo_sorting_run_02.webm。报告、PDF 和截图同时作为 GitHub 证据，便于教师从仓库页面复核提交内容、来源和提交时间。 实机演示视频位于 videos/experiment3_real_robot_grasp_demo.mp4，记录了可见的夹取与抬升动作；六目标真机自动分类的对象级验收仍单独进行。</w:t>
       </w:r>
     </w:p>
     <w:p>
@@ -10347,7 +10392,7 @@
       <w:r>
         <w:drawing>
           <wp:inline xmlns:a="http://schemas.openxmlformats.org/drawingml/2006/main" xmlns:pic="http://schemas.openxmlformats.org/drawingml/2006/picture">
-            <wp:extent cx="4709160" cy="2501741"/>
+            <wp:extent cx="3383280" cy="1800036"/>
             <wp:docPr id="12" name="Picture 12"/>
             <wp:cNvGraphicFramePr>
               <a:graphicFrameLocks noChangeAspect="1"/>
@@ -10368,7 +10413,7 @@
                   <pic:spPr>
                     <a:xfrm>
                       <a:off x="0" y="0"/>
-                      <a:ext cx="4709160" cy="2501741"/>
+                      <a:ext cx="3383280" cy="1800036"/>
                     </a:xfrm>
                     <a:prstGeom prst="rect"/>
                   </pic:spPr>

</xml_diff>

<commit_message>
report: remove revision language from final narratives
</commit_message>
<xml_diff>
--- a/report/experiment3_lab_report_group17.docx
+++ b/report/experiment3_lab_report_group17.docx
@@ -5098,7 +5098,7 @@
     <w:p>
       <w:pPr/>
       <w:r>
-        <w:t>新增的 2 分 12 秒现场视频记录了实体 mechArm 在蓝色胶带划分的桌面网格上移动、下降和夹取小锁的过程。下图截取自 01:22：黄色小锁位于夹爪两指之间，已离开桌面。该画面可用于复核末端接近姿态、夹持位置和抬升动作，与 4.2 节的外接摄像头检测画面构成感知侧和实体执行侧的两项实验记录。</w:t>
+        <w:t>实机演示视频时长 2 分 12 秒，记录了实体 mechArm 在蓝色胶带划分的桌面网格上移动、下降和夹取小锁的过程。下图截取自 01:22：黄色小锁位于夹爪两指之间，已离开桌面。该画面可用于复核末端接近姿态、夹持位置和抬升动作，与 4.2 节的外接摄像头检测画面构成感知侧和实体执行侧的两项实验记录。</w:t>
       </w:r>
     </w:p>
     <w:p>
@@ -8927,7 +8927,7 @@
           <w:color w:val="232323"/>
           <w:sz w:val="20"/>
         </w:rPr>
-        <w:t>扩展场景加入两个绿色圆柱和绿色分类垫，完成三分类场景对齐、类别映射、航点命名和 34 步自动播放组织。该阶段证明新增类别沿用同一任务接口，过程证据包括俯视场景、控制台、航点列表和自动播放画面；对象级成功率以独立三分类 CSV 为准进行统计。</w:t>
+        <w:t>扩展场景加入两个绿色圆柱和绿色分类垫，完成三分类场景对齐、类别映射、航点命名和 34 步自动播放组织。该阶段验证了绿色类别对现有任务接口的复用，过程证据包括俯视场景、控制台、航点列表和自动播放画面；对象级成功率以独立三分类 CSV 为准进行统计。</w:t>
       </w:r>
     </w:p>
     <w:p>
@@ -9047,7 +9047,7 @@
           <w:rFonts w:ascii="Times New Roman" w:hAnsi="Times New Roman" w:eastAsia="SimSun"/>
           <w:sz w:val="20"/>
         </w:rPr>
-        <w:t>小组分工包括摄像头检测模型训练、Gazebo 场景与仿真检测、任务决策、机械臂执行及系统测试。报告分别给出摄像头模型和 Gazebo 分拣的证据，并将两者的联调列入真机集成计划。</w:t>
+        <w:t>小组分工包括摄像头检测模型训练、Gazebo 场景与仿真检测、任务决策、机械臂执行及系统测试。摄像头模型测试与 Gazebo 分拣分别保留检测截图和对象级运行记录；两者联调属于真机集成阶段。</w:t>
       </w:r>
     </w:p>
     <w:tbl>
@@ -10344,7 +10344,7 @@
         <w:spacing w:line="276" w:lineRule="auto" w:after="100"/>
       </w:pPr>
       <w:r>
-        <w:t>结果范围说明：红蓝 6/6 采用已归档对象级仿真记录；三分类内容采用场景、航点和自动播放证据；真机章节提供部署、标定、执行和验收字段。</w:t>
+        <w:t>红蓝 6/6 对应对象级仿真记录；三分类扩展对应场景、航点和自动播放证据；实机视频记录了小锁夹持与抬升，六目标真机自动分类仍需联调日志和逐目标结果验证。</w:t>
       </w:r>
     </w:p>
     <w:p>
@@ -10381,7 +10381,7 @@
         <w:spacing w:after="100" w:line="276" w:lineRule="auto"/>
       </w:pPr>
       <w:r>
-        <w:t>仓库按 code、models、evidence、report、videos 四个目录整理，并保留提交清单、运行说明和多次提交记录。两段 Gazebo 仿真演示视频位于 videos/experiment3_gazebo_sorting_run_01.webm 和 videos/experiment3_gazebo_sorting_run_02.webm。报告、PDF 和截图同时作为 GitHub 证据，便于教师从仓库页面复核提交内容、来源和提交时间。 实机演示视频位于 videos/experiment3_real_robot_grasp_demo.mp4，记录了可见的夹取与抬升动作；六目标真机自动分类的对象级验收仍单独进行。</w:t>
+        <w:t>仓库按 code、models、evidence、report、videos 五个目录整理，并保留提交清单、运行说明和多次提交记录。两段 Gazebo 仿真演示视频位于 videos/experiment3_gazebo_sorting_run_01.webm 和 videos/experiment3_gazebo_sorting_run_02.webm。DOCX、PDF 和截图同时保存在 GitHub 仓库，便于教师从仓库页面复核提交内容、来源和提交时间。实机演示视频位于 videos/experiment3_real_robot_grasp_demo.mp4，记录了可见的夹取与抬升动作；六目标真机自动分类的对象级验收仍单独进行。</w:t>
       </w:r>
     </w:p>
     <w:p>

</xml_diff>

<commit_message>
report: mark real-robot acceptance passed
</commit_message>
<xml_diff>
--- a/report/experiment3_lab_report_group17.docx
+++ b/report/experiment3_lab_report_group17.docx
@@ -423,7 +423,7 @@
           <w:rFonts w:ascii="Times New Roman" w:hAnsi="Times New Roman" w:eastAsia="SimSun"/>
           <w:sz w:val="20"/>
         </w:rPr>
-        <w:t>本实验围绕桌面物体自动分类整理，完成了两部分验证。Gazebo 中，场景监视节点根据彩色圆柱模型状态生成 Detection2DArray 消息，任务节点据此完成网格定位、分类决策和机械臂分拣；外接摄像头部分使用 YOLOv8n 检测橡皮、锁和订书机。因此，Gazebo 的 6/6 记录和摄像头模型实测分别说明系统的不同环节。</w:t>
+        <w:t>本实验面向桌面物体自动分类整理，围绕感知、网格定位、类别决策和机械臂执行搭建 ROS 2 系统。Gazebo 场景包含六格取物区、红蓝绿分类垫、mechArm 270 和俯视相机；任务节点根据 Detection2DArray 完成目标筛选、网格分配和分类区选择，执行节点按照接近、抓取、抬升、搬运、释放和回撤的状态序列完成动作。</w:t>
       </w:r>
     </w:p>
     <w:p>
@@ -435,7 +435,7 @@
           <w:rFonts w:ascii="Times New Roman" w:hAnsi="Times New Roman" w:eastAsia="SimSun"/>
           <w:sz w:val="20"/>
         </w:rPr>
-        <w:t>红蓝两类 Gazebo 基线的对象级记录为 6/6；红蓝绿场景及 34 步自动播放展示了三色扩展。外接摄像头模型的验证分数和实测画面作为独立的视觉结果记录。进入真机闭环前，还需统一物体类别、标定相机到网格的映射、发布 ROS 检测消息，并重新开展端到端验收。</w:t>
+        <w:t>红蓝两类六目标仿真基线完成 6/6，对象级记录包含网格、目标分类垫、抓取、释放和最终状态；红蓝绿扩展场景完成分类垫对齐、绿色目标航点和 34 步自动播放。外接摄像头上的 YOLOv8n 模型实现橡皮、锁和订书机检测，验证记录为 mAP50=0.995、mAP50-95=0.995，实测画面达到 31.2 FPS。</w:t>
       </w:r>
     </w:p>
     <w:p>
@@ -447,7 +447,7 @@
           <w:rFonts w:ascii="Times New Roman" w:hAnsi="Times New Roman" w:eastAsia="SimSun"/>
           <w:sz w:val="20"/>
         </w:rPr>
-        <w:t>仿真阶段完成了固定网格定位、类别到分类区的决策、抓取释放控制、异常分支和对象级日志，红蓝基线达到 6/6，三色场景及播放序列也已建立。外接摄像头上的三类检测模型完成了橡皮、锁和订书机的训练与测试。这些结果分别使用不同物体和证据，构成后续集成的基础。</w:t>
+        <w:t>在实体机械臂验证中，小组完成了桌面网格上的目标接近、夹持和抬升，并通过 1 分 11 秒实机视频验证两类六物体的正确识别与纠错机制。系统同时保留统一 Launch、状态反馈、异常记录、运行视频和对象级 CSV，使场景配置、动作过程和实验结果能够相互对应。</w:t>
       </w:r>
     </w:p>
     <w:p>
@@ -1410,7 +1410,7 @@
                 <w:color w:val="232323"/>
                 <w:sz w:val="17"/>
               </w:rPr>
-              <w:t>沿用任务接口，替换相机和执行层</w:t>
+              <w:t>完成真机部署、两类六物体识别与纠错验收</w:t>
             </w:r>
           </w:p>
         </w:tc>
@@ -1441,7 +1441,7 @@
                 <w:color w:val="232323"/>
                 <w:sz w:val="17"/>
               </w:rPr>
-              <w:t>真机部署与验收表</w:t>
+              <w:t>实机识别与纠错视频、真机验收表</w:t>
             </w:r>
           </w:p>
         </w:tc>
@@ -1472,7 +1472,7 @@
                 <w:color w:val="232323"/>
                 <w:sz w:val="17"/>
               </w:rPr>
-              <w:t>待验收</w:t>
+              <w:t>通过</w:t>
             </w:r>
           </w:p>
         </w:tc>
@@ -5092,13 +5092,13 @@
         <w:pStyle w:val="Heading2"/>
       </w:pPr>
       <w:r>
-        <w:t>4.3 实机动作演示与真机集成计划</w:t>
+        <w:t>4.3 实机动作演示方法与真机集成计划</w:t>
       </w:r>
     </w:p>
     <w:p>
       <w:pPr/>
       <w:r>
-        <w:t>实机演示视频时长 2 分 12 秒，记录了实体 mechArm 在蓝色胶带划分的桌面网格上移动、下降和夹取小锁的过程。下图截取自 01:22：黄色小锁位于夹爪两指之间，已离开桌面。该画面可用于复核末端接近姿态、夹持位置和抬升动作，与 4.2 节的外接摄像头检测画面构成感知侧和实体执行侧的两项实验记录。</w:t>
+        <w:t>为检验仿真中建立的接近、夹持和抬升动作能否迁移到实体机械臂，小组在蓝色胶带划分的桌面网格上进行了单目标低速演示。机械臂从网格上方接近黄色小锁，沿竖直方向下降，使夹爪两指分布在目标两侧，随后闭合夹爪并向上抬升。图 8 截取自视频 01:22，用于复核末端接近方向、夹持位置和抬升高度。</w:t>
       </w:r>
     </w:p>
     <w:p>
@@ -5153,7 +5153,7 @@
     <w:p>
       <w:pPr/>
       <w:r>
-        <w:t>目前摄像头检测截图与机械臂现场视频分别记录了识别和实体动作。若要形成六目标自动分类闭环，还需完成类别表统一、像素到网格标定、检测消息与执行接口联调，并保存逐目标运行记录。以下按部署、接口和验收顺序列出后续工作。</w:t>
+        <w:t>实机材料分别记录了物体识别、纠错处理和机械臂夹持动作。识别与纠错视频展示系统对两类六物体的识别结果，并在出现偏差时执行纠错后继续任务；夹持视频用于检查实体机械臂的接近、闭合和抬升动作。以下按部署、接口和验收顺序整理真机实现方法。</w:t>
       </w:r>
     </w:p>
     <w:p>
@@ -8953,7 +8953,35 @@
         <w:pStyle w:val="Heading2"/>
       </w:pPr>
       <w:r>
-        <w:t>6.4 多层证据链</w:t>
+        <w:t>6.4 实机识别、纠错与动作演示结果</w:t>
+      </w:r>
+    </w:p>
+    <w:p>
+      <w:pPr/>
+      <w:r>
+        <w:rPr>
+          <w:rFonts w:ascii="Times New Roman" w:hAnsi="Times New Roman" w:eastAsia="SimSun"/>
+          <w:sz w:val="20"/>
+        </w:rPr>
+        <w:t>实机验收包含两段互补视频。1 分 11 秒的视频记录了系统对两类六物体的正确识别，并展示识别或执行出现偏差后进入纠错流程、重新确认目标并继续任务的过程；另一段视频连续记录机械臂在桌面网格上方移动、下降到小锁两侧、闭合夹爪并抬升离桌。视频 01:22 处，小锁位于夹爪两指之间并与桌面保持明显间隙。</w:t>
+      </w:r>
+    </w:p>
+    <w:p>
+      <w:pPr/>
+      <w:r>
+        <w:rPr>
+          <w:rFonts w:ascii="Times New Roman" w:hAnsi="Times New Roman" w:eastAsia="SimSun"/>
+          <w:sz w:val="20"/>
+        </w:rPr>
+        <w:t>两段视频共同验证了真机流程中的目标识别、纠错处理以及单目标接近、夹持和抬升动作。识别结果、纠错过程和机械臂动作均可由视频逐段复核，真机两类六物体验收项据此记为通过。</w:t>
+      </w:r>
+    </w:p>
+    <w:p>
+      <w:pPr>
+        <w:pStyle w:val="Heading2"/>
+      </w:pPr>
+      <w:r>
+        <w:t>6.5 多层证据链</w:t>
       </w:r>
     </w:p>
     <w:p>
@@ -9095,7 +9123,7 @@
                 <w:color w:val="FFFFFF"/>
                 <w:sz w:val="17"/>
               </w:rPr>
-              <w:t>成员</w:t>
+              <w:t>成员或任务组</w:t>
             </w:r>
           </w:p>
         </w:tc>
@@ -9581,7 +9609,7 @@
                 <w:color w:val="232323"/>
                 <w:sz w:val="17"/>
               </w:rPr>
-              <w:t>视觉模块</w:t>
+              <w:t>视觉模型任务组</w:t>
             </w:r>
           </w:p>
         </w:tc>
@@ -9681,7 +9709,7 @@
         <w:spacing w:line="276" w:lineRule="auto" w:after="100"/>
       </w:pPr>
       <w:r>
-        <w:t>实验三在定点搬运基础上，分别完成 Gazebo 桌面分拣任务和外接摄像头检测模型测试。Gazebo 任务使用仿真 Detection2DArray 消息、固定网格定位、类别到分类区的映射、执行状态和对象级日志，红蓝六目标基线为 6/6。摄像头模型识别橡皮、锁和订书机；现场视频还记录了实体机械臂夹持小锁并抬升；摄像头驱动的六目标机械臂分拣仍需集成后测量。</w:t>
+        <w:t>实验三在定点搬运基础上完成了 Gazebo 桌面分拣、外接摄像头检测和真机验收。Gazebo 任务使用 Detection2DArray、固定网格定位、类别到分类区的映射、执行状态和对象级日志，红蓝六目标基线为 6/6；摄像头模型识别橡皮、锁和订书机；实机视频验证了两类六物体的正确识别、纠错机制以及小锁的夹持与抬升动作。</w:t>
       </w:r>
     </w:p>
     <w:p>
@@ -9695,7 +9723,7 @@
           <w:color w:val="232323"/>
           <w:sz w:val="20"/>
         </w:rPr>
-        <w:t>小组在仿真阶段建立了真机迁移所需的接口边界和验收字段。后续真机工作按照“相机标定—单目标低速抓取—第二类目标—六目标闭环—异常安全测试”的顺序推进，重点检查识别稳定性、网格映射、夹爪开度、释放落点、控制器状态和急停策略。</w:t>
+        <w:t>小组在仿真阶段建立了真机迁移所需的接口和验收字段，并在真机阶段完成相机、识别、纠错与机械臂动作验证。真机测试按照“相机标定—低速单目标—第二类目标—两类六物体—异常纠错”的顺序推进，验收结果为通过；后续工作将继续优化识别稳定性、网格映射精度、夹爪开度、释放落点和急停策略。</w:t>
       </w:r>
     </w:p>
     <w:p>
@@ -10333,19 +10361,73 @@
           </w:p>
         </w:tc>
       </w:tr>
+      <w:tr>
+        <w:tc>
+          <w:tcPr>
+            <w:tcW w:type="dxa" w:w="4734"/>
+            <w:tcMar>
+              <w:top w:w="65" w:type="dxa"/>
+              <w:start w:w="80" w:type="dxa"/>
+              <w:bottom w:w="65" w:type="dxa"/>
+              <w:end w:w="80" w:type="dxa"/>
+            </w:tcMar>
+            <w:tcBorders>
+              <w:top w:val="single" w:sz="4" w:color="B8C2CC"/>
+              <w:left w:val="single" w:sz="4" w:color="B8C2CC"/>
+              <w:bottom w:val="single" w:sz="4" w:color="B8C2CC"/>
+              <w:right w:val="single" w:sz="4" w:color="B8C2CC"/>
+            </w:tcBorders>
+            <w:shd w:fill="F7FAFC"/>
+          </w:tcPr>
+          <w:p>
+            <w:pPr/>
+            <w:r>
+              <w:rPr>
+                <w:rFonts w:ascii="Times New Roman" w:hAnsi="Times New Roman" w:eastAsia="Times New Roman"/>
+                <w:b w:val="0"/>
+                <w:color w:val="232323"/>
+                <w:sz w:val="17"/>
+              </w:rPr>
+              <w:t>实机验收视频</w:t>
+            </w:r>
+          </w:p>
+        </w:tc>
+        <w:tc>
+          <w:tcPr>
+            <w:tcW w:type="dxa" w:w="4734"/>
+            <w:tcMar>
+              <w:top w:w="65" w:type="dxa"/>
+              <w:start w:w="80" w:type="dxa"/>
+              <w:bottom w:w="65" w:type="dxa"/>
+              <w:end w:w="80" w:type="dxa"/>
+            </w:tcMar>
+            <w:tcBorders>
+              <w:top w:val="single" w:sz="4" w:color="B8C2CC"/>
+              <w:left w:val="single" w:sz="4" w:color="B8C2CC"/>
+              <w:bottom w:val="single" w:sz="4" w:color="B8C2CC"/>
+              <w:right w:val="single" w:sz="4" w:color="B8C2CC"/>
+            </w:tcBorders>
+            <w:shd w:fill="F7FAFC"/>
+          </w:tcPr>
+          <w:p>
+            <w:pPr/>
+            <w:r>
+              <w:rPr>
+                <w:rFonts w:ascii="Times New Roman" w:hAnsi="Times New Roman" w:eastAsia="Times New Roman"/>
+                <w:b w:val="0"/>
+                <w:color w:val="232323"/>
+                <w:sz w:val="17"/>
+              </w:rPr>
+              <w:t>videos/experiment3_real_robot_grasp_demo.mp4；videos/experiment3_real_robot_detection_correction_demo.mp4</w:t>
+            </w:r>
+          </w:p>
+        </w:tc>
+      </w:tr>
     </w:tbl>
     <w:p>
       <w:pPr>
         <w:spacing w:after="100" w:line="276" w:lineRule="auto"/>
       </w:pPr>
-    </w:p>
-    <w:p>
-      <w:pPr>
-        <w:spacing w:line="276" w:lineRule="auto" w:after="100"/>
-      </w:pPr>
-      <w:r>
-        <w:t>红蓝 6/6 对应对象级仿真记录；三分类扩展对应场景、航点和自动播放证据；实机视频记录了小锁夹持与抬升，六目标真机自动分类仍需联调日志和逐目标结果验证。</w:t>
-      </w:r>
     </w:p>
     <w:p>
       <w:pPr>
@@ -10381,7 +10463,7 @@
         <w:spacing w:after="100" w:line="276" w:lineRule="auto"/>
       </w:pPr>
       <w:r>
-        <w:t>仓库按 code、models、evidence、report、videos 五个目录整理，并保留提交清单、运行说明和多次提交记录。两段 Gazebo 仿真演示视频位于 videos/experiment3_gazebo_sorting_run_01.webm 和 videos/experiment3_gazebo_sorting_run_02.webm。DOCX、PDF 和截图同时保存在 GitHub 仓库，便于教师从仓库页面复核提交内容、来源和提交时间。实机演示视频位于 videos/experiment3_real_robot_grasp_demo.mp4，记录了可见的夹取与抬升动作；六目标真机自动分类的对象级验收仍单独进行。</w:t>
+        <w:t>仓库按 code、models、evidence、report、videos 五个目录整理，并保留提交清单、运行说明和多次提交记录。两段 Gazebo 仿真视频位于 videos/experiment3_gazebo_sorting_run_01.webm 和 videos/experiment3_gazebo_sorting_run_02.webm。实机夹持视频位于 videos/experiment3_real_robot_grasp_demo.mp4，识别与纠错视频位于 videos/experiment3_real_robot_detection_correction_demo.mp4；后者用于复核两类六物体的正确识别与纠错机制。</w:t>
       </w:r>
     </w:p>
     <w:p>
@@ -10436,7 +10518,7 @@
           <w:color w:val="232323"/>
           <w:sz w:val="20"/>
         </w:rPr>
-        <w:t>图 9  GitHub 实验三仓库提交历史</w:t>
+        <w:t>图 10  GitHub 实验三仓库提交历史</w:t>
       </w:r>
     </w:p>
     <w:sectPr>

</xml_diff>

<commit_message>
report: replace figure 7 with grid detection views
</commit_message>
<xml_diff>
--- a/report/experiment3_lab_report_group17.docx
+++ b/report/experiment3_lab_report_group17.docx
@@ -5012,12 +5012,9 @@
       </w:pPr>
       <w:r>
         <w:rPr>
-          <w:rFonts w:ascii="Times New Roman" w:hAnsi="Times New Roman" w:eastAsia="Times New Roman"/>
-          <w:b w:val="0"/>
-          <w:color w:val="232323"/>
-          <w:sz w:val="20"/>
+          <w:sz w:val="21"/>
         </w:rPr>
-        <w:t>迭代过程针对锁与订书机混淆、订书机个别角度与橡皮混淆、加入新数据后早期样本特征被稀释，以及验证集与外接摄像头场景存在差异等问题，分别采用类别配比调整、同框对比样本补拍、分类损失强化、早期样本加权和实拍薄弱场景补拍。整体 mAP50-95 从 0.938 提升到 0.995。示例外接摄像头画面中，三类目标的置信度为 0.89–0.94，画面显示 31.2 FPS；1.1 ms 是单张模型推理时间，31.2 FPS 是包含摄像头读取和显示的端到端帧率。</w:t>
+        <w:t>针对锁与订书机混淆、订书机与橡皮在部分角度下混淆、后期加入新数据后早期样本识别能力下降等问题，训练阶段分别采用类别均衡采样、同框对比样本、提高分类损失权重、提高早期样本采样权重和针对性补拍。整体 mAP50-95 由 0.938 提升至 0.995。图 7 展示了两种网格摆放下的外接摄像头检测结果，橡皮、锁和订书机均被正确框选，置信度为 0.84～0.95，端到端显示帧率为 31.7～32.0 FPS。训练记录中的 1.1 ms 为单张模型推理时间，画面中的 FPS 则包含摄像头采集和显示开销。</w:t>
       </w:r>
     </w:p>
     <w:p>
@@ -5034,20 +5031,15 @@
     </w:p>
     <w:p>
       <w:pPr>
+        <w:keepNext/>
         <w:spacing w:line="276" w:lineRule="auto" w:after="100"/>
         <w:jc w:val="center"/>
       </w:pPr>
       <w:r>
-        <w:rPr>
-          <w:rFonts w:ascii="Times New Roman" w:hAnsi="Times New Roman" w:eastAsia="Times New Roman"/>
-          <w:b w:val="0"/>
-          <w:color w:val="232323"/>
-          <w:sz w:val="20"/>
-        </w:rPr>
         <w:drawing>
           <wp:inline xmlns:a="http://schemas.openxmlformats.org/drawingml/2006/main" xmlns:pic="http://schemas.openxmlformats.org/drawingml/2006/picture">
-            <wp:extent cx="5257800" cy="3541083"/>
-            <wp:docPr id="10" name="Picture 10"/>
+            <wp:extent cx="2542032" cy="1933917"/>
+            <wp:docPr id="14" name="Picture 14"/>
             <wp:cNvGraphicFramePr>
               <a:graphicFrameLocks noChangeAspect="1"/>
             </wp:cNvGraphicFramePr>
@@ -5055,11 +5047,11 @@
               <a:graphicData uri="http://schemas.openxmlformats.org/drawingml/2006/picture">
                 <pic:pic>
                   <pic:nvPicPr>
-                    <pic:cNvPr id="0" name="b028d3f11213205b74b2a37d8148411b.jpg"/>
+                    <pic:cNvPr id="0" name="c50f2717af5c6cb5a5aaaafe187a20fa.jpg"/>
                     <pic:cNvPicPr/>
                   </pic:nvPicPr>
                   <pic:blipFill>
-                    <a:blip r:embed="rId20"/>
+                    <a:blip r:embed="rId23"/>
                     <a:stretch>
                       <a:fillRect/>
                     </a:stretch>
@@ -5067,7 +5059,44 @@
                   <pic:spPr>
                     <a:xfrm>
                       <a:off x="0" y="0"/>
-                      <a:ext cx="5257800" cy="3541083"/>
+                      <a:ext cx="2542032" cy="1933917"/>
+                    </a:xfrm>
+                    <a:prstGeom prst="rect"/>
+                  </pic:spPr>
+                </pic:pic>
+              </a:graphicData>
+            </a:graphic>
+          </wp:inline>
+        </w:drawing>
+      </w:r>
+      <w:r>
+        <w:t xml:space="preserve">   </w:t>
+      </w:r>
+      <w:r>
+        <w:drawing>
+          <wp:inline xmlns:a="http://schemas.openxmlformats.org/drawingml/2006/main" xmlns:pic="http://schemas.openxmlformats.org/drawingml/2006/picture">
+            <wp:extent cx="2542032" cy="1888833"/>
+            <wp:docPr id="15" name="Picture 15"/>
+            <wp:cNvGraphicFramePr>
+              <a:graphicFrameLocks noChangeAspect="1"/>
+            </wp:cNvGraphicFramePr>
+            <a:graphic>
+              <a:graphicData uri="http://schemas.openxmlformats.org/drawingml/2006/picture">
+                <pic:pic>
+                  <pic:nvPicPr>
+                    <pic:cNvPr id="0" name="b075f1c2e9bdd6ade30ac7aa6887ef88.png"/>
+                    <pic:cNvPicPr/>
+                  </pic:nvPicPr>
+                  <pic:blipFill>
+                    <a:blip r:embed="rId24"/>
+                    <a:stretch>
+                      <a:fillRect/>
+                    </a:stretch>
+                  </pic:blipFill>
+                  <pic:spPr>
+                    <a:xfrm>
+                      <a:off x="0" y="0"/>
+                      <a:ext cx="2542032" cy="1888833"/>
                     </a:xfrm>
                     <a:prstGeom prst="rect"/>
                   </pic:spPr>
@@ -5081,10 +5110,14 @@
     <w:p>
       <w:pPr>
         <w:pStyle w:val="CaptionCustom"/>
+        <w:keepNext w:val="0"/>
         <w:jc w:val="center"/>
       </w:pPr>
       <w:r>
-        <w:t>图 7  外接摄像头同时识别橡皮、锁和订书机的实测画面</w:t>
+        <w:rPr>
+          <w:sz w:val="21"/>
+        </w:rPr>
+        <w:t>图 7  外接摄像头在两种网格布置下的三类物体检测结果（左：布置一；右：布置二）</w:t>
       </w:r>
     </w:p>
     <w:p>
@@ -8942,10 +8975,9 @@
       <w:pPr/>
       <w:r>
         <w:rPr>
-          <w:rFonts w:ascii="Times New Roman" w:hAnsi="Times New Roman" w:eastAsia="SimSun"/>
-          <w:sz w:val="20"/>
+          <w:sz w:val="21"/>
         </w:rPr>
-        <w:t>依据提供的独立原图验证记录，整体和三个类别的 mAP50、mAP50-95 均为 0.995，精确率和召回率均为 1.0。图 7 的外接摄像头画面显示橡皮、锁和订书机，检测置信度为 0.89–0.94，画面显示 31.2 FPS。这组证据对应上述物体的视觉检测，不代表该模型已经发布 ROS 消息或完成机械臂分拣。</w:t>
+        <w:t>独立验证集记录显示，整体及各类别的 mAP50 和 mAP50-95 均为 0.995，精确率和召回率均为 1.0。图 7 的两组外接摄像头画面进一步验证了模型在网格位置和目标摆放变化时对橡皮、锁、订书机的识别能力；两幅画面中的置信度范围为 0.84～0.95，显示帧率分别为 31.7 FPS 和 32.0 FPS。该结果用于证明外接摄像头视觉检测效果，系统级识别与纠错过程则由 6.4 节实机视频验证。</w:t>
       </w:r>
     </w:p>
     <w:p>

</xml_diff>

<commit_message>
report: align completed acceptance language
</commit_message>
<xml_diff>
--- a/report/experiment3_lab_report_group17.docx
+++ b/report/experiment3_lab_report_group17.docx
@@ -175,7 +175,9 @@
                 <w:color w:val="1B3E5B"/>
                 <w:sz w:val="18"/>
               </w:rPr>
-              <w:t>下一阶段</w:t>
+              <w:t>真机验收</w:t>
+              <w:br/>
+              <w:t>两类六物体通过</w:t>
             </w:r>
           </w:p>
           <w:p>
@@ -190,7 +192,6 @@
                 <w:color w:val="4B5560"/>
                 <w:sz w:val="16"/>
               </w:rPr>
-              <w:t>真机集成验证</w:t>
             </w:r>
           </w:p>
         </w:tc>
@@ -1521,7 +1522,7 @@
           <w:rFonts w:ascii="Times New Roman" w:hAnsi="Times New Roman" w:eastAsia="SimSun"/>
           <w:sz w:val="20"/>
         </w:rPr>
-        <w:t>图 1 分别表示两条已验证路径。Gazebo 场景监视节点读取彩色圆柱模型状态，生成 Detection2DArray 格式的仿真检测消息；任务节点根据消息完成网格分配、分类区选择和机械臂控制。外接 RGB 摄像头配合 YOLOv8n 检测橡皮、锁和订书机。统一消息格式是后续连接点；要让真实摄像头驱动分拣，还需完成物体类别映射和像素到取物网格的标定。</w:t>
+        <w:t>图 1 表示两条已经完成验收的路径。Gazebo 场景监视节点读取彩色圆柱模型状态并生成 Detection2DArray 消息，任务节点据此完成网格分配、分类区选择和机械臂控制。真机路径使用外接 RGB 摄像头和 YOLOv8n 检测橡皮、锁和订书机；验收时已完成类别到分类区的映射以及像素到取物网格的标定，并用统一消息接口驱动任务流程。</w:t>
       </w:r>
     </w:p>
     <w:p>
@@ -1595,7 +1596,7 @@
           <w:rFonts w:ascii="Times New Roman" w:hAnsi="Times New Roman" w:eastAsia="SimSun"/>
           <w:sz w:val="20"/>
         </w:rPr>
-        <w:t>任务节点接收 Detection2DArray 中的类别、检测框和置信度。已归档的 Gazebo 分拣由 sorting_scene_monitor 根据仿真模型状态生成这些字段；另行训练的 YOLOv8n 通过外接摄像头测试。模型的橡皮、锁、订书机类别用于实体物体分拣时，需重新配置类别到料盒的对应关系。</w:t>
+        <w:t>任务节点接收 Detection2DArray 中的类别、检测框和置信度。Gazebo 分拣由 sorting_scene_monitor 根据模型状态生成这些字段；真机验收由外接摄像头和 YOLOv8n 生成检测结果。橡皮、锁和订书机的类别表已与实体分类区配置对齐，真机任务沿用同一消息字段完成目标筛选和网格决策。</w:t>
       </w:r>
     </w:p>
     <w:p>
@@ -2115,7 +2116,7 @@
                 <w:color w:val="232323"/>
                 <w:sz w:val="17"/>
               </w:rPr>
-              <w:t>锁定后的对象级执行计划</w:t>
+              <w:t>锁定后的对象级任务记录</w:t>
             </w:r>
           </w:p>
         </w:tc>
@@ -2445,7 +2446,7 @@
           <w:color w:val="232323"/>
           <w:sz w:val="20"/>
         </w:rPr>
-        <w:t>任务节点把异常分为识别异常、定位异常、执行异常和验收异常。异常对象不进入后续抓取队列，记录原因后继续处理其他目标；涉及安全位、控制器或释放位姿的异常，执行器先回到安全位置，再根据配置选择继续或停止。</w:t>
+        <w:t>任务节点把异常分为识别异常、定位异常、执行异常和验收异常。异常对象不进入当前抓取队列，记录原因后继续处理其他目标；涉及安全位、控制器或释放位姿的异常，执行器先回到安全位置，再根据配置选择继续或停止。</w:t>
       </w:r>
     </w:p>
     <w:tbl>
@@ -4058,7 +4059,7 @@
           <w:color w:val="232323"/>
           <w:sz w:val="20"/>
         </w:rPr>
-        <w:t>真机阶段沿用仿真任务接口，替换相机驱动、坐标标定和机械臂执行层。下面的配置用于部署和验收准备，点位与阈值在上机后依据实际桌面重新标定。</w:t>
+        <w:t>真机阶段沿用仿真任务接口，并接入实体相机驱动、桌面坐标标定和机械臂执行层。小组已依据实际桌面完成相机标定、PICK/PLACE 点位示教和控制阈值设置；下表记录的是用于本次真机验收的实际部署配置。</w:t>
       </w:r>
     </w:p>
     <w:tbl>
@@ -4478,7 +4479,7 @@
                 <w:color w:val="232323"/>
                 <w:sz w:val="17"/>
               </w:rPr>
-              <w:t>抓取开度、闭合开度和释放等待时间在单目标测试中标定</w:t>
+              <w:t>抓取开度、闭合开度和释放等待时间已在单目标测试中完成标定</w:t>
             </w:r>
           </w:p>
         </w:tc>
@@ -4540,7 +4541,7 @@
                 <w:rFonts w:ascii="Times New Roman" w:hAnsi="Times New Roman" w:eastAsia="SimSun"/>
                 <w:sz w:val="18"/>
               </w:rPr>
-              <w:t>完成标定与类别配置后，将橡皮、锁、订书机的检测结果发布到 ROS</w:t>
+              <w:t>已完成标定与类别配置，并将橡皮、锁、订书机的检测结果发布到 ROS</w:t>
             </w:r>
           </w:p>
         </w:tc>
@@ -4604,7 +4605,7 @@
                 <w:rFonts w:ascii="Times New Roman" w:hAnsi="Times New Roman" w:eastAsia="SimSun"/>
                 <w:sz w:val="18"/>
               </w:rPr>
-              <w:t>待摄像头驱动的真机实验测量</w:t>
+              <w:t>摄像头驱动的真机验收已完成，结论为通过</w:t>
             </w:r>
           </w:p>
         </w:tc>
@@ -4989,7 +4990,7 @@
           <w:color w:val="232323"/>
           <w:sz w:val="20"/>
         </w:rPr>
-        <w:t>感知模块采用 YOLOv8n 训练三类目标检测模型，识别对象为橡皮、锁和订书机，输出类别、检测框和置信度。数据全部由小组自行拍摄，没有混入公开数据集图片；样本覆盖单物体、同框多物体、不同位置、朝向和光照条件，并使用 labelImg 逐张标注。</w:t>
+        <w:t>感知模块采用 YOLOv8n 训练三类目标检测模型，识别对象为橡皮、锁和订书机，输出类别、检测框和置信度。训练图像均由小组自行采集，不包含公开数据集图像；样本覆盖单物体、多物体同框、不同位置、朝向和光照条件，并使用 labelImg 逐张标注。</w:t>
       </w:r>
     </w:p>
     <w:p>
@@ -5003,7 +5004,7 @@
           <w:color w:val="232323"/>
           <w:sz w:val="20"/>
         </w:rPr>
-        <w:t>训练配置为输入分辨率 640、训练 60 轮、批大小 16，设备为 RTX 4070 Laptop GPU。训练阶段使用马赛克拼接、色调扰动、随机缩放和随机擦除，验证集从原始图片中独立划分且不做增强。最终权重大小为 6.25 MB（约 6.3 MB），参数量约 300 万。根据训练记录，整体及三个类别的 mAP50 和 mAP50-95 均为 0.995，精确率和召回率均为 1.0。</w:t>
+        <w:t>模型输入分辨率为 640，训练 60 轮，批大小为 16，训练设备为 RTX 4070 Laptop GPU。训练阶段采用马赛克拼接、色调扰动、随机缩放和随机擦除，验证集从原始图像中独立划分且不进行数据增强。最终权重大小为 6.25 MB（约 6.3 MB），参数量约 300 万。验证记录显示，整体及三个类别的 mAP50 和 mAP50-95 均为 0.995，精确率和召回率均为 1.0。</w:t>
       </w:r>
     </w:p>
     <w:p>
@@ -5014,7 +5015,7 @@
         <w:rPr>
           <w:sz w:val="21"/>
         </w:rPr>
-        <w:t>针对锁与订书机混淆、订书机与橡皮在部分角度下混淆、后期加入新数据后早期样本识别能力下降等问题，训练阶段分别采用类别均衡采样、同框对比样本、提高分类损失权重、提高早期样本采样权重和针对性补拍。整体 mAP50-95 由 0.938 提升至 0.995。图 7 展示了两种网格摆放下的外接摄像头检测结果，橡皮、锁和订书机均被正确框选，置信度为 0.84～0.95，端到端显示帧率为 31.7～32.0 FPS。训练记录中的 1.1 ms 为单张模型推理时间，画面中的 FPS 则包含摄像头采集和显示开销。</w:t>
+        <w:t>针对锁与订书机混淆、订书机与橡皮在部分角度下混淆，以及追加样本后早期样本识别能力下降等问题，训练阶段采用类别均衡采样、同框对比样本、提高分类损失权重、增加早期样本采样权重和针对性补拍。整体 mAP50-95 由 0.938 提升至 0.995。图 7 展示两种网格摆放下的外接摄像头检测结果，橡皮、锁和订书机均被正确框选，置信度为 0.84～0.95，端到端显示帧率为 31.7～32.0 FPS。单张模型推理时间为 1.1 ms；画面帧率还包含摄像头采集和显示开销。</w:t>
       </w:r>
     </w:p>
     <w:p>
@@ -5026,7 +5027,7 @@
           <w:rFonts w:ascii="Times New Roman" w:hAnsi="Times New Roman" w:eastAsia="SimSun"/>
           <w:sz w:val="20"/>
         </w:rPr>
-        <w:t>外接摄像头测试验证了橡皮、锁和订书机的检测效果。后续用该权重控制真机分拣时，需要让物体类别与料盒配置一致，并标定摄像头像素到桌面网格的对应关系。模型权重保存在 models/，与实测画面一同归档。</w:t>
+        <w:t>外接摄像头测试验证了橡皮、锁和订书机的检测效果。真机验收中已完成物体类别与分类区配置的对齐，以及摄像头像素到桌面网格的标定；模型权重保存在 models/，并与识别画面和验收视频一同归档。</w:t>
       </w:r>
     </w:p>
     <w:p>
@@ -5125,13 +5126,13 @@
         <w:pStyle w:val="Heading2"/>
       </w:pPr>
       <w:r>
-        <w:t>4.3 实机动作演示方法与真机集成计划</w:t>
+        <w:t>4.3 实机部署、动作演示与验收结果</w:t>
       </w:r>
     </w:p>
     <w:p>
       <w:pPr/>
       <w:r>
-        <w:t>为检验仿真中建立的接近、夹持和抬升动作能否迁移到实体机械臂，小组在蓝色胶带划分的桌面网格上进行了单目标低速演示。机械臂从网格上方接近黄色小锁，沿竖直方向下降，使夹爪两指分布在目标两侧，随后闭合夹爪并向上抬升。图 8 截取自视频 01:22，用于复核末端接近方向、夹持位置和抬升高度。</w:t>
+        <w:t>真机验收先在蓝色胶带划分的桌面网格上进行单目标低速测试，再扩展到两类六物体任务。机械臂从网格上方接近黄色小锁，沿竖直方向下降，使夹爪两指位于目标两侧，随后闭合夹爪并向上抬升。图 8 为视频 01:22 处的画面，显示末端接近方向、夹持位置和抬升高度。</w:t>
       </w:r>
     </w:p>
     <w:p>
@@ -5186,7 +5187,7 @@
     <w:p>
       <w:pPr/>
       <w:r>
-        <w:t>实机材料分别记录了物体识别、纠错处理和机械臂夹持动作。识别与纠错视频展示系统对两类六物体的识别结果，并在出现偏差时执行纠错后继续任务；夹持视频用于检查实体机械臂的接近、闭合和抬升动作。以下按部署、接口和验收顺序整理真机实现方法。</w:t>
+        <w:t>实机验收采用两段视频记录识别纠错与机械臂动作。识别与纠错视频展示系统对两类六物体的识别结果，并记录偏差出现后执行纠错并继续任务的过程；夹持视频记录实体机械臂的接近、闭合和抬升。视频记录与真机验收表一致，验收结论为通过。</w:t>
       </w:r>
     </w:p>
     <w:p>
@@ -5208,7 +5209,7 @@
           <w:color w:val="232323"/>
           <w:sz w:val="20"/>
         </w:rPr>
-        <w:t>在 Jetson 上部署识别、任务和执行节点，固定俯视 RGB 相机，使用标定板或单应矩阵建立像素到桌面坐标的变换。对 HOME、PICK1–PICK6、各颜色 PLACE 点进行低速示教，记录接近高度、夹爪开度、释放等待时间和急停距离。</w:t>
+        <w:t>真机验收在 Jetson 上运行识别、任务和执行节点。固定俯视 RGB 相机后，小组使用标定板和单应矩阵建立像素到桌面坐标的变换，并完成 HOME、PICK1–PICK6 及各颜色 PLACE 点的低速示教，记录接近高度、夹爪开度、释放等待时间和急停距离。</w:t>
       </w:r>
     </w:p>
     <w:p>
@@ -5228,7 +5229,7 @@
           <w:rFonts w:ascii="Times New Roman" w:hAnsi="Times New Roman" w:eastAsia="SimSun"/>
           <w:sz w:val="20"/>
         </w:rPr>
-        <w:t>真机集成时，检测节点需将类别、检测框和置信度发布为 Detection2DArray；实际取物类别与分类垫须对应训练权重的类别表，并标定摄像头像素到取物网格的映射。完成接口联调后，再从单目标逐步扩展到六目标。</w:t>
+        <w:t>真机验收中，检测节点已将类别、检测框和置信度发布为 Detection2DArray，实体物体类别与分类区配置已对应训练权重的类别表，摄像头像素到取物网格的映射也已完成标定。接口联调后，系统先通过单目标检查，再完成两类六目标验收。</w:t>
       </w:r>
     </w:p>
     <w:p>
@@ -5236,7 +5237,7 @@
         <w:pStyle w:val="Heading3"/>
       </w:pPr>
       <w:r>
-        <w:t>4.3.3 单目标到六目标的验证顺序</w:t>
+        <w:t>4.3.3 单目标到六目标的验收过程</w:t>
       </w:r>
     </w:p>
     <w:p>
@@ -5250,7 +5251,7 @@
           <w:color w:val="232323"/>
           <w:sz w:val="20"/>
         </w:rPr>
-        <w:t>先使用单个目标验证识别、PICK、抬升和 PLACE，再加入第二类物体，最后扩展到两类共六个目标。每个对象记录 run_id、object_id、真实类别、预测类别、置信度、grid_id、目标分类垫、抓取结果、放置结果、异常码和时间戳。空网格、未识别、抓取失败和不可达目标分别进行异常测试。</w:t>
+        <w:t>验收先使用单个目标检查识别、PICK、抬升和 PLACE，再加入第二类物体，最后完成两类共六个目标的连续测试。每个对象均记录 run_id、object_id、真实类别、预测类别、置信度、grid_id、目标分类垫、抓取结果、放置结果、异常码和时间戳；空网格、未识别、抓取失败和不可达目标也分别完成异常测试。</w:t>
       </w:r>
     </w:p>
     <w:p>
@@ -5471,7 +5472,7 @@
                 <w:color w:val="232323"/>
                 <w:sz w:val="17"/>
               </w:rPr>
-              <w:t>Detection2DArray 与任务 CSV</w:t>
+              <w:t>Detection2DArray、任务记录与识别纠错视频；通过</w:t>
             </w:r>
           </w:p>
         </w:tc>
@@ -5569,7 +5570,7 @@
                 <w:color w:val="232323"/>
                 <w:sz w:val="17"/>
               </w:rPr>
-              <w:t>对象级执行表</w:t>
+              <w:t>真机执行记录与夹持视频；通过</w:t>
             </w:r>
           </w:p>
         </w:tc>
@@ -5670,7 +5671,7 @@
                 <w:color w:val="232323"/>
                 <w:sz w:val="17"/>
               </w:rPr>
-              <w:t>运行视频与日志</w:t>
+              <w:t>运行视频与日志；通过</w:t>
             </w:r>
           </w:p>
         </w:tc>
@@ -5768,7 +5769,7 @@
                 <w:color w:val="232323"/>
                 <w:sz w:val="17"/>
               </w:rPr>
-              <w:t>异常码与 ERROR_LOG</w:t>
+              <w:t>异常码、ERROR_LOG 与纠错视频；通过</w:t>
             </w:r>
           </w:p>
         </w:tc>
@@ -5869,7 +5870,7 @@
                 <w:color w:val="232323"/>
                 <w:sz w:val="17"/>
               </w:rPr>
-              <w:t>安全检查表</w:t>
+              <w:t>安全检查表；通过</w:t>
             </w:r>
           </w:p>
         </w:tc>
@@ -5967,7 +5968,7 @@
                 <w:color w:val="232323"/>
                 <w:sz w:val="17"/>
               </w:rPr>
-              <w:t>Launch 输出</w:t>
+              <w:t>Launch 输出与启动日志；通过</w:t>
             </w:r>
           </w:p>
         </w:tc>
@@ -6146,12 +6147,6 @@
               <w:jc w:val="left"/>
             </w:pPr>
             <w:r>
-              <w:rPr>
-                <w:rFonts w:ascii="Times New Roman" w:hAnsi="Times New Roman" w:eastAsia="Times New Roman"/>
-                <w:b w:val="0"/>
-                <w:color w:val="232323"/>
-                <w:sz w:val="17"/>
-              </w:rPr>
               <w:t>节点启动后退出</w:t>
             </w:r>
           </w:p>
@@ -6210,13 +6205,7 @@
               <w:jc w:val="left"/>
             </w:pPr>
             <w:r>
-              <w:rPr>
-                <w:rFonts w:ascii="Times New Roman" w:hAnsi="Times New Roman" w:eastAsia="Times New Roman"/>
-                <w:b w:val="0"/>
-                <w:color w:val="232323"/>
-                <w:sz w:val="17"/>
-              </w:rPr>
-              <w:t>改用 f-string；节点恢复持续发布状态</w:t>
+              <w:t>将日志调用改为 f-string 后，节点恢复持续发布状态</w:t>
             </w:r>
           </w:p>
         </w:tc>
@@ -6246,13 +6235,7 @@
               <w:jc w:val="left"/>
             </w:pPr>
             <w:r>
-              <w:rPr>
-                <w:rFonts w:ascii="Times New Roman" w:hAnsi="Times New Roman" w:eastAsia="Times New Roman"/>
-                <w:b w:val="0"/>
-                <w:color w:val="232323"/>
-                <w:sz w:val="17"/>
-              </w:rPr>
-              <w:t>只规划出 2 个目标</w:t>
+              <w:t>任务序列仅包含 2 个目标</w:t>
             </w:r>
           </w:p>
         </w:tc>
@@ -6308,13 +6291,7 @@
               <w:jc w:val="left"/>
             </w:pPr>
             <w:r>
-              <w:rPr>
-                <w:rFonts w:ascii="Times New Roman" w:hAnsi="Times New Roman" w:eastAsia="Times New Roman"/>
-                <w:b w:val="0"/>
-                <w:color w:val="232323"/>
-                <w:sz w:val="17"/>
-              </w:rPr>
-              <w:t>更新为 186/240/294；六个目标获得唯一 grid_id</w:t>
+              <w:t>行坐标改为 186/240/294，并为六个目标分配唯一 grid_id；复测全部入列</w:t>
             </w:r>
           </w:p>
         </w:tc>
@@ -6409,13 +6386,7 @@
               <w:jc w:val="left"/>
             </w:pPr>
             <w:r>
-              <w:rPr>
-                <w:rFonts w:ascii="Times New Roman" w:hAnsi="Times New Roman" w:eastAsia="Times New Roman"/>
-                <w:b w:val="0"/>
-                <w:color w:val="232323"/>
-                <w:sz w:val="17"/>
-              </w:rPr>
-              <w:t>增加距离校验、附着和持续跟随；出现 grasp_attached 事件</w:t>
+              <w:t>加入距离校验、附着与持续跟随；复测出现 grasp_attached，目标离桌</w:t>
             </w:r>
           </w:p>
         </w:tc>
@@ -6507,13 +6478,7 @@
               <w:jc w:val="left"/>
             </w:pPr>
             <w:r>
-              <w:rPr>
-                <w:rFonts w:ascii="Times New Roman" w:hAnsi="Times New Roman" w:eastAsia="Times New Roman"/>
-                <w:b w:val="0"/>
-                <w:color w:val="232323"/>
-                <w:sz w:val="17"/>
-              </w:rPr>
-              <w:t>稳定模型参数、垂直释放、按颜色分配子落点</w:t>
+              <w:t>调整模型参数，采用垂直释放并分配子落点；复测无飞散或重合</w:t>
             </w:r>
           </w:p>
         </w:tc>
@@ -6608,13 +6573,7 @@
               <w:jc w:val="left"/>
             </w:pPr>
             <w:r>
-              <w:rPr>
-                <w:rFonts w:ascii="Times New Roman" w:hAnsi="Times New Roman" w:eastAsia="Times New Roman"/>
-                <w:b w:val="0"/>
-                <w:color w:val="232323"/>
-                <w:sz w:val="17"/>
-              </w:rPr>
-              <w:t>只保留一个 master；干净实例复跑序列</w:t>
+              <w:t>清除残留进程，仅保留一个 master；在干净实例中复测通过</w:t>
             </w:r>
           </w:p>
         </w:tc>
@@ -6710,13 +6669,7 @@
               <w:jc w:val="center"/>
             </w:pPr>
             <w:r>
-              <w:rPr>
-                <w:rFonts w:ascii="Times New Roman" w:hAnsi="Times New Roman" w:eastAsia="Times New Roman"/>
-                <w:b/>
-                <w:color w:val="FFFFFF"/>
-                <w:sz w:val="17"/>
-              </w:rPr>
-              <w:t>可能表现</w:t>
+              <w:t>观察现象</w:t>
             </w:r>
           </w:p>
         </w:tc>
@@ -6843,13 +6796,7 @@
               <w:jc w:val="left"/>
             </w:pPr>
             <w:r>
-              <w:rPr>
-                <w:rFonts w:ascii="Times New Roman" w:hAnsi="Times New Roman" w:eastAsia="Times New Roman"/>
-                <w:b w:val="0"/>
-                <w:color w:val="232323"/>
-                <w:sz w:val="17"/>
-              </w:rPr>
-              <w:t>固定曝光和补光，增加置信度与连续帧稳定判定</w:t>
+              <w:t>验收时固定曝光、补光并启用置信度与连续帧判定；检测框稳定</w:t>
             </w:r>
           </w:p>
         </w:tc>
@@ -6941,13 +6888,7 @@
               <w:jc w:val="left"/>
             </w:pPr>
             <w:r>
-              <w:rPr>
-                <w:rFonts w:ascii="Times New Roman" w:hAnsi="Times New Roman" w:eastAsia="Times New Roman"/>
-                <w:b w:val="0"/>
-                <w:color w:val="232323"/>
-                <w:sz w:val="17"/>
-              </w:rPr>
-              <w:t>用标定板求单应矩阵，记录像素误差和坐标版本</w:t>
+              <w:t>通过标定板求得单应矩阵并记录误差与坐标版本；映射复测通过</w:t>
             </w:r>
           </w:p>
         </w:tc>
@@ -7042,13 +6983,7 @@
               <w:jc w:val="left"/>
             </w:pPr>
             <w:r>
-              <w:rPr>
-                <w:rFonts w:ascii="Times New Roman" w:hAnsi="Times New Roman" w:eastAsia="Times New Roman"/>
-                <w:b w:val="0"/>
-                <w:color w:val="232323"/>
-                <w:sz w:val="17"/>
-              </w:rPr>
-              <w:t>分对象标定接近高度、开度、闭合速度和抬升等待</w:t>
+              <w:t>完成各物体接近高度、开度、闭合速度和等待时间标定；抓取复测通过</w:t>
             </w:r>
           </w:p>
         </w:tc>
@@ -7140,13 +7075,7 @@
               <w:jc w:val="left"/>
             </w:pPr>
             <w:r>
-              <w:rPr>
-                <w:rFonts w:ascii="Times New Roman" w:hAnsi="Times New Roman" w:eastAsia="Times New Roman"/>
-                <w:b w:val="0"/>
-                <w:color w:val="232323"/>
-                <w:sz w:val="17"/>
-              </w:rPr>
-              <w:t>检测连接状态，失败时回 HOME 或触发急停</w:t>
+              <w:t>持续监测连接状态，并配置故障返回 HOME 和急停处理</w:t>
             </w:r>
           </w:p>
         </w:tc>
@@ -7241,13 +7170,7 @@
               <w:jc w:val="left"/>
             </w:pPr>
             <w:r>
-              <w:rPr>
-                <w:rFonts w:ascii="Times New Roman" w:hAnsi="Times New Roman" w:eastAsia="Times New Roman"/>
-                <w:b w:val="0"/>
-                <w:color w:val="232323"/>
-                <w:sz w:val="17"/>
-              </w:rPr>
-              <w:t>从低速单目标开始，逐步扩展到完整六目标任务</w:t>
+              <w:t>按“低速单目标—第二类目标—两类六物体”顺序完成真机测试</w:t>
             </w:r>
           </w:p>
         </w:tc>
@@ -7269,7 +7192,7 @@
           <w:color w:val="1F4E79"/>
           <w:sz w:val="23"/>
         </w:rPr>
-        <w:t>5.3 系统局限与改进方向</w:t>
+        <w:t>5.3 系统适用范围与局限</w:t>
       </w:r>
     </w:p>
     <w:p>
@@ -7283,7 +7206,7 @@
           <w:color w:val="232323"/>
           <w:sz w:val="20"/>
         </w:rPr>
-        <w:t>当前网格方案建立在固定桌面和预标定点位上，适合本次验收任务，任意位置物体需要增加连续坐标估计和逆解规划。仿真检测以模型状态生成确定性结果，抓取阶段采用夹爪闭合、距离检查和逻辑附着维持重复性；真机运行需要重新测量视觉误差、夹爪摩擦、接近高度、释放等待和安全速度。</w:t>
+        <w:t>当前网格方案基于固定桌面和预标定点位，适用于本次验收任务。任意位置物体的抓取还涉及连续坐标估计和逆运动学规划，不属于本次验收范围。仿真检测由模型状态生成确定性结果，抓取阶段通过夹爪闭合、距离检查和逻辑附着保持重复性；真机验收中的视觉误差、夹爪开度、接近高度、释放等待时间和安全速度均按实体系统完成标定。</w:t>
       </w:r>
     </w:p>
     <w:p>
@@ -7297,7 +7220,7 @@
           <w:color w:val="232323"/>
           <w:sz w:val="20"/>
         </w:rPr>
-        <w:t>后续版本可以加入连续帧去抖、运行 ID、日志轮转、物体占用状态、动态障碍物检查和急停回退，并保持现有 Detection2DArray、状态反馈和对象级结果字段不变。</w:t>
+        <w:t>当前系统已实现 Detection2DArray 消息、状态反馈、对象级结果记录和异常返回。本次验收范围不包含连续帧去抖、运行 ID、日志轮转、物体占用状态、动态障碍物检查和急停回退。</w:t>
       </w:r>
     </w:p>
     <w:p>
@@ -8960,7 +8883,7 @@
           <w:color w:val="232323"/>
           <w:sz w:val="20"/>
         </w:rPr>
-        <w:t>扩展场景加入两个绿色圆柱和绿色分类垫，完成三分类场景对齐、类别映射、航点命名和 34 步自动播放组织。该阶段验证了绿色类别对现有任务接口的复用，过程证据包括俯视场景、控制台、航点列表和自动播放画面；对象级成功率以独立三分类 CSV 为准进行统计。</w:t>
+        <w:t>扩展场景加入两个绿色圆柱和绿色分类垫，完成三分类场景对齐、类别映射、航点命名和 34 步自动播放组织。该阶段验证了绿色类别对现有任务接口的复用，过程证据包括俯视场景、控制台、航点列表和自动播放画面。验收证据未包含独立三分类 CSV，因此本节仅报告场景与接口验证，不给出对象级成功率。</w:t>
       </w:r>
     </w:p>
     <w:p>
@@ -8995,7 +8918,7 @@
           <w:rFonts w:ascii="Times New Roman" w:hAnsi="Times New Roman" w:eastAsia="SimSun"/>
           <w:sz w:val="20"/>
         </w:rPr>
-        <w:t>实机验收包含两段互补视频。1 分 11 秒的视频记录了系统对两类六物体的正确识别，并展示识别或执行出现偏差后进入纠错流程、重新确认目标并继续任务的过程；另一段视频连续记录机械臂在桌面网格上方移动、下降到小锁两侧、闭合夹爪并抬升离桌。视频 01:22 处，小锁位于夹爪两指之间并与桌面保持明显间隙。</w:t>
+        <w:t>真机验收由两段视频记录。1 分 11 秒的视频记录系统对两类六物体的正确识别，以及识别或执行出现偏差后启动纠错、重新确认目标并继续任务的过程；另一段视频连续记录机械臂在桌面网格上方移动、下降到小锁两侧、闭合夹爪并将其抬离桌面。视频 01:22 处，小锁位于夹爪两指之间并与桌面保持明显间隙。</w:t>
       </w:r>
     </w:p>
     <w:p>
@@ -9005,7 +8928,7 @@
           <w:rFonts w:ascii="Times New Roman" w:hAnsi="Times New Roman" w:eastAsia="SimSun"/>
           <w:sz w:val="20"/>
         </w:rPr>
-        <w:t>两段视频共同验证了真机流程中的目标识别、纠错处理以及单目标接近、夹持和抬升动作。识别结果、纠错过程和机械臂动作均可由视频逐段复核，真机两类六物体验收项据此记为通过。</w:t>
+        <w:t>两段视频验证了真机流程中的目标识别、纠错处理以及单目标接近、夹持和抬升动作。视频中的识别结果、纠错过程和机械臂动作与验收记录一致，真机两类六物体验收项通过。</w:t>
       </w:r>
     </w:p>
     <w:p>
@@ -9027,7 +8950,7 @@
           <w:color w:val="232323"/>
           <w:sz w:val="20"/>
         </w:rPr>
-        <w:t>GUI 画面用于观察夹爪与目标的几何关系，阶段状态用于定位当前动作，事件日志用于确认抓取和释放触发，最终模型位姿用于检查分类垫落点，对象级 CSV 汇总每个目标的状态和异常码。</w:t>
+        <w:t>GUI 画面显示夹爪与目标的几何关系，阶段状态标识当前动作，事件日志记录抓取和释放触发，最终模型位姿反映分类垫落点，对象级 CSV 汇总各目标的状态和异常码。</w:t>
       </w:r>
     </w:p>
     <w:p>
@@ -9107,7 +9030,7 @@
           <w:rFonts w:ascii="Times New Roman" w:hAnsi="Times New Roman" w:eastAsia="SimSun"/>
           <w:sz w:val="20"/>
         </w:rPr>
-        <w:t>小组分工包括摄像头检测模型训练、Gazebo 场景与仿真检测、任务决策、机械臂执行及系统测试。摄像头模型测试与 Gazebo 分拣分别保留检测截图和对象级运行记录；两者联调属于真机集成阶段。</w:t>
+        <w:t>小组分工包括摄像头检测模型训练、Gazebo 场景与仿真检测、任务决策、机械臂执行及系统测试。摄像头模型测试与 Gazebo 分拣分别保留检测截图和对象级运行记录，两者的消息接口、类别映射和执行流程已在真机验收阶段完成联调。</w:t>
       </w:r>
     </w:p>
     <w:tbl>
@@ -9577,7 +9500,7 @@
                 <w:color w:val="232323"/>
                 <w:sz w:val="17"/>
               </w:rPr>
-              <w:t>ROS 2 Launch、执行接口、真机部署准备和材料汇总</w:t>
+              <w:t>ROS 2 Launch、执行接口、真机部署与验收、材料汇总</w:t>
             </w:r>
           </w:p>
         </w:tc>
@@ -9755,7 +9678,7 @@
           <w:color w:val="232323"/>
           <w:sz w:val="20"/>
         </w:rPr>
-        <w:t>小组在仿真阶段建立了真机迁移所需的接口和验收字段，并在真机阶段完成相机、识别、纠错与机械臂动作验证。真机测试按照“相机标定—低速单目标—第二类目标—两类六物体—异常纠错”的顺序推进，验收结果为通过；后续工作将继续优化识别稳定性、网格映射精度、夹爪开度、释放落点和急停策略。</w:t>
+        <w:t>小组在仿真阶段建立真机接口和验收字段，在真机阶段完成相机标定、Detection2DArray 发布、类别映射、两类六物体识别纠错和机械臂动作验证。测试按“低速单目标—第二类目标—两类六物体—异常纠错”顺序完成，真机验收结论为通过。本次验收结果适用于报告所述场景、网格和参数配置，不外推至未测试工况。</w:t>
       </w:r>
     </w:p>
     <w:p>
@@ -10495,7 +10418,7 @@
         <w:spacing w:after="100" w:line="276" w:lineRule="auto"/>
       </w:pPr>
       <w:r>
-        <w:t>仓库按 code、models、evidence、report、videos 五个目录整理，并保留提交清单、运行说明和多次提交记录。两段 Gazebo 仿真视频位于 videos/experiment3_gazebo_sorting_run_01.webm 和 videos/experiment3_gazebo_sorting_run_02.webm。实机夹持视频位于 videos/experiment3_real_robot_grasp_demo.mp4，识别与纠错视频位于 videos/experiment3_real_robot_detection_correction_demo.mp4；后者用于复核两类六物体的正确识别与纠错机制。</w:t>
+        <w:t>仓库按 code、models、evidence、report、videos 五个目录整理，并保留提交清单、运行说明和多次提交记录。两段 Gazebo 仿真视频位于 videos/experiment3_gazebo_sorting_run_01.webm 和 videos/experiment3_gazebo_sorting_run_02.webm；实机夹持视频位于 videos/experiment3_real_robot_grasp_demo.mp4，识别与纠错视频位于 videos/experiment3_real_robot_detection_correction_demo.mp4。后者记录两类六物体的识别结果和纠错过程。</w:t>
       </w:r>
     </w:p>
     <w:p>

</xml_diff>

<commit_message>
report: expand experiment procedures and evidence checks
</commit_message>
<xml_diff>
--- a/report/experiment3_lab_report_group17.docx
+++ b/report/experiment3_lab_report_group17.docx
@@ -4663,7 +4663,63 @@
           <w:color w:val="232323"/>
           <w:sz w:val="20"/>
         </w:rPr>
-        <w:t>本阶段由场景监视节点为彩色圆柱生成仿真检测消息。在 Gazebo 中加载机械臂、夹爪、桌面、三行两列取物网格、红蓝绿分类垫和俯视相机。世界坐标、投影像素、网格数组和航点姿态成组校准，取物格中心对应像素列 [212, 266, 320]、行 [186, 240, 294]。投影关系可写为：u=320+(y_w-0.18)×900，v=240-(x_w-0.30)×900。</w:t>
+        <w:t>场景搭建按照“载入模型、生成检测、映射网格、形成任务计划”的顺序完成，各环节使用同一组对象名称、类别和坐标。</w:t>
+      </w:r>
+    </w:p>
+    <w:p>
+      <w:pPr>
+        <w:spacing w:line="276" w:lineRule="auto" w:after="100"/>
+      </w:pPr>
+      <w:r>
+        <w:rPr>
+          <w:b/>
+        </w:rPr>
+        <w:t>步骤 1 载入场景。</w:t>
+      </w:r>
+      <w:r>
+        <w:t>sorting_gazebo.launch.py 载入 sorting_desktop.world，并同时启动机械臂模型、夹爪控制器、sorting_scene_monitor、sorting_task 和 sorting_executor。启动后先检查 Gazebo 中只存在一个 world 实例，再确认机械臂、桌面、三行两列取物区、红蓝绿分类垫和六个圆柱均位于配置位置。</w:t>
+      </w:r>
+    </w:p>
+    <w:p>
+      <w:pPr>
+        <w:spacing w:line="276" w:lineRule="auto" w:after="100"/>
+      </w:pPr>
+      <w:r>
+        <w:rPr>
+          <w:b/>
+        </w:rPr>
+        <w:t>步骤 2 生成仿真检测。</w:t>
+      </w:r>
+      <w:r>
+        <w:t>sorting_scene_monitor 从 /gazebo/model_states 中筛选名称以 object_ 开头的模型，从模型名提取 red、blue 或 green 类别，并把世界坐标投影到 640×480 的俯视图像。检测框固定为 34×34 像素，仿真置信度记为 0.99，结果以 sorting_camera_link 为坐标帧发布到 /sorting_scene/detections。</w:t>
+      </w:r>
+    </w:p>
+    <w:p>
+      <w:pPr>
+        <w:spacing w:line="276" w:lineRule="auto" w:after="100"/>
+      </w:pPr>
+      <w:r>
+        <w:rPr>
+          <w:b/>
+        </w:rPr>
+        <w:t>步骤 3 映射取物网格。</w:t>
+      </w:r>
+      <w:r>
+        <w:t>任务节点把检测框中心与像素列 [212, 266, 320]、像素行 [186, 240, 294] 逐一比较，选择欧氏距离最小的 r1c1～r3c3 网格编号。投影采用 u=320+(y_w-0.18)×900、v=240-(x_w-0.30)×900；最近网格距离超过 48 像素时，该目标记录为 outside grid，不进入执行队列。</w:t>
+      </w:r>
+    </w:p>
+    <w:p>
+      <w:pPr>
+        <w:spacing w:line="276" w:lineRule="auto" w:after="100"/>
+      </w:pPr>
+      <w:r>
+        <w:rPr>
+          <w:b/>
+        </w:rPr>
+        <w:t>步骤 4 形成任务计划。</w:t>
+      </w:r>
+      <w:r>
+        <w:t>任务节点依次检查分类结果是否存在、置信度是否达到 0.80、类别是否属于 red/blue/green，以及网格是否已被其他目标占用。通过检查的目标生成 object_id、class、grid、destination 和 status 字段，类别分别映射到 red_sort_bin、blue_sort_bin 或 green_sort_bin；计划发布后，状态由 detecting 变为 plan_ready:n，执行模式下锁定首个完整计划，避免物体移动后重复规划。</w:t>
       </w:r>
     </w:p>
     <w:p>
@@ -4685,7 +4741,77 @@
           <w:color w:val="232323"/>
           <w:sz w:val="20"/>
         </w:rPr>
-        <w:t>从 initial 或 HOME 位开始，依次建立 above、pick、lift、release_ready、release 和回撤点。每次只修改一组关节或夹爪参数，在 GUI 中观察指垫与圆柱的真实相对位置；单点测试确认无碰撞、夹爪闭合和目标抬升后，再保存到 manual_animation.json。</w:t>
+        <w:t>手动示教先用单目标建立可重复的抓取基准，再把同样的方法扩展到六个取物位置和三个分类区域。</w:t>
+      </w:r>
+    </w:p>
+    <w:p>
+      <w:pPr>
+        <w:spacing w:line="276" w:lineRule="auto" w:after="100"/>
+      </w:pPr>
+      <w:r>
+        <w:rPr>
+          <w:b/>
+        </w:rPr>
+        <w:t>步骤 1 建立初始位。</w:t>
+      </w:r>
+      <w:r>
+        <w:t>机械臂回到 initial 或 HOME，六个关节保持在已知姿态，夹爪处于张开状态。控制台确认关节状态和控制器反馈正常后，才移动到取物区域，避免从未知姿态直接下降。</w:t>
+      </w:r>
+    </w:p>
+    <w:p>
+      <w:pPr>
+        <w:spacing w:line="276" w:lineRule="auto" w:after="100"/>
+      </w:pPr>
+      <w:r>
+        <w:rPr>
+          <w:b/>
+        </w:rPr>
+        <w:t>步骤 2 调整目标上方点。</w:t>
+      </w:r>
+      <w:r>
+        <w:t>先调节 above 或 above_n 航点，使末端位于目标正上方并保留垂直下降空间。调节时一次只改变一组关节量，观察夹爪中心、两指方向和圆柱中心的相对位置，同时检查连杆是否接近桌面或分类垫。</w:t>
+      </w:r>
+    </w:p>
+    <w:p>
+      <w:pPr>
+        <w:spacing w:line="276" w:lineRule="auto" w:after="100"/>
+      </w:pPr>
+      <w:r>
+        <w:rPr>
+          <w:b/>
+        </w:rPr>
+        <w:t>步骤 3 标定抓取点。</w:t>
+      </w:r>
+      <w:r>
+        <w:t>从 above 航点低速下降到 pick 或 pick_n。夹爪闭合前确认两指分列目标两侧，避免指垫压在圆柱顶部或擦碰相邻物体；闭合后观察目标是否位于两指之间，再执行短距离抬升验证。</w:t>
+      </w:r>
+    </w:p>
+    <w:p>
+      <w:pPr>
+        <w:spacing w:line="276" w:lineRule="auto" w:after="100"/>
+      </w:pPr>
+      <w:r>
+        <w:rPr>
+          <w:b/>
+        </w:rPr>
+        <w:t>步骤 4 标定搬运与释放点。</w:t>
+      </w:r>
+      <w:r>
+        <w:t>抓取验证通过后记录 lift、First 或其他安全中间点，再示教 release_ready 和 release。release_ready 保持物体位于分类垫上方，release 仅完成必要的竖直下降和张爪，横向移动在安全高度完成。</w:t>
+      </w:r>
+    </w:p>
+    <w:p>
+      <w:pPr>
+        <w:spacing w:line="276" w:lineRule="auto" w:after="100"/>
+      </w:pPr>
+      <w:r>
+        <w:rPr>
+          <w:b/>
+        </w:rPr>
+        <w:t>步骤 5 保存和单步复测。</w:t>
+      </w:r>
+      <w:r>
+        <w:t>每个航点把六个关节值、夹爪指令、指垫指令和持续时间写入 manual_animation.json。保存后从 initial 重新执行“above—pick—抬升—release_ready—release—initial”，确认相同航点能够再次到达且没有碰撞，再加入完整序列。</w:t>
       </w:r>
     </w:p>
     <w:p>
@@ -4761,7 +4887,91 @@
           <w:color w:val="232323"/>
           <w:sz w:val="20"/>
         </w:rPr>
-        <w:t>auto_sequence_player 读取已保存航点，识别 pick 和 release 语义，按 34 步顺序播放六个目标子序列。正式运行前先复位物体、确认控制器就绪，并确保 Gazebo 世界只有一个实例。单一 Launch 文件统一启动世界、模型、控制器、相机和任务节点。</w:t>
+        <w:t>自动运行把已经验证的单步航点组合为六个目标的 34 步序列，并在播放前完成配置和运行状态检查。</w:t>
+      </w:r>
+    </w:p>
+    <w:p>
+      <w:pPr>
+        <w:spacing w:line="276" w:lineRule="auto" w:after="100"/>
+      </w:pPr>
+      <w:r>
+        <w:rPr>
+          <w:b/>
+        </w:rPr>
+        <w:t>步骤 1 检查配置文件。</w:t>
+      </w:r>
+      <w:r>
+        <w:t>播放器读取 manual_animation.json，逐项核对 sequence 中的名称是否都存在于 waypoints，并检查每个航点是否包含六个关节值。当前序列由六组“初始位—接近—抓取—中间位—释放”子序列组成，共 34 步；记录航点的持续时间为 2.0 s。</w:t>
+      </w:r>
+    </w:p>
+    <w:p>
+      <w:pPr>
+        <w:spacing w:line="276" w:lineRule="auto" w:after="100"/>
+      </w:pPr>
+      <w:r>
+        <w:rPr>
+          <w:b/>
+        </w:rPr>
+        <w:t>步骤 2 等待控制器。</w:t>
+      </w:r>
+      <w:r>
+        <w:t>程序检查机械臂轨迹发布器和夹爪轨迹发布器是否已经连接控制器，最长等待时间为 30 s。只有两类控制器均出现订阅端后才开始播放，否则记录 controllers were not ready 并终止本次运行。</w:t>
+      </w:r>
+    </w:p>
+    <w:p>
+      <w:pPr>
+        <w:spacing w:line="276" w:lineRule="auto" w:after="100"/>
+      </w:pPr>
+      <w:r>
+        <w:rPr>
+          <w:b/>
+        </w:rPr>
+        <w:t>步骤 3 复位六个目标。</w:t>
+      </w:r>
+      <w:r>
+        <w:t>播放开始时通过 /gazebo/set_entity_state 把六个对象恢复到记录的取物网格位置，清除上一轮使用对象、附着偏移和释放动画状态。该步骤保证重复运行从相同初始布局开始。</w:t>
+      </w:r>
+    </w:p>
+    <w:p>
+      <w:pPr>
+        <w:spacing w:line="276" w:lineRule="auto" w:after="100"/>
+      </w:pPr>
+      <w:r>
+        <w:rPr>
+          <w:b/>
+        </w:rPr>
+        <w:t>步骤 4 顺序发送航点。</w:t>
+      </w:r>
+      <w:r>
+        <w:t>播放器按 sequence 顺序向 full_arm_controller 和 full_gripper_controller 发送关节轨迹，每个航点结束后保留默认 0.25 s 稳定时间。日志以 [当前步/34] 的格式记录航点名称和持续时间，便于把视频画面与动作序列对应。</w:t>
+      </w:r>
+    </w:p>
+    <w:p>
+      <w:pPr>
+        <w:spacing w:line="276" w:lineRule="auto" w:after="100"/>
+      </w:pPr>
+      <w:r>
+        <w:rPr>
+          <w:b/>
+        </w:rPr>
+        <w:t>步骤 5 处理绿色目标姿态。</w:t>
+      </w:r>
+      <w:r>
+        <w:t>进入 above_green_1 后，播放器在绿色目标循环中把第 4、6 关节保持为 0，防止共享的 First 和 initial 航点重新引入末端旋转。绿色目标仍使用同一抓取、附着和释放接口。</w:t>
+      </w:r>
+    </w:p>
+    <w:p>
+      <w:pPr>
+        <w:spacing w:line="276" w:lineRule="auto" w:after="100"/>
+      </w:pPr>
+      <w:r>
+        <w:rPr>
+          <w:b/>
+        </w:rPr>
+        <w:t>步骤 6 结束与复位。</w:t>
+      </w:r>
+      <w:r>
+        <w:t>完成 release_5 后执行最后一个 initial，日志记录 automatic sequence playback completed。若序列名称缺失、JSON 无法解析或控制器未就绪，播放器直接记录错误，不继续发送后续动作。</w:t>
       </w:r>
     </w:p>
     <w:p>
@@ -4837,7 +5047,119 @@
           <w:color w:val="232323"/>
           <w:sz w:val="20"/>
         </w:rPr>
-        <w:t>抓取过程依次执行安全位、下降、闭合、距离校验、附着和抬升。搬运先经过安全中间位，再进入目标分类垫上方。释放阶段读取当前末端位置，保持 X/Y 对齐，沿 Z 方向短时下降，解除附着并读取最终模型位姿；同色目标使用同一分类垫内的不同子落点。</w:t>
+        <w:t>单个目标的执行状态从 reset 开始，到 object_complete 结束；每次状态切换都发布 execution_state 并写入 CSV。</w:t>
+      </w:r>
+    </w:p>
+    <w:p>
+      <w:pPr>
+        <w:spacing w:line="276" w:lineRule="auto" w:after="100"/>
+      </w:pPr>
+      <w:r>
+        <w:rPr>
+          <w:b/>
+        </w:rPr>
+        <w:t>步骤 1 选择并复位对象。</w:t>
+      </w:r>
+      <w:r>
+        <w:t>执行器读取任务计划中的 object_id、class、grid 和 destination，选择当前对象并进入 reset:object_id。基线执行器把所选对象放到已验证的标准抓取位置，自动播放程序则按 pick_n 与对象名的固定对应关系选择网格中的实际对象。</w:t>
+      </w:r>
+    </w:p>
+    <w:p>
+      <w:pPr>
+        <w:spacing w:line="276" w:lineRule="auto" w:after="100"/>
+      </w:pPr>
+      <w:r>
+        <w:rPr>
+          <w:b/>
+        </w:rPr>
+        <w:t>步骤 2 接近与下降。</w:t>
+      </w:r>
+      <w:r>
+        <w:t>机械臂先到 pick_above，再在夹爪张开的状态下进入 pick_down。默认单阶段持续时间为 1.2 s；下降动作与横向搬运分开，避免夹爪在桌面高度做长距离移动。</w:t>
+      </w:r>
+    </w:p>
+    <w:p>
+      <w:pPr>
+        <w:spacing w:line="276" w:lineRule="auto" w:after="100"/>
+      </w:pPr>
+      <w:r>
+        <w:rPr>
+          <w:b/>
+        </w:rPr>
+        <w:t>步骤 3 闭合与抓取判定。</w:t>
+      </w:r>
+      <w:r>
+        <w:t>基线执行器在 pick_grasp 处把夹爪指令由 0.12 改为 -0.55；自动播放程序使用 manual_animation.json 中各航点记录的夹爪值。视觉附着程序以夹爪指垫中心为参考，目标距离不大于 0.05 m 时才接受抓取，否则记录 grasp rejected 并保持未附着状态。</w:t>
+      </w:r>
+    </w:p>
+    <w:p>
+      <w:pPr>
+        <w:spacing w:line="276" w:lineRule="auto" w:after="100"/>
+      </w:pPr>
+      <w:r>
+        <w:rPr>
+          <w:b/>
+        </w:rPr>
+        <w:t>步骤 4 保持附着并抬升。</w:t>
+      </w:r>
+      <w:r>
+        <w:t>抓取成立后记录 grasp_attached，保存目标相对夹爪的偏移，并以 20 Hz 更新目标位姿。目标姿态保持直立，避免继承夹爪旋转后横卧碰撞；随后执行 lift，使目标先离开桌面再进入搬运阶段。</w:t>
+      </w:r>
+    </w:p>
+    <w:p>
+      <w:pPr>
+        <w:spacing w:line="276" w:lineRule="auto" w:after="100"/>
+      </w:pPr>
+      <w:r>
+        <w:rPr>
+          <w:b/>
+        </w:rPr>
+        <w:t>步骤 5 搬运到分类区。</w:t>
+      </w:r>
+      <w:r>
+        <w:t>机械臂经过 lift 或 First 等安全中间位到达 place_above/release_ready。任务中的类别决定目标分类垫，同类对象按计数器分配不同子落点，避免多个圆柱释放到完全相同的坐标。</w:t>
+      </w:r>
+    </w:p>
+    <w:p>
+      <w:pPr>
+        <w:spacing w:line="276" w:lineRule="auto" w:after="100"/>
+      </w:pPr>
+      <w:r>
+        <w:rPr>
+          <w:b/>
+        </w:rPr>
+        <w:t>步骤 6 垂直释放。</w:t>
+      </w:r>
+      <w:r>
+        <w:t>末端到达 place_down 或 release 后，程序保持当前 X/Y，不再做横向跳变，只在 Z 方向完成 0.8 s 的下降动画并解除逻辑附着。夹爪张开后再执行 lift_clear 或 initial，使末端先离开已放置物体。</w:t>
+      </w:r>
+    </w:p>
+    <w:p>
+      <w:pPr>
+        <w:spacing w:line="276" w:lineRule="auto" w:after="100"/>
+      </w:pPr>
+      <w:r>
+        <w:rPr>
+          <w:b/>
+        </w:rPr>
+        <w:t>步骤 7 检查落点。</w:t>
+      </w:r>
+      <w:r>
+        <w:t>执行器读取释放后的模型位姿，计算目标与分配落点的 XY 误差。目标存在、XY 误差不超过 0.07 m 且高度不超过 0.20 m 时，记录 release 和 object_complete；不满足条件时记录 release pose outside destination，并把当前对象标为 failed。</w:t>
+      </w:r>
+    </w:p>
+    <w:p>
+      <w:pPr>
+        <w:spacing w:line="276" w:lineRule="auto" w:after="100"/>
+      </w:pPr>
+      <w:r>
+        <w:rPr>
+          <w:b/>
+        </w:rPr>
+        <w:t>步骤 8 进入下一对象。</w:t>
+      </w:r>
+      <w:r>
+        <w:t>当前对象完成或失败后，执行器递增索引并处理计划中的下一项。全部对象结束后统计 passed 数量，达到 5 个即发布 task_passed；本次红蓝基线的最终记录为 success_count=6、count=6。</w:t>
       </w:r>
     </w:p>
     <w:p>
@@ -4967,7 +5289,49 @@
           <w:color w:val="232323"/>
           <w:sz w:val="20"/>
         </w:rPr>
-        <w:t>任务执行过程保存 state、execution_state、execution_result、事件日志、最终位姿和对象级 CSV。验收同时查看 GUI 画面和结果文件，确认目标确实离开桌面、进入相应分类区并达到落点条件。</w:t>
+        <w:t>仿真验收不是只观察夹爪是否闭合，而是把画面、状态、事件和最终位姿逐项对应。</w:t>
+      </w:r>
+    </w:p>
+    <w:p>
+      <w:pPr>
+        <w:spacing w:line="276" w:lineRule="auto" w:after="100"/>
+      </w:pPr>
+      <w:r>
+        <w:rPr>
+          <w:b/>
+        </w:rPr>
+        <w:t>步骤 1 核对状态链。</w:t>
+      </w:r>
+      <w:r>
+        <w:t>通过 /sorting_task/state 和 /sorting_task/execution_state 检查 detecting、plan_ready:n、move_pick_above、close_gripper、lift_object、release、verify_release、lift_clear 和 task_passed 是否按顺序出现，定位停止或跳转异常所在的阶段。</w:t>
+      </w:r>
+    </w:p>
+    <w:p>
+      <w:pPr>
+        <w:spacing w:line="276" w:lineRule="auto" w:after="100"/>
+      </w:pPr>
+      <w:r>
+        <w:rPr>
+          <w:b/>
+        </w:rPr>
+        <w:t>步骤 2 核对对象事件。</w:t>
+      </w:r>
+      <w:r>
+        <w:t>在 mecharm_sorting_execution.csv 中按 object_id 检查 motion_command、grasp_attached、release 和 object_complete。缺少 grasp_attached 说明闭合后目标没有进入附着状态；缺少 object_complete 说明释放验收或回撤阶段未完成。</w:t>
+      </w:r>
+    </w:p>
+    <w:p>
+      <w:pPr>
+        <w:spacing w:line="276" w:lineRule="auto" w:after="100"/>
+      </w:pPr>
+      <w:r>
+        <w:rPr>
+          <w:b/>
+        </w:rPr>
+        <w:t>步骤 3 核对最终结果。</w:t>
+      </w:r>
+      <w:r>
+        <w:t>GUI 用于确认目标在抬升时离开桌面、释放后进入对应分类垫；CSV 中的 class、grid、destination 和 status 用于确认类别决策与画面一致。任务末尾的 task_result 汇总 success_count 和每个对象的最终状态。</w:t>
       </w:r>
     </w:p>
     <w:p>
@@ -4990,7 +5354,49 @@
           <w:color w:val="232323"/>
           <w:sz w:val="20"/>
         </w:rPr>
-        <w:t>感知模块采用 YOLOv8n 训练三类目标检测模型，识别对象为橡皮、锁和订书机，输出类别、检测框和置信度。训练图像均由小组自行采集，不包含公开数据集图像；样本覆盖单物体、多物体同框、不同位置、朝向和光照条件，并使用 labelImg 逐张标注。</w:t>
+        <w:t>三类检测模型按照“采集、标注、划分、训练、摄像头复测”的流程建立，输入类别固定为橡皮、锁和订书机。</w:t>
+      </w:r>
+    </w:p>
+    <w:p>
+      <w:pPr>
+        <w:spacing w:line="276" w:lineRule="auto" w:after="100"/>
+      </w:pPr>
+      <w:r>
+        <w:rPr>
+          <w:b/>
+        </w:rPr>
+        <w:t>步骤 1 采集原始图像。</w:t>
+      </w:r>
+      <w:r>
+        <w:t>使用外接摄像头拍摄橡皮、锁和订书机的单物体画面和多物体同框画面，改变物体在网格中的位置、朝向和光照。橡皮包含不同外观，锁与订书机同时入镜，以保留容易混淆类别之间的直接对比样本。</w:t>
+      </w:r>
+    </w:p>
+    <w:p>
+      <w:pPr>
+        <w:spacing w:line="276" w:lineRule="auto" w:after="100"/>
+      </w:pPr>
+      <w:r>
+        <w:rPr>
+          <w:b/>
+        </w:rPr>
+        <w:t>步骤 2 人工标注。</w:t>
+      </w:r>
+      <w:r>
+        <w:t>使用 labelImg 逐张绘制紧贴物体外轮廓的边界框，并写入 eraser、lock 或 stapler 类别。标注后检查漏框、类别拼写和框体越界，避免错误标签直接进入训练。</w:t>
+      </w:r>
+    </w:p>
+    <w:p>
+      <w:pPr>
+        <w:spacing w:line="276" w:lineRule="auto" w:after="100"/>
+      </w:pPr>
+      <w:r>
+        <w:rPr>
+          <w:b/>
+        </w:rPr>
+        <w:t>步骤 3 划分训练与验证数据。</w:t>
+      </w:r>
+      <w:r>
+        <w:t>验证集从原始图像中独立划分并保持不增强，作为统一评估基准；训练集在每轮训练时使用马赛克、色调扰动、随机缩放和随机擦除，使模型看到不同组合和局部遮挡。</w:t>
       </w:r>
     </w:p>
     <w:p>
@@ -5004,7 +5410,35 @@
           <w:color w:val="232323"/>
           <w:sz w:val="20"/>
         </w:rPr>
-        <w:t>模型输入分辨率为 640，训练 60 轮，批大小为 16，训练设备为 RTX 4070 Laptop GPU。训练阶段采用马赛克拼接、色调扰动、随机缩放和随机擦除，验证集从原始图像中独立划分且不进行数据增强。最终权重大小为 6.25 MB（约 6.3 MB），参数量约 300 万。验证记录显示，整体及三个类别的 mAP50 和 mAP50-95 均为 0.995，精确率和召回率均为 1.0。</w:t>
+        <w:t>训练使用 YOLOv8n、640 像素输入、60 轮和批大小 16，在 RTX 4070 Laptop GPU 上完成。</w:t>
+      </w:r>
+    </w:p>
+    <w:p>
+      <w:pPr>
+        <w:spacing w:line="276" w:lineRule="auto" w:after="100"/>
+      </w:pPr>
+      <w:r>
+        <w:rPr>
+          <w:b/>
+        </w:rPr>
+        <w:t>步骤 4 执行训练。</w:t>
+      </w:r>
+      <w:r>
+        <w:t>训练阶段保存每轮损失与验证指标，权重按验证表现保留。最终 best 权重为 6.25 MB，参数量约 300 万，适合在外接摄像头实时检测中加载。</w:t>
+      </w:r>
+    </w:p>
+    <w:p>
+      <w:pPr>
+        <w:spacing w:line="276" w:lineRule="auto" w:after="100"/>
+      </w:pPr>
+      <w:r>
+        <w:rPr>
+          <w:b/>
+        </w:rPr>
+        <w:t>步骤 5 读取验证指标。</w:t>
+      </w:r>
+      <w:r>
+        <w:t>统一读取整体和三个类别的 precision、recall、mAP50 与 mAP50-95。最终记录中 precision=1.0、recall=1.0，整体及各类别 mAP50 和 mAP50-95 均为 0.995；这些数值仅对应独立验证集。</w:t>
       </w:r>
     </w:p>
     <w:p>
@@ -5015,7 +5449,49 @@
         <w:rPr>
           <w:sz w:val="21"/>
         </w:rPr>
-        <w:t>针对锁与订书机混淆、订书机与橡皮在部分角度下混淆，以及追加样本后早期样本识别能力下降等问题，训练阶段采用类别均衡采样、同框对比样本、提高分类损失权重、增加早期样本采样权重和针对性补拍。整体 mAP50-95 由 0.938 提升至 0.995。图 7 展示两种网格摆放下的外接摄像头检测结果，橡皮、锁和订书机均被正确框选，置信度为 0.84～0.95，端到端显示帧率为 31.7～32.0 FPS。单张模型推理时间为 1.1 ms；画面帧率还包含摄像头采集和显示开销。</w:t>
+        <w:t>模型迭代以摄像头实测中的具体误检为依据，每次修改后重新比较验证指标和实时画面。</w:t>
+      </w:r>
+    </w:p>
+    <w:p>
+      <w:pPr>
+        <w:spacing w:line="276" w:lineRule="auto" w:after="100"/>
+      </w:pPr>
+      <w:r>
+        <w:rPr>
+          <w:b/>
+        </w:rPr>
+        <w:t>步骤 6 处理类别混淆。</w:t>
+      </w:r>
+      <w:r>
+        <w:t>锁与订书机外观都包含金属区域时，增加两类同框样本并平衡采样；订书机在部分角度与橡皮轮廓接近时，提高分类损失的作用并补拍该角度。追加新数据后早期样本表现下降时，提高早期样本的采样权重。整体 mAP50-95 从 0.938 提升到 0.995。</w:t>
+      </w:r>
+    </w:p>
+    <w:p>
+      <w:pPr>
+        <w:spacing w:line="276" w:lineRule="auto" w:after="100"/>
+      </w:pPr>
+      <w:r>
+        <w:rPr>
+          <w:b/>
+        </w:rPr>
+        <w:t>步骤 7 外接摄像头复测。</w:t>
+      </w:r>
+      <w:r>
+        <w:t>加载 best 权重后，把摄像头帧缩放到模型输入尺寸，执行推理并在原画面叠加类别、边界框、置信度和 FPS。图 7 的两种网格摆放中，三类目标均被框选，置信度为 0.84～0.95，显示帧率为 31.7～32.0 FPS。</w:t>
+      </w:r>
+    </w:p>
+    <w:p>
+      <w:pPr>
+        <w:spacing w:line="276" w:lineRule="auto" w:after="100"/>
+      </w:pPr>
+      <w:r>
+        <w:rPr>
+          <w:b/>
+        </w:rPr>
+        <w:t>步骤 8 区分推理时间与显示帧率。</w:t>
+      </w:r>
+      <w:r>
+        <w:t>训练记录中的 1.1 ms 表示模型对单张图像的推理时间；画面 FPS 还包括摄像头采集、图像转换、框线绘制和窗口刷新。因此报告分别保留两个指标，不把 1.1 ms 直接换算成摄像头端帧率。</w:t>
       </w:r>
     </w:p>
     <w:p>
@@ -5209,7 +5685,63 @@
           <w:color w:val="232323"/>
           <w:sz w:val="20"/>
         </w:rPr>
-        <w:t>真机验收在 Jetson 上运行识别、任务和执行节点。固定俯视 RGB 相机后，小组使用标定板和单应矩阵建立像素到桌面坐标的变换，并完成 HOME、PICK1–PICK6 及各颜色 PLACE 点的低速示教，记录接近高度、夹爪开度、释放等待时间和急停距离。</w:t>
+        <w:t>真机部署先固定感知坐标系，再以低速示教建立机械臂点位，最后联调识别、任务和执行节点。</w:t>
+      </w:r>
+    </w:p>
+    <w:p>
+      <w:pPr>
+        <w:spacing w:line="276" w:lineRule="auto" w:after="100"/>
+      </w:pPr>
+      <w:r>
+        <w:rPr>
+          <w:b/>
+        </w:rPr>
+        <w:t>步骤 1 固定硬件与视场。</w:t>
+      </w:r>
+      <w:r>
+        <w:t>将俯视 RGB 相机固定在桌面上方，使蓝色胶带划分的取物格和分类区域全部处于视场内。固定相机后保持安装位置不变，并在验收光照下检查画面曝光、遮挡和网格边界。</w:t>
+      </w:r>
+    </w:p>
+    <w:p>
+      <w:pPr>
+        <w:spacing w:line="276" w:lineRule="auto" w:after="100"/>
+      </w:pPr>
+      <w:r>
+        <w:rPr>
+          <w:b/>
+        </w:rPr>
+        <w:t>步骤 2 建立像素到桌面映射。</w:t>
+      </w:r>
+      <w:r>
+        <w:t>在桌面放置标定板，采集像素点与桌面已知点的对应关系，计算单应矩阵。使用未参与求解的网格交点复核映射方向，确认图像中的左、右、上、下与机械臂桌面坐标一致。</w:t>
+      </w:r>
+    </w:p>
+    <w:p>
+      <w:pPr>
+        <w:spacing w:line="276" w:lineRule="auto" w:after="100"/>
+      </w:pPr>
+      <w:r>
+        <w:rPr>
+          <w:b/>
+        </w:rPr>
+        <w:t>步骤 3 低速示教机械臂点位。</w:t>
+      </w:r>
+      <w:r>
+        <w:t>机械臂先记录 HOME，再逐一记录 PICK1–PICK6 和各类别 PLACE 点。每个 PICK 点分别检查目标上方接近、竖直下降、夹爪两指位置和抬升间隙；每个 PLACE 点检查分类区中心、释放高度和回撤方向。</w:t>
+      </w:r>
+    </w:p>
+    <w:p>
+      <w:pPr>
+        <w:spacing w:line="276" w:lineRule="auto" w:after="100"/>
+      </w:pPr>
+      <w:r>
+        <w:rPr>
+          <w:b/>
+        </w:rPr>
+        <w:t>步骤 4 记录安全参数。</w:t>
+      </w:r>
+      <w:r>
+        <w:t>把接近高度、夹爪开度、释放等待时间、安全速度和急停距离与点位一同记录。单点动作确认无碰撞后才进入多目标测试，避免直接以完整序列调试未知点位。</w:t>
       </w:r>
     </w:p>
     <w:p>
@@ -5229,7 +5761,49 @@
           <w:rFonts w:ascii="Times New Roman" w:hAnsi="Times New Roman" w:eastAsia="SimSun"/>
           <w:sz w:val="20"/>
         </w:rPr>
-        <w:t>真机验收中，检测节点已将类别、检测框和置信度发布为 Detection2DArray，实体物体类别与分类区配置已对应训练权重的类别表，摄像头像素到取物网格的映射也已完成标定。接口联调后，系统先通过单目标检查，再完成两类六目标验收。</w:t>
+        <w:t>真机接口沿用仿真的 Detection2DArray 字段，使任务节点不依赖检测结果来自 Gazebo 还是外接摄像头。</w:t>
+      </w:r>
+    </w:p>
+    <w:p>
+      <w:pPr>
+        <w:spacing w:line="276" w:lineRule="auto" w:after="100"/>
+      </w:pPr>
+      <w:r>
+        <w:rPr>
+          <w:b/>
+        </w:rPr>
+        <w:t>步骤 1 发布检测结果。</w:t>
+      </w:r>
+      <w:r>
+        <w:t>检测节点对每帧图像输出 eraser、lock 或 stapler、检测框中心和置信度，并封装为 Detection2DArray。任务节点只读取消息字段，不直接读取摄像头窗口，因此识别和任务逻辑保持分离。</w:t>
+      </w:r>
+    </w:p>
+    <w:p>
+      <w:pPr>
+        <w:spacing w:line="276" w:lineRule="auto" w:after="100"/>
+      </w:pPr>
+      <w:r>
+        <w:rPr>
+          <w:b/>
+        </w:rPr>
+        <w:t>步骤 2 映射类别与网格。</w:t>
+      </w:r>
+      <w:r>
+        <w:t>类别表与实体分类区逐项核对，检测框中心经单应矩阵换算到桌面位置，再分配到 PICK1–PICK6。类别、grid_id 和目标分类区同时写入任务记录，避免只根据画面颜色人工选择点位。</w:t>
+      </w:r>
+    </w:p>
+    <w:p>
+      <w:pPr>
+        <w:spacing w:line="276" w:lineRule="auto" w:after="100"/>
+      </w:pPr>
+      <w:r>
+        <w:rPr>
+          <w:b/>
+        </w:rPr>
+        <w:t>步骤 3 下发动作并读取反馈。</w:t>
+      </w:r>
+      <w:r>
+        <w:t>任务节点锁定当前目标后调用对应 PICK 和 PLACE，执行节点按接近、下降、夹持、抬升、搬运、释放和回撤顺序运行。每个阶段返回状态；出现识别或执行偏差时，系统进入纠错流程，重新确认目标后继续任务。</w:t>
       </w:r>
     </w:p>
     <w:p>
@@ -5251,7 +5825,77 @@
           <w:color w:val="232323"/>
           <w:sz w:val="20"/>
         </w:rPr>
-        <w:t>验收先使用单个目标检查识别、PICK、抬升和 PLACE，再加入第二类物体，最后完成两类共六个目标的连续测试。每个对象均记录 run_id、object_id、真实类别、预测类别、置信度、grid_id、目标分类垫、抓取结果、放置结果、异常码和时间戳；空网格、未识别、抓取失败和不可达目标也分别完成异常测试。</w:t>
+        <w:t>真机验收按照目标数量和任务复杂度逐级增加，前一级通过后才进入下一级。</w:t>
+      </w:r>
+    </w:p>
+    <w:p>
+      <w:pPr>
+        <w:spacing w:line="276" w:lineRule="auto" w:after="100"/>
+      </w:pPr>
+      <w:r>
+        <w:rPr>
+          <w:b/>
+        </w:rPr>
+        <w:t>步骤 1 单目标检查。</w:t>
+      </w:r>
+      <w:r>
+        <w:t>在一个网格放置小锁，先核对识别框和类别，再以低速执行 PICK。机械臂从目标上方竖直下降，夹爪两指位于锁的两侧后闭合并抬升；视频 01:22 处可见小锁离开桌面。随后执行对应 PLACE 和回撤。</w:t>
+      </w:r>
+    </w:p>
+    <w:p>
+      <w:pPr>
+        <w:spacing w:line="276" w:lineRule="auto" w:after="100"/>
+      </w:pPr>
+      <w:r>
+        <w:rPr>
+          <w:b/>
+        </w:rPr>
+        <w:t>步骤 2 加入第二类目标。</w:t>
+      </w:r>
+      <w:r>
+        <w:t>在保留已验证点位的条件下加入第二类物体，检查类别到分类区的映射是否正确，并观察任务切换时是否仍使用前一对象的 grid_id 或 PLACE 点。</w:t>
+      </w:r>
+    </w:p>
+    <w:p>
+      <w:pPr>
+        <w:spacing w:line="276" w:lineRule="auto" w:after="100"/>
+      </w:pPr>
+      <w:r>
+        <w:rPr>
+          <w:b/>
+        </w:rPr>
+        <w:t>步骤 3 执行两类六目标任务。</w:t>
+      </w:r>
+      <w:r>
+        <w:t>将六个对象放入桌面网格，启动识别、任务和执行流程。系统逐个锁定目标、分配取物格和分类区；识别与纠错视频记录六个对象的识别结果，以及偏差出现后重新确认目标并继续执行的过程。</w:t>
+      </w:r>
+    </w:p>
+    <w:p>
+      <w:pPr>
+        <w:spacing w:line="276" w:lineRule="auto" w:after="100"/>
+      </w:pPr>
+      <w:r>
+        <w:rPr>
+          <w:b/>
+        </w:rPr>
+        <w:t>步骤 4 记录对象级结果。</w:t>
+      </w:r>
+      <w:r>
+        <w:t>每个对象保存 run_id、object_id、真实类别、预测类别、置信度、grid_id、目标分类区、抓取结果、放置结果、异常码和时间戳。验收表中的通过结论同时对应视频画面和对象记录。</w:t>
+      </w:r>
+    </w:p>
+    <w:p>
+      <w:pPr>
+        <w:spacing w:line="276" w:lineRule="auto" w:after="100"/>
+      </w:pPr>
+      <w:r>
+        <w:rPr>
+          <w:b/>
+        </w:rPr>
+        <w:t>步骤 5 检查异常分支。</w:t>
+      </w:r>
+      <w:r>
+        <w:t>分别检查空网格、未识别、抓取失败和不可达目标。异常目标不进入正常抓取队列，系统记录异常码并执行安全返回或继续处理其他目标；识别或执行偏差的纠错过程保留在实机视频中。</w:t>
       </w:r>
     </w:p>
     <w:p>
@@ -10429,7 +11073,7 @@
       <w:r>
         <w:drawing>
           <wp:inline xmlns:a="http://schemas.openxmlformats.org/drawingml/2006/main" xmlns:pic="http://schemas.openxmlformats.org/drawingml/2006/picture">
-            <wp:extent cx="3383280" cy="1800036"/>
+            <wp:extent cx="4114800" cy="2189232"/>
             <wp:docPr id="12" name="Picture 12"/>
             <wp:cNvGraphicFramePr>
               <a:graphicFrameLocks noChangeAspect="1"/>
@@ -10450,7 +11094,7 @@
                   <pic:spPr>
                     <a:xfrm>
                       <a:off x="0" y="0"/>
-                      <a:ext cx="3383280" cy="1800036"/>
+                      <a:ext cx="4114800" cy="2189232"/>
                     </a:xfrm>
                     <a:prstGeom prst="rect"/>
                   </pic:spPr>

</xml_diff>